<commit_message>
Add spiral order matrix script
Add Python implementation for spiral traversal at ARRAY/TopArrayQuestion/Spiral order Matrix.py. The Spiral(num) function prints matrix elements in spiral order and includes a 3x3 example invocation. Also update binary hint document ARRAY/Hint For doing array question deep question.docx. Co-authored-by: Copilot <223556219+Copilot@users.noreply.github.com>
</commit_message>
<xml_diff>
--- a/ARRAY/Hint For doing array question deep question.docx
+++ b/ARRAY/Hint For doing array question deep question.docx
@@ -6,25 +6,26 @@
       <w:pPr>
         <w:pStyle w:val="Heading1"/>
       </w:pPr>
-      <w:proofErr w:type="gramStart"/>
-      <w:r>
-        <w:t>Question :</w:t>
-      </w:r>
-      <w:proofErr w:type="gramEnd"/>
-      <w:r>
-        <w:t xml:space="preserve"> 1 </w:t>
+      <w:r>
+        <w:t xml:space="preserve">Question: </w:t>
+      </w:r>
+      <w:r>
+        <w:t>1-rotation</w:t>
       </w:r>
       <w:r>
         <w:rPr>
           <w:rStyle w:val="Strong"/>
         </w:rPr>
-        <w:t>rotation method</w:t>
-      </w:r>
-      <w:r>
-        <w:t xml:space="preserve"> —</w:t>
-      </w:r>
-      <w:r>
-        <w:t xml:space="preserve"> of n array</w:t>
+        <w:t xml:space="preserve"> method</w:t>
+      </w:r>
+      <w:r>
+        <w:t xml:space="preserve"> — of </w:t>
+      </w:r>
+      <w:r>
+        <w:t>an</w:t>
+      </w:r>
+      <w:r>
+        <w:t xml:space="preserve"> array</w:t>
       </w:r>
     </w:p>
     <w:p>
@@ -47,9 +48,8 @@
           <w:sz w:val="27"/>
           <w:szCs w:val="27"/>
         </w:rPr>
-        <w:t xml:space="preserve">What this technique </w:t>
-      </w:r>
-      <w:proofErr w:type="gramStart"/>
+        <w:t xml:space="preserve">What </w:t>
+      </w:r>
       <w:r>
         <w:rPr>
           <w:rFonts w:ascii="Times New Roman" w:eastAsia="Times New Roman" w:hAnsi="Times New Roman" w:cs="Times New Roman"/>
@@ -58,7 +58,28 @@
           <w:sz w:val="27"/>
           <w:szCs w:val="27"/>
         </w:rPr>
-        <w:t>is called</w:t>
+        <w:t>is this technique</w:t>
+      </w:r>
+      <w:r>
+        <w:rPr>
+          <w:rFonts w:ascii="Times New Roman" w:eastAsia="Times New Roman" w:hAnsi="Times New Roman" w:cs="Times New Roman"/>
+          <w:b/>
+          <w:bCs/>
+          <w:sz w:val="27"/>
+          <w:szCs w:val="27"/>
+        </w:rPr>
+        <w:t xml:space="preserve"> </w:t>
+      </w:r>
+      <w:proofErr w:type="gramStart"/>
+      <w:r>
+        <w:rPr>
+          <w:rFonts w:ascii="Times New Roman" w:eastAsia="Times New Roman" w:hAnsi="Times New Roman" w:cs="Times New Roman"/>
+          <w:b/>
+          <w:bCs/>
+          <w:sz w:val="27"/>
+          <w:szCs w:val="27"/>
+        </w:rPr>
+        <w:t>called</w:t>
       </w:r>
       <w:proofErr w:type="gramEnd"/>
     </w:p>
@@ -683,7 +704,23 @@
           <w:sz w:val="24"/>
           <w:szCs w:val="24"/>
         </w:rPr>
-        <w:t xml:space="preserve"> "which element from the </w:t>
+        <w:t xml:space="preserve"> "</w:t>
+      </w:r>
+      <w:r>
+        <w:rPr>
+          <w:rFonts w:ascii="Times New Roman" w:eastAsia="Times New Roman" w:hAnsi="Times New Roman" w:cs="Times New Roman"/>
+          <w:sz w:val="24"/>
+          <w:szCs w:val="24"/>
+        </w:rPr>
+        <w:t>Which</w:t>
+      </w:r>
+      <w:r>
+        <w:rPr>
+          <w:rFonts w:ascii="Times New Roman" w:eastAsia="Times New Roman" w:hAnsi="Times New Roman" w:cs="Times New Roman"/>
+          <w:sz w:val="24"/>
+          <w:szCs w:val="24"/>
+        </w:rPr>
+        <w:t xml:space="preserve"> element from the </w:t>
       </w:r>
       <w:r>
         <w:rPr>
@@ -2166,33 +2203,39 @@
           <w:szCs w:val="24"/>
         </w:rPr>
       </w:pPr>
-      <w:proofErr w:type="spellStart"/>
-      <w:proofErr w:type="gramStart"/>
-      <w:r>
-        <w:rPr>
-          <w:rFonts w:ascii="Courier New" w:eastAsia="Times New Roman" w:hAnsi="Courier New" w:cs="Courier New"/>
-          <w:sz w:val="20"/>
-          <w:szCs w:val="20"/>
-        </w:rPr>
-        <w:t>ret.append</w:t>
-      </w:r>
-      <w:proofErr w:type="spellEnd"/>
-      <w:r>
-        <w:rPr>
-          <w:rFonts w:ascii="Courier New" w:eastAsia="Times New Roman" w:hAnsi="Courier New" w:cs="Courier New"/>
-          <w:sz w:val="20"/>
-          <w:szCs w:val="20"/>
-        </w:rPr>
-        <w:t>(</w:t>
-      </w:r>
-      <w:proofErr w:type="gramEnd"/>
-      <w:r>
-        <w:rPr>
-          <w:rFonts w:ascii="Courier New" w:eastAsia="Times New Roman" w:hAnsi="Courier New" w:cs="Courier New"/>
-          <w:sz w:val="20"/>
-          <w:szCs w:val="20"/>
-        </w:rPr>
-        <w:t>a[(</w:t>
+      <w:proofErr w:type="gramStart"/>
+      <w:r>
+        <w:rPr>
+          <w:rFonts w:ascii="Courier New" w:eastAsia="Times New Roman" w:hAnsi="Courier New" w:cs="Courier New"/>
+          <w:sz w:val="20"/>
+          <w:szCs w:val="20"/>
+        </w:rPr>
+        <w:t>ret</w:t>
+      </w:r>
+      <w:proofErr w:type="gramEnd"/>
+      <w:r>
+        <w:rPr>
+          <w:rFonts w:ascii="Courier New" w:eastAsia="Times New Roman" w:hAnsi="Courier New" w:cs="Courier New"/>
+          <w:sz w:val="20"/>
+          <w:szCs w:val="20"/>
+        </w:rPr>
+        <w:t>.</w:t>
+      </w:r>
+      <w:r>
+        <w:rPr>
+          <w:rFonts w:ascii="Courier New" w:eastAsia="Times New Roman" w:hAnsi="Courier New" w:cs="Courier New"/>
+          <w:sz w:val="20"/>
+          <w:szCs w:val="20"/>
+        </w:rPr>
+        <w:t xml:space="preserve"> </w:t>
+      </w:r>
+      <w:r>
+        <w:rPr>
+          <w:rFonts w:ascii="Courier New" w:eastAsia="Times New Roman" w:hAnsi="Courier New" w:cs="Courier New"/>
+          <w:sz w:val="20"/>
+          <w:szCs w:val="20"/>
+        </w:rPr>
+        <w:t>append(a[(</w:t>
       </w:r>
       <w:proofErr w:type="spellStart"/>
       <w:r>
@@ -3011,7 +3054,13 @@
         <w:t>%</w:t>
       </w:r>
       <w:r>
-        <w:t xml:space="preserve"> still cleans things up per-iteration.</w:t>
+        <w:t xml:space="preserve"> still cleans things up </w:t>
+      </w:r>
+      <w:r>
+        <w:t>per iteration</w:t>
+      </w:r>
+      <w:r>
+        <w:t>.</w:t>
       </w:r>
     </w:p>
     <w:p>
@@ -3864,10 +3913,4201 @@
         <w:lastRenderedPageBreak/>
         <w:t xml:space="preserve">Question 2 </w:t>
       </w:r>
+    </w:p>
+    <w:p>
+      <w:r>
+        <w:t xml:space="preserve">The </w:t>
+      </w:r>
+      <w:r>
+        <w:rPr>
+          <w:rStyle w:val="Strong"/>
+        </w:rPr>
+        <w:t>Spiral Order Matrix I</w:t>
+      </w:r>
+      <w:r>
+        <w:t xml:space="preserve"> problem asks you to read all elements of a matrix in a </w:t>
+      </w:r>
+      <w:r>
+        <w:rPr>
+          <w:rStyle w:val="Strong"/>
+        </w:rPr>
+        <w:t>spiral pattern</w:t>
+      </w:r>
+      <w:r>
+        <w:t>, starting from the top-left corner.</w:t>
+      </w:r>
+    </w:p>
+    <w:p>
+      <w:r>
+        <w:t xml:space="preserve">We search for the element like spiral or like onions, </w:t>
+      </w:r>
+      <w:proofErr w:type="gramStart"/>
+      <w:r>
+        <w:t>un</w:t>
+      </w:r>
+      <w:proofErr w:type="gramEnd"/>
+      <w:r>
+        <w:t xml:space="preserve"> tell there are no elements left. These are the constraints </w:t>
+      </w:r>
+    </w:p>
+    <w:p>
+      <w:pPr>
+        <w:spacing w:before="100" w:beforeAutospacing="1" w:after="100" w:afterAutospacing="1" w:line="240" w:lineRule="auto"/>
+        <w:rPr>
+          <w:rFonts w:ascii="Times New Roman" w:eastAsia="Times New Roman" w:hAnsi="Times New Roman" w:cs="Times New Roman"/>
+          <w:sz w:val="24"/>
+          <w:szCs w:val="24"/>
+        </w:rPr>
+      </w:pPr>
+      <w:r>
+        <w:rPr>
+          <w:rFonts w:ascii="Times New Roman" w:eastAsia="Times New Roman" w:hAnsi="Times New Roman" w:cs="Times New Roman"/>
+          <w:sz w:val="24"/>
+          <w:szCs w:val="24"/>
+        </w:rPr>
+        <w:t>For example, suppose the matrix is:</w:t>
+      </w:r>
+    </w:p>
+    <w:p>
+      <w:pPr>
+        <w:tabs>
+          <w:tab w:val="left" w:pos="916"/>
+          <w:tab w:val="left" w:pos="1832"/>
+          <w:tab w:val="left" w:pos="2748"/>
+          <w:tab w:val="left" w:pos="3664"/>
+          <w:tab w:val="left" w:pos="4580"/>
+          <w:tab w:val="left" w:pos="5496"/>
+          <w:tab w:val="left" w:pos="6412"/>
+          <w:tab w:val="left" w:pos="7328"/>
+          <w:tab w:val="left" w:pos="8244"/>
+          <w:tab w:val="left" w:pos="9160"/>
+          <w:tab w:val="left" w:pos="10076"/>
+          <w:tab w:val="left" w:pos="10992"/>
+          <w:tab w:val="left" w:pos="11908"/>
+          <w:tab w:val="left" w:pos="12824"/>
+          <w:tab w:val="left" w:pos="13740"/>
+          <w:tab w:val="left" w:pos="14656"/>
+        </w:tabs>
+        <w:spacing w:after="0" w:line="240" w:lineRule="auto"/>
+        <w:rPr>
+          <w:rFonts w:ascii="Courier New" w:eastAsia="Times New Roman" w:hAnsi="Courier New" w:cs="Courier New"/>
+          <w:sz w:val="20"/>
+          <w:szCs w:val="20"/>
+        </w:rPr>
+      </w:pPr>
+      <w:proofErr w:type="gramStart"/>
+      <w:r>
+        <w:rPr>
+          <w:rFonts w:ascii="Courier New" w:eastAsia="Times New Roman" w:hAnsi="Courier New" w:cs="Courier New"/>
+          <w:sz w:val="20"/>
+          <w:szCs w:val="20"/>
+        </w:rPr>
+        <w:t>1  2</w:t>
+      </w:r>
+      <w:proofErr w:type="gramEnd"/>
+      <w:r>
+        <w:rPr>
+          <w:rFonts w:ascii="Courier New" w:eastAsia="Times New Roman" w:hAnsi="Courier New" w:cs="Courier New"/>
+          <w:sz w:val="20"/>
+          <w:szCs w:val="20"/>
+        </w:rPr>
+        <w:t xml:space="preserve">  3</w:t>
+      </w:r>
+    </w:p>
+    <w:p>
+      <w:pPr>
+        <w:tabs>
+          <w:tab w:val="left" w:pos="916"/>
+          <w:tab w:val="left" w:pos="1832"/>
+          <w:tab w:val="left" w:pos="2748"/>
+          <w:tab w:val="left" w:pos="3664"/>
+          <w:tab w:val="left" w:pos="4580"/>
+          <w:tab w:val="left" w:pos="5496"/>
+          <w:tab w:val="left" w:pos="6412"/>
+          <w:tab w:val="left" w:pos="7328"/>
+          <w:tab w:val="left" w:pos="8244"/>
+          <w:tab w:val="left" w:pos="9160"/>
+          <w:tab w:val="left" w:pos="10076"/>
+          <w:tab w:val="left" w:pos="10992"/>
+          <w:tab w:val="left" w:pos="11908"/>
+          <w:tab w:val="left" w:pos="12824"/>
+          <w:tab w:val="left" w:pos="13740"/>
+          <w:tab w:val="left" w:pos="14656"/>
+        </w:tabs>
+        <w:spacing w:after="0" w:line="240" w:lineRule="auto"/>
+        <w:rPr>
+          <w:rFonts w:ascii="Courier New" w:eastAsia="Times New Roman" w:hAnsi="Courier New" w:cs="Courier New"/>
+          <w:sz w:val="20"/>
+          <w:szCs w:val="20"/>
+        </w:rPr>
+      </w:pPr>
+      <w:proofErr w:type="gramStart"/>
+      <w:r>
+        <w:rPr>
+          <w:rFonts w:ascii="Courier New" w:eastAsia="Times New Roman" w:hAnsi="Courier New" w:cs="Courier New"/>
+          <w:sz w:val="20"/>
+          <w:szCs w:val="20"/>
+        </w:rPr>
+        <w:t>4  5</w:t>
+      </w:r>
+      <w:proofErr w:type="gramEnd"/>
+      <w:r>
+        <w:rPr>
+          <w:rFonts w:ascii="Courier New" w:eastAsia="Times New Roman" w:hAnsi="Courier New" w:cs="Courier New"/>
+          <w:sz w:val="20"/>
+          <w:szCs w:val="20"/>
+        </w:rPr>
+        <w:t xml:space="preserve">  6</w:t>
+      </w:r>
+    </w:p>
+    <w:p>
+      <w:pPr>
+        <w:tabs>
+          <w:tab w:val="left" w:pos="916"/>
+          <w:tab w:val="left" w:pos="1832"/>
+          <w:tab w:val="left" w:pos="2748"/>
+          <w:tab w:val="left" w:pos="3664"/>
+          <w:tab w:val="left" w:pos="4580"/>
+          <w:tab w:val="left" w:pos="5496"/>
+          <w:tab w:val="left" w:pos="6412"/>
+          <w:tab w:val="left" w:pos="7328"/>
+          <w:tab w:val="left" w:pos="8244"/>
+          <w:tab w:val="left" w:pos="9160"/>
+          <w:tab w:val="left" w:pos="10076"/>
+          <w:tab w:val="left" w:pos="10992"/>
+          <w:tab w:val="left" w:pos="11908"/>
+          <w:tab w:val="left" w:pos="12824"/>
+          <w:tab w:val="left" w:pos="13740"/>
+          <w:tab w:val="left" w:pos="14656"/>
+        </w:tabs>
+        <w:spacing w:after="0" w:line="240" w:lineRule="auto"/>
+        <w:rPr>
+          <w:rFonts w:ascii="Courier New" w:eastAsia="Times New Roman" w:hAnsi="Courier New" w:cs="Courier New"/>
+          <w:sz w:val="20"/>
+          <w:szCs w:val="20"/>
+        </w:rPr>
+      </w:pPr>
+      <w:proofErr w:type="gramStart"/>
+      <w:r>
+        <w:rPr>
+          <w:rFonts w:ascii="Courier New" w:eastAsia="Times New Roman" w:hAnsi="Courier New" w:cs="Courier New"/>
+          <w:sz w:val="20"/>
+          <w:szCs w:val="20"/>
+        </w:rPr>
+        <w:t>7  8</w:t>
+      </w:r>
+      <w:proofErr w:type="gramEnd"/>
+      <w:r>
+        <w:rPr>
+          <w:rFonts w:ascii="Courier New" w:eastAsia="Times New Roman" w:hAnsi="Courier New" w:cs="Courier New"/>
+          <w:sz w:val="20"/>
+          <w:szCs w:val="20"/>
+        </w:rPr>
+        <w:t xml:space="preserve">  9</w:t>
+      </w:r>
+    </w:p>
+    <w:p>
+      <w:pPr>
+        <w:spacing w:before="100" w:beforeAutospacing="1" w:after="100" w:afterAutospacing="1" w:line="240" w:lineRule="auto"/>
+        <w:rPr>
+          <w:rFonts w:ascii="Times New Roman" w:eastAsia="Times New Roman" w:hAnsi="Times New Roman" w:cs="Times New Roman"/>
+          <w:sz w:val="24"/>
+          <w:szCs w:val="24"/>
+        </w:rPr>
+      </w:pPr>
+      <w:r>
+        <w:rPr>
+          <w:rFonts w:ascii="Times New Roman" w:eastAsia="Times New Roman" w:hAnsi="Times New Roman" w:cs="Times New Roman"/>
+          <w:sz w:val="24"/>
+          <w:szCs w:val="24"/>
+        </w:rPr>
+        <w:t xml:space="preserve">You start at </w:t>
+      </w:r>
+      <w:proofErr w:type="gramStart"/>
+      <w:r>
+        <w:rPr>
+          <w:rFonts w:ascii="Courier New" w:eastAsia="Times New Roman" w:hAnsi="Courier New" w:cs="Courier New"/>
+          <w:sz w:val="20"/>
+          <w:szCs w:val="20"/>
+        </w:rPr>
+        <w:t>1</w:t>
+      </w:r>
+      <w:proofErr w:type="gramEnd"/>
+      <w:r>
+        <w:rPr>
+          <w:rFonts w:ascii="Times New Roman" w:eastAsia="Times New Roman" w:hAnsi="Times New Roman" w:cs="Times New Roman"/>
+          <w:sz w:val="24"/>
+          <w:szCs w:val="24"/>
+        </w:rPr>
+        <w:t xml:space="preserve"> and move </w:t>
+      </w:r>
+      <w:r>
+        <w:rPr>
+          <w:rFonts w:ascii="Times New Roman" w:eastAsia="Times New Roman" w:hAnsi="Times New Roman" w:cs="Times New Roman"/>
+          <w:b/>
+          <w:bCs/>
+          <w:sz w:val="24"/>
+          <w:szCs w:val="24"/>
+        </w:rPr>
+        <w:t>right</w:t>
+      </w:r>
+      <w:r>
+        <w:rPr>
+          <w:rFonts w:ascii="Times New Roman" w:eastAsia="Times New Roman" w:hAnsi="Times New Roman" w:cs="Times New Roman"/>
+          <w:sz w:val="24"/>
+          <w:szCs w:val="24"/>
+        </w:rPr>
+        <w:t xml:space="preserve"> across the top row:</w:t>
+      </w:r>
+    </w:p>
+    <w:p>
+      <w:pPr>
+        <w:tabs>
+          <w:tab w:val="left" w:pos="916"/>
+          <w:tab w:val="left" w:pos="1832"/>
+          <w:tab w:val="left" w:pos="2748"/>
+          <w:tab w:val="left" w:pos="3664"/>
+          <w:tab w:val="left" w:pos="4580"/>
+          <w:tab w:val="left" w:pos="5496"/>
+          <w:tab w:val="left" w:pos="6412"/>
+          <w:tab w:val="left" w:pos="7328"/>
+          <w:tab w:val="left" w:pos="8244"/>
+          <w:tab w:val="left" w:pos="9160"/>
+          <w:tab w:val="left" w:pos="10076"/>
+          <w:tab w:val="left" w:pos="10992"/>
+          <w:tab w:val="left" w:pos="11908"/>
+          <w:tab w:val="left" w:pos="12824"/>
+          <w:tab w:val="left" w:pos="13740"/>
+          <w:tab w:val="left" w:pos="14656"/>
+        </w:tabs>
+        <w:spacing w:after="0" w:line="240" w:lineRule="auto"/>
+        <w:rPr>
+          <w:rFonts w:ascii="Courier New" w:eastAsia="Times New Roman" w:hAnsi="Courier New" w:cs="Courier New"/>
+          <w:sz w:val="20"/>
+          <w:szCs w:val="20"/>
+        </w:rPr>
+      </w:pPr>
+      <w:proofErr w:type="gramStart"/>
+      <w:r>
+        <w:rPr>
+          <w:rFonts w:ascii="Courier New" w:eastAsia="Times New Roman" w:hAnsi="Courier New" w:cs="Courier New"/>
+          <w:sz w:val="20"/>
+          <w:szCs w:val="20"/>
+        </w:rPr>
+        <w:t>1</w:t>
+      </w:r>
+      <w:proofErr w:type="gramEnd"/>
+      <w:r>
+        <w:rPr>
+          <w:rFonts w:ascii="Courier New" w:eastAsia="Times New Roman" w:hAnsi="Courier New" w:cs="Courier New"/>
+          <w:sz w:val="20"/>
+          <w:szCs w:val="20"/>
+        </w:rPr>
+        <w:t xml:space="preserve"> → 2 → 3</w:t>
+      </w:r>
+    </w:p>
+    <w:p>
+      <w:pPr>
+        <w:spacing w:before="100" w:beforeAutospacing="1" w:after="100" w:afterAutospacing="1" w:line="240" w:lineRule="auto"/>
+        <w:rPr>
+          <w:rFonts w:ascii="Times New Roman" w:eastAsia="Times New Roman" w:hAnsi="Times New Roman" w:cs="Times New Roman"/>
+          <w:sz w:val="24"/>
+          <w:szCs w:val="24"/>
+        </w:rPr>
+      </w:pPr>
+      <w:r>
+        <w:rPr>
+          <w:rFonts w:ascii="Times New Roman" w:eastAsia="Times New Roman" w:hAnsi="Times New Roman" w:cs="Times New Roman"/>
+          <w:sz w:val="24"/>
+          <w:szCs w:val="24"/>
+        </w:rPr>
+        <w:t xml:space="preserve">Then move </w:t>
+      </w:r>
+      <w:r>
+        <w:rPr>
+          <w:rFonts w:ascii="Times New Roman" w:eastAsia="Times New Roman" w:hAnsi="Times New Roman" w:cs="Times New Roman"/>
+          <w:b/>
+          <w:bCs/>
+          <w:sz w:val="24"/>
+          <w:szCs w:val="24"/>
+        </w:rPr>
+        <w:t>down</w:t>
+      </w:r>
+      <w:r>
+        <w:rPr>
+          <w:rFonts w:ascii="Times New Roman" w:eastAsia="Times New Roman" w:hAnsi="Times New Roman" w:cs="Times New Roman"/>
+          <w:sz w:val="24"/>
+          <w:szCs w:val="24"/>
+        </w:rPr>
+        <w:t xml:space="preserve"> the right side:</w:t>
+      </w:r>
+    </w:p>
+    <w:p>
+      <w:pPr>
+        <w:tabs>
+          <w:tab w:val="left" w:pos="916"/>
+          <w:tab w:val="left" w:pos="1832"/>
+          <w:tab w:val="left" w:pos="2748"/>
+          <w:tab w:val="left" w:pos="3664"/>
+          <w:tab w:val="left" w:pos="4580"/>
+          <w:tab w:val="left" w:pos="5496"/>
+          <w:tab w:val="left" w:pos="6412"/>
+          <w:tab w:val="left" w:pos="7328"/>
+          <w:tab w:val="left" w:pos="8244"/>
+          <w:tab w:val="left" w:pos="9160"/>
+          <w:tab w:val="left" w:pos="10076"/>
+          <w:tab w:val="left" w:pos="10992"/>
+          <w:tab w:val="left" w:pos="11908"/>
+          <w:tab w:val="left" w:pos="12824"/>
+          <w:tab w:val="left" w:pos="13740"/>
+          <w:tab w:val="left" w:pos="14656"/>
+        </w:tabs>
+        <w:spacing w:after="0" w:line="240" w:lineRule="auto"/>
+        <w:rPr>
+          <w:rFonts w:ascii="Courier New" w:eastAsia="Times New Roman" w:hAnsi="Courier New" w:cs="Courier New"/>
+          <w:sz w:val="20"/>
+          <w:szCs w:val="20"/>
+        </w:rPr>
+      </w:pPr>
+      <w:proofErr w:type="gramStart"/>
+      <w:r>
+        <w:rPr>
+          <w:rFonts w:ascii="Courier New" w:eastAsia="Times New Roman" w:hAnsi="Courier New" w:cs="Courier New"/>
+          <w:sz w:val="20"/>
+          <w:szCs w:val="20"/>
+        </w:rPr>
+        <w:t>6</w:t>
+      </w:r>
+      <w:proofErr w:type="gramEnd"/>
+      <w:r>
+        <w:rPr>
+          <w:rFonts w:ascii="Courier New" w:eastAsia="Times New Roman" w:hAnsi="Courier New" w:cs="Courier New"/>
+          <w:sz w:val="20"/>
+          <w:szCs w:val="20"/>
+        </w:rPr>
+        <w:t xml:space="preserve"> → 9</w:t>
+      </w:r>
+    </w:p>
+    <w:p>
+      <w:pPr>
+        <w:spacing w:before="100" w:beforeAutospacing="1" w:after="100" w:afterAutospacing="1" w:line="240" w:lineRule="auto"/>
+        <w:rPr>
+          <w:rFonts w:ascii="Times New Roman" w:eastAsia="Times New Roman" w:hAnsi="Times New Roman" w:cs="Times New Roman"/>
+          <w:sz w:val="24"/>
+          <w:szCs w:val="24"/>
+        </w:rPr>
+      </w:pPr>
+      <w:r>
+        <w:rPr>
+          <w:rFonts w:ascii="Times New Roman" w:eastAsia="Times New Roman" w:hAnsi="Times New Roman" w:cs="Times New Roman"/>
+          <w:sz w:val="24"/>
+          <w:szCs w:val="24"/>
+        </w:rPr>
+        <w:t xml:space="preserve">Then move </w:t>
+      </w:r>
+      <w:r>
+        <w:rPr>
+          <w:rFonts w:ascii="Times New Roman" w:eastAsia="Times New Roman" w:hAnsi="Times New Roman" w:cs="Times New Roman"/>
+          <w:b/>
+          <w:bCs/>
+          <w:sz w:val="24"/>
+          <w:szCs w:val="24"/>
+        </w:rPr>
+        <w:t>left</w:t>
+      </w:r>
+      <w:r>
+        <w:rPr>
+          <w:rFonts w:ascii="Times New Roman" w:eastAsia="Times New Roman" w:hAnsi="Times New Roman" w:cs="Times New Roman"/>
+          <w:sz w:val="24"/>
+          <w:szCs w:val="24"/>
+        </w:rPr>
+        <w:t xml:space="preserve"> across the bottom:</w:t>
+      </w:r>
+    </w:p>
+    <w:p>
+      <w:pPr>
+        <w:tabs>
+          <w:tab w:val="left" w:pos="916"/>
+          <w:tab w:val="left" w:pos="1832"/>
+          <w:tab w:val="left" w:pos="2748"/>
+          <w:tab w:val="left" w:pos="3664"/>
+          <w:tab w:val="left" w:pos="4580"/>
+          <w:tab w:val="left" w:pos="5496"/>
+          <w:tab w:val="left" w:pos="6412"/>
+          <w:tab w:val="left" w:pos="7328"/>
+          <w:tab w:val="left" w:pos="8244"/>
+          <w:tab w:val="left" w:pos="9160"/>
+          <w:tab w:val="left" w:pos="10076"/>
+          <w:tab w:val="left" w:pos="10992"/>
+          <w:tab w:val="left" w:pos="11908"/>
+          <w:tab w:val="left" w:pos="12824"/>
+          <w:tab w:val="left" w:pos="13740"/>
+          <w:tab w:val="left" w:pos="14656"/>
+        </w:tabs>
+        <w:spacing w:after="0" w:line="240" w:lineRule="auto"/>
+        <w:rPr>
+          <w:rFonts w:ascii="Courier New" w:eastAsia="Times New Roman" w:hAnsi="Courier New" w:cs="Courier New"/>
+          <w:sz w:val="20"/>
+          <w:szCs w:val="20"/>
+        </w:rPr>
+      </w:pPr>
+      <w:proofErr w:type="gramStart"/>
+      <w:r>
+        <w:rPr>
+          <w:rFonts w:ascii="Courier New" w:eastAsia="Times New Roman" w:hAnsi="Courier New" w:cs="Courier New"/>
+          <w:sz w:val="20"/>
+          <w:szCs w:val="20"/>
+        </w:rPr>
+        <w:t>8</w:t>
+      </w:r>
+      <w:proofErr w:type="gramEnd"/>
+      <w:r>
+        <w:rPr>
+          <w:rFonts w:ascii="Courier New" w:eastAsia="Times New Roman" w:hAnsi="Courier New" w:cs="Courier New"/>
+          <w:sz w:val="20"/>
+          <w:szCs w:val="20"/>
+        </w:rPr>
+        <w:t xml:space="preserve"> → 7</w:t>
+      </w:r>
+    </w:p>
+    <w:p>
+      <w:pPr>
+        <w:spacing w:before="100" w:beforeAutospacing="1" w:after="100" w:afterAutospacing="1" w:line="240" w:lineRule="auto"/>
+        <w:rPr>
+          <w:rFonts w:ascii="Times New Roman" w:eastAsia="Times New Roman" w:hAnsi="Times New Roman" w:cs="Times New Roman"/>
+          <w:sz w:val="24"/>
+          <w:szCs w:val="24"/>
+        </w:rPr>
+      </w:pPr>
+      <w:r>
+        <w:rPr>
+          <w:rFonts w:ascii="Times New Roman" w:eastAsia="Times New Roman" w:hAnsi="Times New Roman" w:cs="Times New Roman"/>
+          <w:sz w:val="24"/>
+          <w:szCs w:val="24"/>
+        </w:rPr>
+        <w:t xml:space="preserve">Then move </w:t>
+      </w:r>
+      <w:r>
+        <w:rPr>
+          <w:rFonts w:ascii="Times New Roman" w:eastAsia="Times New Roman" w:hAnsi="Times New Roman" w:cs="Times New Roman"/>
+          <w:b/>
+          <w:bCs/>
+          <w:sz w:val="24"/>
+          <w:szCs w:val="24"/>
+        </w:rPr>
+        <w:t>up</w:t>
+      </w:r>
+      <w:r>
+        <w:rPr>
+          <w:rFonts w:ascii="Times New Roman" w:eastAsia="Times New Roman" w:hAnsi="Times New Roman" w:cs="Times New Roman"/>
+          <w:sz w:val="24"/>
+          <w:szCs w:val="24"/>
+        </w:rPr>
+        <w:t xml:space="preserve"> the left side:</w:t>
+      </w:r>
+    </w:p>
+    <w:p>
+      <w:pPr>
+        <w:tabs>
+          <w:tab w:val="left" w:pos="916"/>
+          <w:tab w:val="left" w:pos="1832"/>
+          <w:tab w:val="left" w:pos="2748"/>
+          <w:tab w:val="left" w:pos="3664"/>
+          <w:tab w:val="left" w:pos="4580"/>
+          <w:tab w:val="left" w:pos="5496"/>
+          <w:tab w:val="left" w:pos="6412"/>
+          <w:tab w:val="left" w:pos="7328"/>
+          <w:tab w:val="left" w:pos="8244"/>
+          <w:tab w:val="left" w:pos="9160"/>
+          <w:tab w:val="left" w:pos="10076"/>
+          <w:tab w:val="left" w:pos="10992"/>
+          <w:tab w:val="left" w:pos="11908"/>
+          <w:tab w:val="left" w:pos="12824"/>
+          <w:tab w:val="left" w:pos="13740"/>
+          <w:tab w:val="left" w:pos="14656"/>
+        </w:tabs>
+        <w:spacing w:after="0" w:line="240" w:lineRule="auto"/>
+        <w:rPr>
+          <w:rFonts w:ascii="Courier New" w:eastAsia="Times New Roman" w:hAnsi="Courier New" w:cs="Courier New"/>
+          <w:sz w:val="20"/>
+          <w:szCs w:val="20"/>
+        </w:rPr>
+      </w:pPr>
+      <w:r>
+        <w:rPr>
+          <w:rFonts w:ascii="Courier New" w:eastAsia="Times New Roman" w:hAnsi="Courier New" w:cs="Courier New"/>
+          <w:sz w:val="20"/>
+          <w:szCs w:val="20"/>
+        </w:rPr>
+        <w:t>4</w:t>
+      </w:r>
+    </w:p>
+    <w:p>
+      <w:pPr>
+        <w:spacing w:before="100" w:beforeAutospacing="1" w:after="100" w:afterAutospacing="1" w:line="240" w:lineRule="auto"/>
+        <w:rPr>
+          <w:rFonts w:ascii="Times New Roman" w:eastAsia="Times New Roman" w:hAnsi="Times New Roman" w:cs="Times New Roman"/>
+          <w:sz w:val="24"/>
+          <w:szCs w:val="24"/>
+        </w:rPr>
+      </w:pPr>
+      <w:r>
+        <w:rPr>
+          <w:rFonts w:ascii="Times New Roman" w:eastAsia="Times New Roman" w:hAnsi="Times New Roman" w:cs="Times New Roman"/>
+          <w:sz w:val="24"/>
+          <w:szCs w:val="24"/>
+        </w:rPr>
+        <w:t>Now the outside layer is finished. The only element left is the center:</w:t>
+      </w:r>
+    </w:p>
+    <w:p>
+      <w:pPr>
+        <w:tabs>
+          <w:tab w:val="left" w:pos="916"/>
+          <w:tab w:val="left" w:pos="1832"/>
+          <w:tab w:val="left" w:pos="2748"/>
+          <w:tab w:val="left" w:pos="3664"/>
+          <w:tab w:val="left" w:pos="4580"/>
+          <w:tab w:val="left" w:pos="5496"/>
+          <w:tab w:val="left" w:pos="6412"/>
+          <w:tab w:val="left" w:pos="7328"/>
+          <w:tab w:val="left" w:pos="8244"/>
+          <w:tab w:val="left" w:pos="9160"/>
+          <w:tab w:val="left" w:pos="10076"/>
+          <w:tab w:val="left" w:pos="10992"/>
+          <w:tab w:val="left" w:pos="11908"/>
+          <w:tab w:val="left" w:pos="12824"/>
+          <w:tab w:val="left" w:pos="13740"/>
+          <w:tab w:val="left" w:pos="14656"/>
+        </w:tabs>
+        <w:spacing w:after="0" w:line="240" w:lineRule="auto"/>
+        <w:rPr>
+          <w:rFonts w:ascii="Courier New" w:eastAsia="Times New Roman" w:hAnsi="Courier New" w:cs="Courier New"/>
+          <w:sz w:val="20"/>
+          <w:szCs w:val="20"/>
+        </w:rPr>
+      </w:pPr>
+      <w:r>
+        <w:rPr>
+          <w:rFonts w:ascii="Courier New" w:eastAsia="Times New Roman" w:hAnsi="Courier New" w:cs="Courier New"/>
+          <w:sz w:val="20"/>
+          <w:szCs w:val="20"/>
+        </w:rPr>
+        <w:t>5</w:t>
+      </w:r>
+    </w:p>
+    <w:p>
+      <w:pPr>
+        <w:spacing w:before="100" w:beforeAutospacing="1" w:after="100" w:afterAutospacing="1" w:line="240" w:lineRule="auto"/>
+        <w:rPr>
+          <w:rFonts w:ascii="Times New Roman" w:eastAsia="Times New Roman" w:hAnsi="Times New Roman" w:cs="Times New Roman"/>
+          <w:sz w:val="24"/>
+          <w:szCs w:val="24"/>
+        </w:rPr>
+      </w:pPr>
+      <w:proofErr w:type="gramStart"/>
+      <w:r>
+        <w:rPr>
+          <w:rFonts w:ascii="Times New Roman" w:eastAsia="Times New Roman" w:hAnsi="Times New Roman" w:cs="Times New Roman"/>
+          <w:sz w:val="24"/>
+          <w:szCs w:val="24"/>
+        </w:rPr>
+        <w:t>So</w:t>
+      </w:r>
+      <w:proofErr w:type="gramEnd"/>
+      <w:r>
+        <w:rPr>
+          <w:rFonts w:ascii="Times New Roman" w:eastAsia="Times New Roman" w:hAnsi="Times New Roman" w:cs="Times New Roman"/>
+          <w:sz w:val="24"/>
+          <w:szCs w:val="24"/>
+        </w:rPr>
+        <w:t xml:space="preserve"> the spiral order is:</w:t>
+      </w:r>
+    </w:p>
+    <w:p>
+      <w:pPr>
+        <w:tabs>
+          <w:tab w:val="left" w:pos="916"/>
+          <w:tab w:val="left" w:pos="1832"/>
+          <w:tab w:val="left" w:pos="2748"/>
+          <w:tab w:val="left" w:pos="3664"/>
+          <w:tab w:val="left" w:pos="4580"/>
+          <w:tab w:val="left" w:pos="5496"/>
+          <w:tab w:val="left" w:pos="6412"/>
+          <w:tab w:val="left" w:pos="7328"/>
+          <w:tab w:val="left" w:pos="8244"/>
+          <w:tab w:val="left" w:pos="9160"/>
+          <w:tab w:val="left" w:pos="10076"/>
+          <w:tab w:val="left" w:pos="10992"/>
+          <w:tab w:val="left" w:pos="11908"/>
+          <w:tab w:val="left" w:pos="12824"/>
+          <w:tab w:val="left" w:pos="13740"/>
+          <w:tab w:val="left" w:pos="14656"/>
+        </w:tabs>
+        <w:spacing w:after="0" w:line="240" w:lineRule="auto"/>
+        <w:rPr>
+          <w:rFonts w:ascii="Courier New" w:eastAsia="Times New Roman" w:hAnsi="Courier New" w:cs="Courier New"/>
+          <w:sz w:val="20"/>
+          <w:szCs w:val="20"/>
+        </w:rPr>
+      </w:pPr>
+      <w:proofErr w:type="gramStart"/>
+      <w:r>
+        <w:rPr>
+          <w:rFonts w:ascii="Courier New" w:eastAsia="Times New Roman" w:hAnsi="Courier New" w:cs="Courier New"/>
+          <w:sz w:val="20"/>
+          <w:szCs w:val="20"/>
+        </w:rPr>
+        <w:t>1</w:t>
+      </w:r>
+      <w:proofErr w:type="gramEnd"/>
+      <w:r>
+        <w:rPr>
+          <w:rFonts w:ascii="Courier New" w:eastAsia="Times New Roman" w:hAnsi="Courier New" w:cs="Courier New"/>
+          <w:sz w:val="20"/>
+          <w:szCs w:val="20"/>
+        </w:rPr>
+        <w:t>, 2, 3, 6, 9, 8, 7, 4, 5</w:t>
+      </w:r>
+    </w:p>
+    <w:p>
+      <w:pPr>
+        <w:spacing w:before="100" w:beforeAutospacing="1" w:after="100" w:afterAutospacing="1" w:line="240" w:lineRule="auto"/>
+        <w:rPr>
+          <w:rFonts w:ascii="Times New Roman" w:eastAsia="Times New Roman" w:hAnsi="Times New Roman" w:cs="Times New Roman"/>
+          <w:sz w:val="24"/>
+          <w:szCs w:val="24"/>
+        </w:rPr>
+      </w:pPr>
+      <w:r>
+        <w:rPr>
+          <w:rFonts w:ascii="Times New Roman" w:eastAsia="Times New Roman" w:hAnsi="Times New Roman" w:cs="Times New Roman"/>
+          <w:sz w:val="24"/>
+          <w:szCs w:val="24"/>
+        </w:rPr>
+        <w:t>The</w:t>
+      </w:r>
+      <w:r>
+        <w:rPr>
+          <w:rFonts w:ascii="Times New Roman" w:eastAsia="Times New Roman" w:hAnsi="Times New Roman" w:cs="Times New Roman"/>
+          <w:sz w:val="24"/>
+          <w:szCs w:val="24"/>
+        </w:rPr>
+        <w:t xml:space="preserve"> easiest way to think about the problem is that the matrix has </w:t>
+      </w:r>
+      <w:r>
+        <w:rPr>
+          <w:rFonts w:ascii="Times New Roman" w:eastAsia="Times New Roman" w:hAnsi="Times New Roman" w:cs="Times New Roman"/>
+          <w:b/>
+          <w:bCs/>
+          <w:sz w:val="24"/>
+          <w:szCs w:val="24"/>
+        </w:rPr>
+        <w:t>layers</w:t>
+      </w:r>
+      <w:r>
+        <w:rPr>
+          <w:rFonts w:ascii="Times New Roman" w:eastAsia="Times New Roman" w:hAnsi="Times New Roman" w:cs="Times New Roman"/>
+          <w:sz w:val="24"/>
+          <w:szCs w:val="24"/>
+        </w:rPr>
+        <w:t>, like an onion. You completely visit the outside layer first, then move inward and repeat the same pattern.</w:t>
+      </w:r>
+    </w:p>
+    <w:p>
+      <w:pPr>
+        <w:spacing w:before="100" w:beforeAutospacing="1" w:after="100" w:afterAutospacing="1" w:line="240" w:lineRule="auto"/>
+        <w:rPr>
+          <w:rFonts w:ascii="Times New Roman" w:eastAsia="Times New Roman" w:hAnsi="Times New Roman" w:cs="Times New Roman"/>
+          <w:sz w:val="24"/>
+          <w:szCs w:val="24"/>
+        </w:rPr>
+      </w:pPr>
+      <w:r>
+        <w:rPr>
+          <w:rFonts w:ascii="Times New Roman" w:eastAsia="Times New Roman" w:hAnsi="Times New Roman" w:cs="Times New Roman"/>
+          <w:sz w:val="24"/>
+          <w:szCs w:val="24"/>
+        </w:rPr>
+        <w:t>For a bigger example:</w:t>
+      </w:r>
+    </w:p>
+    <w:p>
+      <w:pPr>
+        <w:tabs>
+          <w:tab w:val="left" w:pos="916"/>
+          <w:tab w:val="left" w:pos="1832"/>
+          <w:tab w:val="left" w:pos="2748"/>
+          <w:tab w:val="left" w:pos="3664"/>
+          <w:tab w:val="left" w:pos="4580"/>
+          <w:tab w:val="left" w:pos="5496"/>
+          <w:tab w:val="left" w:pos="6412"/>
+          <w:tab w:val="left" w:pos="7328"/>
+          <w:tab w:val="left" w:pos="8244"/>
+          <w:tab w:val="left" w:pos="9160"/>
+          <w:tab w:val="left" w:pos="10076"/>
+          <w:tab w:val="left" w:pos="10992"/>
+          <w:tab w:val="left" w:pos="11908"/>
+          <w:tab w:val="left" w:pos="12824"/>
+          <w:tab w:val="left" w:pos="13740"/>
+          <w:tab w:val="left" w:pos="14656"/>
+        </w:tabs>
+        <w:spacing w:after="0" w:line="240" w:lineRule="auto"/>
+        <w:rPr>
+          <w:rFonts w:ascii="Courier New" w:eastAsia="Times New Roman" w:hAnsi="Courier New" w:cs="Courier New"/>
+          <w:sz w:val="20"/>
+          <w:szCs w:val="20"/>
+        </w:rPr>
+      </w:pPr>
+      <w:r>
+        <w:rPr>
+          <w:rFonts w:ascii="Courier New" w:eastAsia="Times New Roman" w:hAnsi="Courier New" w:cs="Courier New"/>
+          <w:sz w:val="20"/>
+          <w:szCs w:val="20"/>
+        </w:rPr>
+        <w:t>1   2   3   4</w:t>
+      </w:r>
+    </w:p>
+    <w:p>
+      <w:pPr>
+        <w:tabs>
+          <w:tab w:val="left" w:pos="916"/>
+          <w:tab w:val="left" w:pos="1832"/>
+          <w:tab w:val="left" w:pos="2748"/>
+          <w:tab w:val="left" w:pos="3664"/>
+          <w:tab w:val="left" w:pos="4580"/>
+          <w:tab w:val="left" w:pos="5496"/>
+          <w:tab w:val="left" w:pos="6412"/>
+          <w:tab w:val="left" w:pos="7328"/>
+          <w:tab w:val="left" w:pos="8244"/>
+          <w:tab w:val="left" w:pos="9160"/>
+          <w:tab w:val="left" w:pos="10076"/>
+          <w:tab w:val="left" w:pos="10992"/>
+          <w:tab w:val="left" w:pos="11908"/>
+          <w:tab w:val="left" w:pos="12824"/>
+          <w:tab w:val="left" w:pos="13740"/>
+          <w:tab w:val="left" w:pos="14656"/>
+        </w:tabs>
+        <w:spacing w:after="0" w:line="240" w:lineRule="auto"/>
+        <w:rPr>
+          <w:rFonts w:ascii="Courier New" w:eastAsia="Times New Roman" w:hAnsi="Courier New" w:cs="Courier New"/>
+          <w:sz w:val="20"/>
+          <w:szCs w:val="20"/>
+        </w:rPr>
+      </w:pPr>
+      <w:r>
+        <w:rPr>
+          <w:rFonts w:ascii="Courier New" w:eastAsia="Times New Roman" w:hAnsi="Courier New" w:cs="Courier New"/>
+          <w:sz w:val="20"/>
+          <w:szCs w:val="20"/>
+        </w:rPr>
+        <w:t>5   6   7   8</w:t>
+      </w:r>
+    </w:p>
+    <w:p>
+      <w:pPr>
+        <w:tabs>
+          <w:tab w:val="left" w:pos="916"/>
+          <w:tab w:val="left" w:pos="1832"/>
+          <w:tab w:val="left" w:pos="2748"/>
+          <w:tab w:val="left" w:pos="3664"/>
+          <w:tab w:val="left" w:pos="4580"/>
+          <w:tab w:val="left" w:pos="5496"/>
+          <w:tab w:val="left" w:pos="6412"/>
+          <w:tab w:val="left" w:pos="7328"/>
+          <w:tab w:val="left" w:pos="8244"/>
+          <w:tab w:val="left" w:pos="9160"/>
+          <w:tab w:val="left" w:pos="10076"/>
+          <w:tab w:val="left" w:pos="10992"/>
+          <w:tab w:val="left" w:pos="11908"/>
+          <w:tab w:val="left" w:pos="12824"/>
+          <w:tab w:val="left" w:pos="13740"/>
+          <w:tab w:val="left" w:pos="14656"/>
+        </w:tabs>
+        <w:spacing w:after="0" w:line="240" w:lineRule="auto"/>
+        <w:rPr>
+          <w:rFonts w:ascii="Courier New" w:eastAsia="Times New Roman" w:hAnsi="Courier New" w:cs="Courier New"/>
+          <w:sz w:val="20"/>
+          <w:szCs w:val="20"/>
+        </w:rPr>
+      </w:pPr>
+      <w:proofErr w:type="gramStart"/>
+      <w:r>
+        <w:rPr>
+          <w:rFonts w:ascii="Courier New" w:eastAsia="Times New Roman" w:hAnsi="Courier New" w:cs="Courier New"/>
+          <w:sz w:val="20"/>
+          <w:szCs w:val="20"/>
+        </w:rPr>
+        <w:t>9  10</w:t>
+      </w:r>
+      <w:proofErr w:type="gramEnd"/>
+      <w:r>
+        <w:rPr>
+          <w:rFonts w:ascii="Courier New" w:eastAsia="Times New Roman" w:hAnsi="Courier New" w:cs="Courier New"/>
+          <w:sz w:val="20"/>
+          <w:szCs w:val="20"/>
+        </w:rPr>
+        <w:t xml:space="preserve">  11  12</w:t>
+      </w:r>
+    </w:p>
+    <w:p>
+      <w:pPr>
+        <w:spacing w:before="100" w:beforeAutospacing="1" w:after="100" w:afterAutospacing="1" w:line="240" w:lineRule="auto"/>
+        <w:rPr>
+          <w:rFonts w:ascii="Times New Roman" w:eastAsia="Times New Roman" w:hAnsi="Times New Roman" w:cs="Times New Roman"/>
+          <w:sz w:val="24"/>
+          <w:szCs w:val="24"/>
+        </w:rPr>
+      </w:pPr>
+      <w:proofErr w:type="gramStart"/>
+      <w:r>
+        <w:rPr>
+          <w:rFonts w:ascii="Times New Roman" w:eastAsia="Times New Roman" w:hAnsi="Times New Roman" w:cs="Times New Roman"/>
+          <w:sz w:val="24"/>
+          <w:szCs w:val="24"/>
+        </w:rPr>
+        <w:t>First</w:t>
+      </w:r>
+      <w:proofErr w:type="gramEnd"/>
+      <w:r>
+        <w:rPr>
+          <w:rFonts w:ascii="Times New Roman" w:eastAsia="Times New Roman" w:hAnsi="Times New Roman" w:cs="Times New Roman"/>
+          <w:sz w:val="24"/>
+          <w:szCs w:val="24"/>
+        </w:rPr>
+        <w:t xml:space="preserve"> go right:</w:t>
+      </w:r>
+    </w:p>
+    <w:p>
+      <w:pPr>
+        <w:tabs>
+          <w:tab w:val="left" w:pos="916"/>
+          <w:tab w:val="left" w:pos="1832"/>
+          <w:tab w:val="left" w:pos="2748"/>
+          <w:tab w:val="left" w:pos="3664"/>
+          <w:tab w:val="left" w:pos="4580"/>
+          <w:tab w:val="left" w:pos="5496"/>
+          <w:tab w:val="left" w:pos="6412"/>
+          <w:tab w:val="left" w:pos="7328"/>
+          <w:tab w:val="left" w:pos="8244"/>
+          <w:tab w:val="left" w:pos="9160"/>
+          <w:tab w:val="left" w:pos="10076"/>
+          <w:tab w:val="left" w:pos="10992"/>
+          <w:tab w:val="left" w:pos="11908"/>
+          <w:tab w:val="left" w:pos="12824"/>
+          <w:tab w:val="left" w:pos="13740"/>
+          <w:tab w:val="left" w:pos="14656"/>
+        </w:tabs>
+        <w:spacing w:after="0" w:line="240" w:lineRule="auto"/>
+        <w:rPr>
+          <w:rFonts w:ascii="Courier New" w:eastAsia="Times New Roman" w:hAnsi="Courier New" w:cs="Courier New"/>
+          <w:sz w:val="20"/>
+          <w:szCs w:val="20"/>
+        </w:rPr>
+      </w:pPr>
+      <w:proofErr w:type="gramStart"/>
+      <w:r>
+        <w:rPr>
+          <w:rFonts w:ascii="Courier New" w:eastAsia="Times New Roman" w:hAnsi="Courier New" w:cs="Courier New"/>
+          <w:sz w:val="20"/>
+          <w:szCs w:val="20"/>
+        </w:rPr>
+        <w:lastRenderedPageBreak/>
+        <w:t>1</w:t>
+      </w:r>
+      <w:proofErr w:type="gramEnd"/>
+      <w:r>
+        <w:rPr>
+          <w:rFonts w:ascii="Courier New" w:eastAsia="Times New Roman" w:hAnsi="Courier New" w:cs="Courier New"/>
+          <w:sz w:val="20"/>
+          <w:szCs w:val="20"/>
+        </w:rPr>
+        <w:t xml:space="preserve"> → 2 → 3 → 4</w:t>
+      </w:r>
+    </w:p>
+    <w:p>
+      <w:pPr>
+        <w:spacing w:before="100" w:beforeAutospacing="1" w:after="100" w:afterAutospacing="1" w:line="240" w:lineRule="auto"/>
+        <w:rPr>
+          <w:rFonts w:ascii="Times New Roman" w:eastAsia="Times New Roman" w:hAnsi="Times New Roman" w:cs="Times New Roman"/>
+          <w:sz w:val="24"/>
+          <w:szCs w:val="24"/>
+        </w:rPr>
+      </w:pPr>
+      <w:r>
+        <w:rPr>
+          <w:rFonts w:ascii="Times New Roman" w:eastAsia="Times New Roman" w:hAnsi="Times New Roman" w:cs="Times New Roman"/>
+          <w:sz w:val="24"/>
+          <w:szCs w:val="24"/>
+        </w:rPr>
+        <w:t>Then down:</w:t>
+      </w:r>
+    </w:p>
+    <w:p>
+      <w:pPr>
+        <w:tabs>
+          <w:tab w:val="left" w:pos="916"/>
+          <w:tab w:val="left" w:pos="1832"/>
+          <w:tab w:val="left" w:pos="2748"/>
+          <w:tab w:val="left" w:pos="3664"/>
+          <w:tab w:val="left" w:pos="4580"/>
+          <w:tab w:val="left" w:pos="5496"/>
+          <w:tab w:val="left" w:pos="6412"/>
+          <w:tab w:val="left" w:pos="7328"/>
+          <w:tab w:val="left" w:pos="8244"/>
+          <w:tab w:val="left" w:pos="9160"/>
+          <w:tab w:val="left" w:pos="10076"/>
+          <w:tab w:val="left" w:pos="10992"/>
+          <w:tab w:val="left" w:pos="11908"/>
+          <w:tab w:val="left" w:pos="12824"/>
+          <w:tab w:val="left" w:pos="13740"/>
+          <w:tab w:val="left" w:pos="14656"/>
+        </w:tabs>
+        <w:spacing w:after="0" w:line="240" w:lineRule="auto"/>
+        <w:rPr>
+          <w:rFonts w:ascii="Courier New" w:eastAsia="Times New Roman" w:hAnsi="Courier New" w:cs="Courier New"/>
+          <w:sz w:val="20"/>
+          <w:szCs w:val="20"/>
+        </w:rPr>
+      </w:pPr>
+      <w:proofErr w:type="gramStart"/>
+      <w:r>
+        <w:rPr>
+          <w:rFonts w:ascii="Courier New" w:eastAsia="Times New Roman" w:hAnsi="Courier New" w:cs="Courier New"/>
+          <w:sz w:val="20"/>
+          <w:szCs w:val="20"/>
+        </w:rPr>
+        <w:t>8</w:t>
+      </w:r>
+      <w:proofErr w:type="gramEnd"/>
+      <w:r>
+        <w:rPr>
+          <w:rFonts w:ascii="Courier New" w:eastAsia="Times New Roman" w:hAnsi="Courier New" w:cs="Courier New"/>
+          <w:sz w:val="20"/>
+          <w:szCs w:val="20"/>
+        </w:rPr>
+        <w:t xml:space="preserve"> → 12</w:t>
+      </w:r>
+    </w:p>
+    <w:p>
+      <w:pPr>
+        <w:spacing w:before="100" w:beforeAutospacing="1" w:after="100" w:afterAutospacing="1" w:line="240" w:lineRule="auto"/>
+        <w:rPr>
+          <w:rFonts w:ascii="Times New Roman" w:eastAsia="Times New Roman" w:hAnsi="Times New Roman" w:cs="Times New Roman"/>
+          <w:sz w:val="24"/>
+          <w:szCs w:val="24"/>
+        </w:rPr>
+      </w:pPr>
+      <w:r>
+        <w:rPr>
+          <w:rFonts w:ascii="Times New Roman" w:eastAsia="Times New Roman" w:hAnsi="Times New Roman" w:cs="Times New Roman"/>
+          <w:sz w:val="24"/>
+          <w:szCs w:val="24"/>
+        </w:rPr>
+        <w:t>Then left:</w:t>
+      </w:r>
+    </w:p>
+    <w:p>
+      <w:pPr>
+        <w:tabs>
+          <w:tab w:val="left" w:pos="916"/>
+          <w:tab w:val="left" w:pos="1832"/>
+          <w:tab w:val="left" w:pos="2748"/>
+          <w:tab w:val="left" w:pos="3664"/>
+          <w:tab w:val="left" w:pos="4580"/>
+          <w:tab w:val="left" w:pos="5496"/>
+          <w:tab w:val="left" w:pos="6412"/>
+          <w:tab w:val="left" w:pos="7328"/>
+          <w:tab w:val="left" w:pos="8244"/>
+          <w:tab w:val="left" w:pos="9160"/>
+          <w:tab w:val="left" w:pos="10076"/>
+          <w:tab w:val="left" w:pos="10992"/>
+          <w:tab w:val="left" w:pos="11908"/>
+          <w:tab w:val="left" w:pos="12824"/>
+          <w:tab w:val="left" w:pos="13740"/>
+          <w:tab w:val="left" w:pos="14656"/>
+        </w:tabs>
+        <w:spacing w:after="0" w:line="240" w:lineRule="auto"/>
+        <w:rPr>
+          <w:rFonts w:ascii="Courier New" w:eastAsia="Times New Roman" w:hAnsi="Courier New" w:cs="Courier New"/>
+          <w:sz w:val="20"/>
+          <w:szCs w:val="20"/>
+        </w:rPr>
+      </w:pPr>
+      <w:proofErr w:type="gramStart"/>
+      <w:r>
+        <w:rPr>
+          <w:rFonts w:ascii="Courier New" w:eastAsia="Times New Roman" w:hAnsi="Courier New" w:cs="Courier New"/>
+          <w:sz w:val="20"/>
+          <w:szCs w:val="20"/>
+        </w:rPr>
+        <w:t>11</w:t>
+      </w:r>
+      <w:proofErr w:type="gramEnd"/>
+      <w:r>
+        <w:rPr>
+          <w:rFonts w:ascii="Courier New" w:eastAsia="Times New Roman" w:hAnsi="Courier New" w:cs="Courier New"/>
+          <w:sz w:val="20"/>
+          <w:szCs w:val="20"/>
+        </w:rPr>
+        <w:t xml:space="preserve"> → 10 → 9</w:t>
+      </w:r>
+    </w:p>
+    <w:p>
+      <w:pPr>
+        <w:spacing w:before="100" w:beforeAutospacing="1" w:after="100" w:afterAutospacing="1" w:line="240" w:lineRule="auto"/>
+        <w:rPr>
+          <w:rFonts w:ascii="Times New Roman" w:eastAsia="Times New Roman" w:hAnsi="Times New Roman" w:cs="Times New Roman"/>
+          <w:sz w:val="24"/>
+          <w:szCs w:val="24"/>
+        </w:rPr>
+      </w:pPr>
+      <w:r>
+        <w:rPr>
+          <w:rFonts w:ascii="Times New Roman" w:eastAsia="Times New Roman" w:hAnsi="Times New Roman" w:cs="Times New Roman"/>
+          <w:sz w:val="24"/>
+          <w:szCs w:val="24"/>
+        </w:rPr>
+        <w:t>Then up:</w:t>
+      </w:r>
+    </w:p>
+    <w:p>
+      <w:pPr>
+        <w:tabs>
+          <w:tab w:val="left" w:pos="916"/>
+          <w:tab w:val="left" w:pos="1832"/>
+          <w:tab w:val="left" w:pos="2748"/>
+          <w:tab w:val="left" w:pos="3664"/>
+          <w:tab w:val="left" w:pos="4580"/>
+          <w:tab w:val="left" w:pos="5496"/>
+          <w:tab w:val="left" w:pos="6412"/>
+          <w:tab w:val="left" w:pos="7328"/>
+          <w:tab w:val="left" w:pos="8244"/>
+          <w:tab w:val="left" w:pos="9160"/>
+          <w:tab w:val="left" w:pos="10076"/>
+          <w:tab w:val="left" w:pos="10992"/>
+          <w:tab w:val="left" w:pos="11908"/>
+          <w:tab w:val="left" w:pos="12824"/>
+          <w:tab w:val="left" w:pos="13740"/>
+          <w:tab w:val="left" w:pos="14656"/>
+        </w:tabs>
+        <w:spacing w:after="0" w:line="240" w:lineRule="auto"/>
+        <w:rPr>
+          <w:rFonts w:ascii="Courier New" w:eastAsia="Times New Roman" w:hAnsi="Courier New" w:cs="Courier New"/>
+          <w:sz w:val="20"/>
+          <w:szCs w:val="20"/>
+        </w:rPr>
+      </w:pPr>
+      <w:r>
+        <w:rPr>
+          <w:rFonts w:ascii="Courier New" w:eastAsia="Times New Roman" w:hAnsi="Courier New" w:cs="Courier New"/>
+          <w:sz w:val="20"/>
+          <w:szCs w:val="20"/>
+        </w:rPr>
+        <w:t>5</w:t>
+      </w:r>
+    </w:p>
+    <w:p>
+      <w:pPr>
+        <w:spacing w:before="100" w:beforeAutospacing="1" w:after="100" w:afterAutospacing="1" w:line="240" w:lineRule="auto"/>
+        <w:rPr>
+          <w:rFonts w:ascii="Times New Roman" w:eastAsia="Times New Roman" w:hAnsi="Times New Roman" w:cs="Times New Roman"/>
+          <w:sz w:val="24"/>
+          <w:szCs w:val="24"/>
+        </w:rPr>
+      </w:pPr>
+      <w:r>
+        <w:rPr>
+          <w:rFonts w:ascii="Times New Roman" w:eastAsia="Times New Roman" w:hAnsi="Times New Roman" w:cs="Times New Roman"/>
+          <w:sz w:val="24"/>
+          <w:szCs w:val="24"/>
+        </w:rPr>
+        <w:t>Now the outer layer is finished. The remaining inner part is:</w:t>
+      </w:r>
+    </w:p>
+    <w:p>
+      <w:pPr>
+        <w:tabs>
+          <w:tab w:val="left" w:pos="916"/>
+          <w:tab w:val="left" w:pos="1832"/>
+          <w:tab w:val="left" w:pos="2748"/>
+          <w:tab w:val="left" w:pos="3664"/>
+          <w:tab w:val="left" w:pos="4580"/>
+          <w:tab w:val="left" w:pos="5496"/>
+          <w:tab w:val="left" w:pos="6412"/>
+          <w:tab w:val="left" w:pos="7328"/>
+          <w:tab w:val="left" w:pos="8244"/>
+          <w:tab w:val="left" w:pos="9160"/>
+          <w:tab w:val="left" w:pos="10076"/>
+          <w:tab w:val="left" w:pos="10992"/>
+          <w:tab w:val="left" w:pos="11908"/>
+          <w:tab w:val="left" w:pos="12824"/>
+          <w:tab w:val="left" w:pos="13740"/>
+          <w:tab w:val="left" w:pos="14656"/>
+        </w:tabs>
+        <w:spacing w:after="0" w:line="240" w:lineRule="auto"/>
+        <w:rPr>
+          <w:rFonts w:ascii="Courier New" w:eastAsia="Times New Roman" w:hAnsi="Courier New" w:cs="Courier New"/>
+          <w:sz w:val="20"/>
+          <w:szCs w:val="20"/>
+        </w:rPr>
+      </w:pPr>
+      <w:proofErr w:type="gramStart"/>
+      <w:r>
+        <w:rPr>
+          <w:rFonts w:ascii="Courier New" w:eastAsia="Times New Roman" w:hAnsi="Courier New" w:cs="Courier New"/>
+          <w:sz w:val="20"/>
+          <w:szCs w:val="20"/>
+        </w:rPr>
+        <w:t>6</w:t>
+      </w:r>
+      <w:proofErr w:type="gramEnd"/>
+      <w:r>
+        <w:rPr>
+          <w:rFonts w:ascii="Courier New" w:eastAsia="Times New Roman" w:hAnsi="Courier New" w:cs="Courier New"/>
+          <w:sz w:val="20"/>
+          <w:szCs w:val="20"/>
+        </w:rPr>
+        <w:t xml:space="preserve"> → 7</w:t>
+      </w:r>
+    </w:p>
+    <w:p>
+      <w:pPr>
+        <w:spacing w:before="100" w:beforeAutospacing="1" w:after="100" w:afterAutospacing="1" w:line="240" w:lineRule="auto"/>
+        <w:rPr>
+          <w:rFonts w:ascii="Times New Roman" w:eastAsia="Times New Roman" w:hAnsi="Times New Roman" w:cs="Times New Roman"/>
+          <w:sz w:val="24"/>
+          <w:szCs w:val="24"/>
+        </w:rPr>
+      </w:pPr>
+      <w:proofErr w:type="gramStart"/>
+      <w:r>
+        <w:rPr>
+          <w:rFonts w:ascii="Times New Roman" w:eastAsia="Times New Roman" w:hAnsi="Times New Roman" w:cs="Times New Roman"/>
+          <w:sz w:val="24"/>
+          <w:szCs w:val="24"/>
+        </w:rPr>
+        <w:t>So</w:t>
+      </w:r>
+      <w:proofErr w:type="gramEnd"/>
+      <w:r>
+        <w:rPr>
+          <w:rFonts w:ascii="Times New Roman" w:eastAsia="Times New Roman" w:hAnsi="Times New Roman" w:cs="Times New Roman"/>
+          <w:sz w:val="24"/>
+          <w:szCs w:val="24"/>
+        </w:rPr>
+        <w:t xml:space="preserve"> the final answer is:</w:t>
+      </w:r>
+    </w:p>
+    <w:p>
+      <w:pPr>
+        <w:tabs>
+          <w:tab w:val="left" w:pos="916"/>
+          <w:tab w:val="left" w:pos="1832"/>
+          <w:tab w:val="left" w:pos="2748"/>
+          <w:tab w:val="left" w:pos="3664"/>
+          <w:tab w:val="left" w:pos="4580"/>
+          <w:tab w:val="left" w:pos="5496"/>
+          <w:tab w:val="left" w:pos="6412"/>
+          <w:tab w:val="left" w:pos="7328"/>
+          <w:tab w:val="left" w:pos="8244"/>
+          <w:tab w:val="left" w:pos="9160"/>
+          <w:tab w:val="left" w:pos="10076"/>
+          <w:tab w:val="left" w:pos="10992"/>
+          <w:tab w:val="left" w:pos="11908"/>
+          <w:tab w:val="left" w:pos="12824"/>
+          <w:tab w:val="left" w:pos="13740"/>
+          <w:tab w:val="left" w:pos="14656"/>
+        </w:tabs>
+        <w:spacing w:after="0" w:line="240" w:lineRule="auto"/>
+        <w:rPr>
+          <w:rFonts w:ascii="Courier New" w:eastAsia="Times New Roman" w:hAnsi="Courier New" w:cs="Courier New"/>
+          <w:sz w:val="20"/>
+          <w:szCs w:val="20"/>
+        </w:rPr>
+      </w:pPr>
+      <w:r>
+        <w:rPr>
+          <w:rFonts w:ascii="Courier New" w:eastAsia="Times New Roman" w:hAnsi="Courier New" w:cs="Courier New"/>
+          <w:sz w:val="20"/>
+          <w:szCs w:val="20"/>
+        </w:rPr>
+        <w:t>1, 2, 3, 4, 8, 12, 11, 10, 9, 5, 6, 7</w:t>
+      </w:r>
+    </w:p>
+    <w:p>
+      <w:pPr>
+        <w:spacing w:before="100" w:beforeAutospacing="1" w:after="100" w:afterAutospacing="1" w:line="240" w:lineRule="auto"/>
+        <w:rPr>
+          <w:rFonts w:ascii="Times New Roman" w:eastAsia="Times New Roman" w:hAnsi="Times New Roman" w:cs="Times New Roman"/>
+          <w:sz w:val="24"/>
+          <w:szCs w:val="24"/>
+        </w:rPr>
+      </w:pPr>
+      <w:r>
+        <w:rPr>
+          <w:rFonts w:ascii="Times New Roman" w:eastAsia="Times New Roman" w:hAnsi="Times New Roman" w:cs="Times New Roman"/>
+          <w:sz w:val="24"/>
+          <w:szCs w:val="24"/>
+        </w:rPr>
+        <w:t xml:space="preserve">Conceptually, you keep track of </w:t>
+      </w:r>
+      <w:r>
+        <w:rPr>
+          <w:rFonts w:ascii="Times New Roman" w:eastAsia="Times New Roman" w:hAnsi="Times New Roman" w:cs="Times New Roman"/>
+          <w:b/>
+          <w:bCs/>
+          <w:sz w:val="24"/>
+          <w:szCs w:val="24"/>
+        </w:rPr>
+        <w:t>four boundaries</w:t>
+      </w:r>
+      <w:r>
+        <w:rPr>
+          <w:rFonts w:ascii="Times New Roman" w:eastAsia="Times New Roman" w:hAnsi="Times New Roman" w:cs="Times New Roman"/>
+          <w:sz w:val="24"/>
+          <w:szCs w:val="24"/>
+        </w:rPr>
+        <w:t>: the current top row, bottom row, left column, and right column. After traveling along one boundary, you move that boundary inward.</w:t>
+      </w:r>
+    </w:p>
+    <w:p>
+      <w:pPr>
+        <w:spacing w:before="100" w:beforeAutospacing="1" w:after="100" w:afterAutospacing="1" w:line="240" w:lineRule="auto"/>
+        <w:rPr>
+          <w:rFonts w:ascii="Times New Roman" w:eastAsia="Times New Roman" w:hAnsi="Times New Roman" w:cs="Times New Roman"/>
+          <w:sz w:val="24"/>
+          <w:szCs w:val="24"/>
+        </w:rPr>
+      </w:pPr>
+      <w:r>
+        <w:rPr>
+          <w:rFonts w:ascii="Times New Roman" w:eastAsia="Times New Roman" w:hAnsi="Times New Roman" w:cs="Times New Roman"/>
+          <w:sz w:val="24"/>
+          <w:szCs w:val="24"/>
+        </w:rPr>
+        <w:t>The repeating movement is:</w:t>
+      </w:r>
+    </w:p>
+    <w:p>
+      <w:pPr>
+        <w:spacing w:before="100" w:beforeAutospacing="1" w:after="100" w:afterAutospacing="1" w:line="240" w:lineRule="auto"/>
+        <w:rPr>
+          <w:rFonts w:ascii="Times New Roman" w:eastAsia="Times New Roman" w:hAnsi="Times New Roman" w:cs="Times New Roman"/>
+          <w:sz w:val="24"/>
+          <w:szCs w:val="24"/>
+        </w:rPr>
+      </w:pPr>
+      <w:r>
+        <w:rPr>
+          <w:rFonts w:ascii="Times New Roman" w:eastAsia="Times New Roman" w:hAnsi="Times New Roman" w:cs="Times New Roman"/>
+          <w:b/>
+          <w:bCs/>
+          <w:sz w:val="24"/>
+          <w:szCs w:val="24"/>
+        </w:rPr>
+        <w:t xml:space="preserve">Right → Down → Left → Up → Right → Down </w:t>
+      </w:r>
+      <w:proofErr w:type="gramStart"/>
+      <w:r>
+        <w:rPr>
+          <w:rFonts w:ascii="Times New Roman" w:eastAsia="Times New Roman" w:hAnsi="Times New Roman" w:cs="Times New Roman"/>
+          <w:b/>
+          <w:bCs/>
+          <w:sz w:val="24"/>
+          <w:szCs w:val="24"/>
+        </w:rPr>
+        <w:t>→ ...</w:t>
+      </w:r>
+      <w:proofErr w:type="gramEnd"/>
+    </w:p>
+    <w:p>
+      <w:pPr>
+        <w:spacing w:before="100" w:beforeAutospacing="1" w:after="100" w:afterAutospacing="1" w:line="240" w:lineRule="auto"/>
+        <w:rPr>
+          <w:rFonts w:ascii="Times New Roman" w:eastAsia="Times New Roman" w:hAnsi="Times New Roman" w:cs="Times New Roman"/>
+          <w:sz w:val="24"/>
+          <w:szCs w:val="24"/>
+        </w:rPr>
+      </w:pPr>
+      <w:r>
+        <w:rPr>
+          <w:rFonts w:ascii="Times New Roman" w:eastAsia="Times New Roman" w:hAnsi="Times New Roman" w:cs="Times New Roman"/>
+          <w:sz w:val="24"/>
+          <w:szCs w:val="24"/>
+        </w:rPr>
+        <w:t>The important tricky part is that the matrix does not have to be square. For example:</w:t>
+      </w:r>
+    </w:p>
+    <w:p>
+      <w:pPr>
+        <w:tabs>
+          <w:tab w:val="left" w:pos="916"/>
+          <w:tab w:val="left" w:pos="1832"/>
+          <w:tab w:val="left" w:pos="2748"/>
+          <w:tab w:val="left" w:pos="3664"/>
+          <w:tab w:val="left" w:pos="4580"/>
+          <w:tab w:val="left" w:pos="5496"/>
+          <w:tab w:val="left" w:pos="6412"/>
+          <w:tab w:val="left" w:pos="7328"/>
+          <w:tab w:val="left" w:pos="8244"/>
+          <w:tab w:val="left" w:pos="9160"/>
+          <w:tab w:val="left" w:pos="10076"/>
+          <w:tab w:val="left" w:pos="10992"/>
+          <w:tab w:val="left" w:pos="11908"/>
+          <w:tab w:val="left" w:pos="12824"/>
+          <w:tab w:val="left" w:pos="13740"/>
+          <w:tab w:val="left" w:pos="14656"/>
+        </w:tabs>
+        <w:spacing w:after="0" w:line="240" w:lineRule="auto"/>
+        <w:rPr>
+          <w:rFonts w:ascii="Courier New" w:eastAsia="Times New Roman" w:hAnsi="Courier New" w:cs="Courier New"/>
+          <w:sz w:val="20"/>
+          <w:szCs w:val="20"/>
+        </w:rPr>
+      </w:pPr>
+      <w:proofErr w:type="gramStart"/>
+      <w:r>
+        <w:rPr>
+          <w:rFonts w:ascii="Courier New" w:eastAsia="Times New Roman" w:hAnsi="Courier New" w:cs="Courier New"/>
+          <w:sz w:val="20"/>
+          <w:szCs w:val="20"/>
+        </w:rPr>
+        <w:t>1  2</w:t>
+      </w:r>
+      <w:proofErr w:type="gramEnd"/>
+      <w:r>
+        <w:rPr>
+          <w:rFonts w:ascii="Courier New" w:eastAsia="Times New Roman" w:hAnsi="Courier New" w:cs="Courier New"/>
+          <w:sz w:val="20"/>
+          <w:szCs w:val="20"/>
+        </w:rPr>
+        <w:t xml:space="preserve">  3  4</w:t>
+      </w:r>
+    </w:p>
+    <w:p>
+      <w:pPr>
+        <w:tabs>
+          <w:tab w:val="left" w:pos="916"/>
+          <w:tab w:val="left" w:pos="1832"/>
+          <w:tab w:val="left" w:pos="2748"/>
+          <w:tab w:val="left" w:pos="3664"/>
+          <w:tab w:val="left" w:pos="4580"/>
+          <w:tab w:val="left" w:pos="5496"/>
+          <w:tab w:val="left" w:pos="6412"/>
+          <w:tab w:val="left" w:pos="7328"/>
+          <w:tab w:val="left" w:pos="8244"/>
+          <w:tab w:val="left" w:pos="9160"/>
+          <w:tab w:val="left" w:pos="10076"/>
+          <w:tab w:val="left" w:pos="10992"/>
+          <w:tab w:val="left" w:pos="11908"/>
+          <w:tab w:val="left" w:pos="12824"/>
+          <w:tab w:val="left" w:pos="13740"/>
+          <w:tab w:val="left" w:pos="14656"/>
+        </w:tabs>
+        <w:spacing w:after="0" w:line="240" w:lineRule="auto"/>
+        <w:rPr>
+          <w:rFonts w:ascii="Courier New" w:eastAsia="Times New Roman" w:hAnsi="Courier New" w:cs="Courier New"/>
+          <w:sz w:val="20"/>
+          <w:szCs w:val="20"/>
+        </w:rPr>
+      </w:pPr>
+      <w:proofErr w:type="gramStart"/>
+      <w:r>
+        <w:rPr>
+          <w:rFonts w:ascii="Courier New" w:eastAsia="Times New Roman" w:hAnsi="Courier New" w:cs="Courier New"/>
+          <w:sz w:val="20"/>
+          <w:szCs w:val="20"/>
+        </w:rPr>
+        <w:t>5  6</w:t>
+      </w:r>
+      <w:proofErr w:type="gramEnd"/>
+      <w:r>
+        <w:rPr>
+          <w:rFonts w:ascii="Courier New" w:eastAsia="Times New Roman" w:hAnsi="Courier New" w:cs="Courier New"/>
+          <w:sz w:val="20"/>
+          <w:szCs w:val="20"/>
+        </w:rPr>
+        <w:t xml:space="preserve">  7  8</w:t>
+      </w:r>
+    </w:p>
+    <w:p>
+      <w:pPr>
+        <w:spacing w:before="100" w:beforeAutospacing="1" w:after="100" w:afterAutospacing="1" w:line="240" w:lineRule="auto"/>
+        <w:rPr>
+          <w:rFonts w:ascii="Times New Roman" w:eastAsia="Times New Roman" w:hAnsi="Times New Roman" w:cs="Times New Roman"/>
+          <w:sz w:val="24"/>
+          <w:szCs w:val="24"/>
+        </w:rPr>
+      </w:pPr>
+      <w:r>
+        <w:rPr>
+          <w:rFonts w:ascii="Times New Roman" w:eastAsia="Times New Roman" w:hAnsi="Times New Roman" w:cs="Times New Roman"/>
+          <w:sz w:val="24"/>
+          <w:szCs w:val="24"/>
+        </w:rPr>
+        <w:t>Its spiral order is:</w:t>
+      </w:r>
+    </w:p>
+    <w:p>
+      <w:pPr>
+        <w:tabs>
+          <w:tab w:val="left" w:pos="916"/>
+          <w:tab w:val="left" w:pos="1832"/>
+          <w:tab w:val="left" w:pos="2748"/>
+          <w:tab w:val="left" w:pos="3664"/>
+          <w:tab w:val="left" w:pos="4580"/>
+          <w:tab w:val="left" w:pos="5496"/>
+          <w:tab w:val="left" w:pos="6412"/>
+          <w:tab w:val="left" w:pos="7328"/>
+          <w:tab w:val="left" w:pos="8244"/>
+          <w:tab w:val="left" w:pos="9160"/>
+          <w:tab w:val="left" w:pos="10076"/>
+          <w:tab w:val="left" w:pos="10992"/>
+          <w:tab w:val="left" w:pos="11908"/>
+          <w:tab w:val="left" w:pos="12824"/>
+          <w:tab w:val="left" w:pos="13740"/>
+          <w:tab w:val="left" w:pos="14656"/>
+        </w:tabs>
+        <w:spacing w:after="0" w:line="240" w:lineRule="auto"/>
+        <w:rPr>
+          <w:rFonts w:ascii="Courier New" w:eastAsia="Times New Roman" w:hAnsi="Courier New" w:cs="Courier New"/>
+          <w:sz w:val="20"/>
+          <w:szCs w:val="20"/>
+        </w:rPr>
+      </w:pPr>
+      <w:proofErr w:type="gramStart"/>
+      <w:r>
+        <w:rPr>
+          <w:rFonts w:ascii="Courier New" w:eastAsia="Times New Roman" w:hAnsi="Courier New" w:cs="Courier New"/>
+          <w:sz w:val="20"/>
+          <w:szCs w:val="20"/>
+        </w:rPr>
+        <w:t>1</w:t>
+      </w:r>
+      <w:proofErr w:type="gramEnd"/>
+      <w:r>
+        <w:rPr>
+          <w:rFonts w:ascii="Courier New" w:eastAsia="Times New Roman" w:hAnsi="Courier New" w:cs="Courier New"/>
+          <w:sz w:val="20"/>
+          <w:szCs w:val="20"/>
+        </w:rPr>
+        <w:t>, 2, 3, 4, 8, 7, 6, 5</w:t>
+      </w:r>
+    </w:p>
+    <w:p>
+      <w:pPr>
+        <w:spacing w:before="100" w:beforeAutospacing="1" w:after="100" w:afterAutospacing="1" w:line="240" w:lineRule="auto"/>
+        <w:rPr>
+          <w:rFonts w:ascii="Times New Roman" w:eastAsia="Times New Roman" w:hAnsi="Times New Roman" w:cs="Times New Roman"/>
+          <w:sz w:val="24"/>
+          <w:szCs w:val="24"/>
+        </w:rPr>
+      </w:pPr>
+      <w:proofErr w:type="gramStart"/>
+      <w:r>
+        <w:rPr>
+          <w:rFonts w:ascii="Times New Roman" w:eastAsia="Times New Roman" w:hAnsi="Times New Roman" w:cs="Times New Roman"/>
+          <w:sz w:val="24"/>
+          <w:szCs w:val="24"/>
+        </w:rPr>
+        <w:t>Also</w:t>
+      </w:r>
+      <w:proofErr w:type="gramEnd"/>
+      <w:r>
+        <w:rPr>
+          <w:rFonts w:ascii="Times New Roman" w:eastAsia="Times New Roman" w:hAnsi="Times New Roman" w:cs="Times New Roman"/>
+          <w:sz w:val="24"/>
+          <w:szCs w:val="24"/>
+        </w:rPr>
+        <w:t>, near the end</w:t>
+      </w:r>
+      <w:r>
+        <w:rPr>
+          <w:rFonts w:ascii="Times New Roman" w:eastAsia="Times New Roman" w:hAnsi="Times New Roman" w:cs="Times New Roman"/>
+          <w:sz w:val="24"/>
+          <w:szCs w:val="24"/>
+        </w:rPr>
+        <w:t>,</w:t>
+      </w:r>
+      <w:r>
+        <w:rPr>
+          <w:rFonts w:ascii="Times New Roman" w:eastAsia="Times New Roman" w:hAnsi="Times New Roman" w:cs="Times New Roman"/>
+          <w:sz w:val="24"/>
+          <w:szCs w:val="24"/>
+        </w:rPr>
+        <w:t xml:space="preserve"> you might have only </w:t>
+      </w:r>
+      <w:r>
+        <w:rPr>
+          <w:rFonts w:ascii="Times New Roman" w:eastAsia="Times New Roman" w:hAnsi="Times New Roman" w:cs="Times New Roman"/>
+          <w:b/>
+          <w:bCs/>
+          <w:sz w:val="24"/>
+          <w:szCs w:val="24"/>
+        </w:rPr>
+        <w:t>one row</w:t>
+      </w:r>
+      <w:r>
+        <w:rPr>
+          <w:rFonts w:ascii="Times New Roman" w:eastAsia="Times New Roman" w:hAnsi="Times New Roman" w:cs="Times New Roman"/>
+          <w:sz w:val="24"/>
+          <w:szCs w:val="24"/>
+        </w:rPr>
+        <w:t xml:space="preserve"> or </w:t>
+      </w:r>
+      <w:r>
+        <w:rPr>
+          <w:rFonts w:ascii="Times New Roman" w:eastAsia="Times New Roman" w:hAnsi="Times New Roman" w:cs="Times New Roman"/>
+          <w:b/>
+          <w:bCs/>
+          <w:sz w:val="24"/>
+          <w:szCs w:val="24"/>
+        </w:rPr>
+        <w:t>one column</w:t>
+      </w:r>
+      <w:r>
+        <w:rPr>
+          <w:rFonts w:ascii="Times New Roman" w:eastAsia="Times New Roman" w:hAnsi="Times New Roman" w:cs="Times New Roman"/>
+          <w:sz w:val="24"/>
+          <w:szCs w:val="24"/>
+        </w:rPr>
+        <w:t xml:space="preserve"> remaining. You have to be careful not to visit those elements twice.</w:t>
+      </w:r>
+    </w:p>
+    <w:p>
+      <w:pPr>
+        <w:spacing w:before="100" w:beforeAutospacing="1" w:after="100" w:afterAutospacing="1" w:line="240" w:lineRule="auto"/>
+        <w:rPr>
+          <w:rFonts w:ascii="Times New Roman" w:eastAsia="Times New Roman" w:hAnsi="Times New Roman" w:cs="Times New Roman"/>
+          <w:sz w:val="24"/>
+          <w:szCs w:val="24"/>
+        </w:rPr>
+      </w:pPr>
+      <w:proofErr w:type="gramStart"/>
+      <w:r>
+        <w:rPr>
+          <w:rFonts w:ascii="Times New Roman" w:eastAsia="Times New Roman" w:hAnsi="Times New Roman" w:cs="Times New Roman"/>
+          <w:sz w:val="24"/>
+          <w:szCs w:val="24"/>
+        </w:rPr>
+        <w:t>So</w:t>
+      </w:r>
+      <w:proofErr w:type="gramEnd"/>
+      <w:r>
+        <w:rPr>
+          <w:rFonts w:ascii="Times New Roman" w:eastAsia="Times New Roman" w:hAnsi="Times New Roman" w:cs="Times New Roman"/>
+          <w:sz w:val="24"/>
+          <w:szCs w:val="24"/>
+        </w:rPr>
+        <w:t xml:space="preserve"> the core idea is:</w:t>
+      </w:r>
+    </w:p>
+    <w:p>
+      <w:pPr>
+        <w:spacing w:beforeAutospacing="1" w:after="100" w:afterAutospacing="1" w:line="240" w:lineRule="auto"/>
+        <w:rPr>
+          <w:rFonts w:ascii="Times New Roman" w:eastAsia="Times New Roman" w:hAnsi="Times New Roman" w:cs="Times New Roman"/>
+          <w:sz w:val="24"/>
+          <w:szCs w:val="24"/>
+        </w:rPr>
+      </w:pPr>
+      <w:r>
+        <w:rPr>
+          <w:rFonts w:ascii="Times New Roman" w:eastAsia="Times New Roman" w:hAnsi="Times New Roman" w:cs="Times New Roman"/>
+          <w:sz w:val="24"/>
+          <w:szCs w:val="24"/>
+        </w:rPr>
+        <w:t>Walk around the outside rectangle, shrink the rectangle, and repeat until there is nothing left.</w:t>
+      </w:r>
+    </w:p>
+    <w:p>
+      <w:pPr>
+        <w:spacing w:beforeAutospacing="1" w:after="100" w:afterAutospacing="1" w:line="240" w:lineRule="auto"/>
+        <w:rPr>
+          <w:rFonts w:ascii="Times New Roman" w:eastAsia="Times New Roman" w:hAnsi="Times New Roman" w:cs="Times New Roman"/>
+          <w:sz w:val="24"/>
+          <w:szCs w:val="24"/>
+        </w:rPr>
+      </w:pPr>
+    </w:p>
+    <w:p>
+      <w:pPr>
+        <w:spacing w:beforeAutospacing="1" w:after="100" w:afterAutospacing="1" w:line="240" w:lineRule="auto"/>
+        <w:rPr>
+          <w:rFonts w:ascii="Times New Roman" w:eastAsia="Times New Roman" w:hAnsi="Times New Roman" w:cs="Times New Roman"/>
+          <w:sz w:val="24"/>
+          <w:szCs w:val="24"/>
+        </w:rPr>
+      </w:pPr>
+    </w:p>
+    <w:p>
+      <w:pPr>
+        <w:spacing w:beforeAutospacing="1" w:after="100" w:afterAutospacing="1" w:line="240" w:lineRule="auto"/>
+        <w:rPr>
+          <w:rFonts w:ascii="Times New Roman" w:eastAsia="Times New Roman" w:hAnsi="Times New Roman" w:cs="Times New Roman"/>
+          <w:sz w:val="24"/>
+          <w:szCs w:val="24"/>
+        </w:rPr>
+      </w:pPr>
+    </w:p>
+    <w:p>
+      <w:pPr>
+        <w:spacing w:before="100" w:beforeAutospacing="1" w:after="100" w:afterAutospacing="1" w:line="240" w:lineRule="auto"/>
+        <w:rPr>
+          <w:rFonts w:ascii="Times New Roman" w:eastAsia="Times New Roman" w:hAnsi="Times New Roman" w:cs="Times New Roman"/>
+          <w:sz w:val="24"/>
+          <w:szCs w:val="24"/>
+        </w:rPr>
+      </w:pPr>
+      <w:r>
+        <w:rPr>
+          <w:rFonts w:ascii="Times New Roman" w:eastAsia="Times New Roman" w:hAnsi="Times New Roman" w:cs="Times New Roman"/>
+          <w:sz w:val="24"/>
+          <w:szCs w:val="24"/>
+        </w:rPr>
+        <w:t xml:space="preserve">So inside your function, after </w:t>
+      </w:r>
+      <w:proofErr w:type="gramStart"/>
+      <w:r>
+        <w:rPr>
+          <w:rFonts w:ascii="Times New Roman" w:eastAsia="Times New Roman" w:hAnsi="Times New Roman" w:cs="Times New Roman"/>
+          <w:sz w:val="24"/>
+          <w:szCs w:val="24"/>
+        </w:rPr>
+        <w:t xml:space="preserve">the </w:t>
+      </w:r>
+      <w:r>
+        <w:rPr>
+          <w:rFonts w:ascii="Courier New" w:eastAsia="Times New Roman" w:hAnsi="Courier New" w:cs="Courier New"/>
+          <w:sz w:val="20"/>
+          <w:szCs w:val="20"/>
+        </w:rPr>
+        <w:t>if</w:t>
+      </w:r>
+      <w:proofErr w:type="gramEnd"/>
+      <w:r>
+        <w:rPr>
+          <w:rFonts w:ascii="Times New Roman" w:eastAsia="Times New Roman" w:hAnsi="Times New Roman" w:cs="Times New Roman"/>
+          <w:sz w:val="24"/>
+          <w:szCs w:val="24"/>
+        </w:rPr>
+        <w:t>, create:</w:t>
+      </w:r>
+    </w:p>
+    <w:p>
+      <w:pPr>
+        <w:tabs>
+          <w:tab w:val="left" w:pos="916"/>
+          <w:tab w:val="left" w:pos="1832"/>
+          <w:tab w:val="left" w:pos="2748"/>
+          <w:tab w:val="left" w:pos="3664"/>
+          <w:tab w:val="left" w:pos="4580"/>
+          <w:tab w:val="left" w:pos="5496"/>
+          <w:tab w:val="left" w:pos="6412"/>
+          <w:tab w:val="left" w:pos="7328"/>
+          <w:tab w:val="left" w:pos="8244"/>
+          <w:tab w:val="left" w:pos="9160"/>
+          <w:tab w:val="left" w:pos="10076"/>
+          <w:tab w:val="left" w:pos="10992"/>
+          <w:tab w:val="left" w:pos="11908"/>
+          <w:tab w:val="left" w:pos="12824"/>
+          <w:tab w:val="left" w:pos="13740"/>
+          <w:tab w:val="left" w:pos="14656"/>
+        </w:tabs>
+        <w:spacing w:after="0" w:line="240" w:lineRule="auto"/>
+        <w:rPr>
+          <w:rFonts w:ascii="Courier New" w:eastAsia="Times New Roman" w:hAnsi="Courier New" w:cs="Courier New"/>
+          <w:sz w:val="20"/>
+          <w:szCs w:val="20"/>
+        </w:rPr>
+      </w:pPr>
+      <w:proofErr w:type="gramStart"/>
+      <w:r>
+        <w:rPr>
+          <w:rFonts w:ascii="Courier New" w:eastAsia="Times New Roman" w:hAnsi="Courier New" w:cs="Courier New"/>
+          <w:sz w:val="20"/>
+          <w:szCs w:val="20"/>
+        </w:rPr>
+        <w:t>top</w:t>
+      </w:r>
+      <w:proofErr w:type="gramEnd"/>
+      <w:r>
+        <w:rPr>
+          <w:rFonts w:ascii="Courier New" w:eastAsia="Times New Roman" w:hAnsi="Courier New" w:cs="Courier New"/>
+          <w:sz w:val="20"/>
+          <w:szCs w:val="20"/>
+        </w:rPr>
+        <w:t xml:space="preserve"> = 0</w:t>
+      </w:r>
+    </w:p>
+    <w:p>
+      <w:pPr>
+        <w:tabs>
+          <w:tab w:val="left" w:pos="916"/>
+          <w:tab w:val="left" w:pos="1832"/>
+          <w:tab w:val="left" w:pos="2748"/>
+          <w:tab w:val="left" w:pos="3664"/>
+          <w:tab w:val="left" w:pos="4580"/>
+          <w:tab w:val="left" w:pos="5496"/>
+          <w:tab w:val="left" w:pos="6412"/>
+          <w:tab w:val="left" w:pos="7328"/>
+          <w:tab w:val="left" w:pos="8244"/>
+          <w:tab w:val="left" w:pos="9160"/>
+          <w:tab w:val="left" w:pos="10076"/>
+          <w:tab w:val="left" w:pos="10992"/>
+          <w:tab w:val="left" w:pos="11908"/>
+          <w:tab w:val="left" w:pos="12824"/>
+          <w:tab w:val="left" w:pos="13740"/>
+          <w:tab w:val="left" w:pos="14656"/>
+        </w:tabs>
+        <w:spacing w:after="0" w:line="240" w:lineRule="auto"/>
+        <w:rPr>
+          <w:rFonts w:ascii="Courier New" w:eastAsia="Times New Roman" w:hAnsi="Courier New" w:cs="Courier New"/>
+          <w:sz w:val="20"/>
+          <w:szCs w:val="20"/>
+        </w:rPr>
+      </w:pPr>
+      <w:proofErr w:type="gramStart"/>
+      <w:r>
+        <w:rPr>
+          <w:rFonts w:ascii="Courier New" w:eastAsia="Times New Roman" w:hAnsi="Courier New" w:cs="Courier New"/>
+          <w:sz w:val="20"/>
+          <w:szCs w:val="20"/>
+        </w:rPr>
+        <w:t>bottom</w:t>
+      </w:r>
+      <w:proofErr w:type="gramEnd"/>
+      <w:r>
+        <w:rPr>
+          <w:rFonts w:ascii="Courier New" w:eastAsia="Times New Roman" w:hAnsi="Courier New" w:cs="Courier New"/>
+          <w:sz w:val="20"/>
+          <w:szCs w:val="20"/>
+        </w:rPr>
+        <w:t xml:space="preserve"> = </w:t>
+      </w:r>
+      <w:proofErr w:type="spellStart"/>
+      <w:r>
+        <w:rPr>
+          <w:rFonts w:ascii="Courier New" w:eastAsia="Times New Roman" w:hAnsi="Courier New" w:cs="Courier New"/>
+          <w:sz w:val="20"/>
+          <w:szCs w:val="20"/>
+        </w:rPr>
+        <w:t>len</w:t>
+      </w:r>
+      <w:proofErr w:type="spellEnd"/>
+      <w:r>
+        <w:rPr>
+          <w:rFonts w:ascii="Courier New" w:eastAsia="Times New Roman" w:hAnsi="Courier New" w:cs="Courier New"/>
+          <w:sz w:val="20"/>
+          <w:szCs w:val="20"/>
+        </w:rPr>
+        <w:t>(</w:t>
+      </w:r>
+      <w:proofErr w:type="spellStart"/>
+      <w:r>
+        <w:rPr>
+          <w:rFonts w:ascii="Courier New" w:eastAsia="Times New Roman" w:hAnsi="Courier New" w:cs="Courier New"/>
+          <w:sz w:val="20"/>
+          <w:szCs w:val="20"/>
+        </w:rPr>
+        <w:t>num</w:t>
+      </w:r>
+      <w:proofErr w:type="spellEnd"/>
+      <w:r>
+        <w:rPr>
+          <w:rFonts w:ascii="Courier New" w:eastAsia="Times New Roman" w:hAnsi="Courier New" w:cs="Courier New"/>
+          <w:sz w:val="20"/>
+          <w:szCs w:val="20"/>
+        </w:rPr>
+        <w:t>) - 1</w:t>
+      </w:r>
+    </w:p>
+    <w:p>
+      <w:pPr>
+        <w:tabs>
+          <w:tab w:val="left" w:pos="916"/>
+          <w:tab w:val="left" w:pos="1832"/>
+          <w:tab w:val="left" w:pos="2748"/>
+          <w:tab w:val="left" w:pos="3664"/>
+          <w:tab w:val="left" w:pos="4580"/>
+          <w:tab w:val="left" w:pos="5496"/>
+          <w:tab w:val="left" w:pos="6412"/>
+          <w:tab w:val="left" w:pos="7328"/>
+          <w:tab w:val="left" w:pos="8244"/>
+          <w:tab w:val="left" w:pos="9160"/>
+          <w:tab w:val="left" w:pos="10076"/>
+          <w:tab w:val="left" w:pos="10992"/>
+          <w:tab w:val="left" w:pos="11908"/>
+          <w:tab w:val="left" w:pos="12824"/>
+          <w:tab w:val="left" w:pos="13740"/>
+          <w:tab w:val="left" w:pos="14656"/>
+        </w:tabs>
+        <w:spacing w:after="0" w:line="240" w:lineRule="auto"/>
+        <w:rPr>
+          <w:rFonts w:ascii="Courier New" w:eastAsia="Times New Roman" w:hAnsi="Courier New" w:cs="Courier New"/>
+          <w:sz w:val="20"/>
+          <w:szCs w:val="20"/>
+        </w:rPr>
+      </w:pPr>
+      <w:proofErr w:type="gramStart"/>
+      <w:r>
+        <w:rPr>
+          <w:rFonts w:ascii="Courier New" w:eastAsia="Times New Roman" w:hAnsi="Courier New" w:cs="Courier New"/>
+          <w:sz w:val="20"/>
+          <w:szCs w:val="20"/>
+        </w:rPr>
+        <w:t>left</w:t>
+      </w:r>
+      <w:proofErr w:type="gramEnd"/>
+      <w:r>
+        <w:rPr>
+          <w:rFonts w:ascii="Courier New" w:eastAsia="Times New Roman" w:hAnsi="Courier New" w:cs="Courier New"/>
+          <w:sz w:val="20"/>
+          <w:szCs w:val="20"/>
+        </w:rPr>
+        <w:t xml:space="preserve"> = 0</w:t>
+      </w:r>
+    </w:p>
+    <w:p>
+      <w:pPr>
+        <w:tabs>
+          <w:tab w:val="left" w:pos="916"/>
+          <w:tab w:val="left" w:pos="1832"/>
+          <w:tab w:val="left" w:pos="2748"/>
+          <w:tab w:val="left" w:pos="3664"/>
+          <w:tab w:val="left" w:pos="4580"/>
+          <w:tab w:val="left" w:pos="5496"/>
+          <w:tab w:val="left" w:pos="6412"/>
+          <w:tab w:val="left" w:pos="7328"/>
+          <w:tab w:val="left" w:pos="8244"/>
+          <w:tab w:val="left" w:pos="9160"/>
+          <w:tab w:val="left" w:pos="10076"/>
+          <w:tab w:val="left" w:pos="10992"/>
+          <w:tab w:val="left" w:pos="11908"/>
+          <w:tab w:val="left" w:pos="12824"/>
+          <w:tab w:val="left" w:pos="13740"/>
+          <w:tab w:val="left" w:pos="14656"/>
+        </w:tabs>
+        <w:spacing w:after="0" w:line="240" w:lineRule="auto"/>
+        <w:rPr>
+          <w:rFonts w:ascii="Courier New" w:eastAsia="Times New Roman" w:hAnsi="Courier New" w:cs="Courier New"/>
+          <w:sz w:val="20"/>
+          <w:szCs w:val="20"/>
+        </w:rPr>
+      </w:pPr>
+      <w:proofErr w:type="gramStart"/>
+      <w:r>
+        <w:rPr>
+          <w:rFonts w:ascii="Courier New" w:eastAsia="Times New Roman" w:hAnsi="Courier New" w:cs="Courier New"/>
+          <w:sz w:val="20"/>
+          <w:szCs w:val="20"/>
+        </w:rPr>
+        <w:t>right</w:t>
+      </w:r>
+      <w:proofErr w:type="gramEnd"/>
+      <w:r>
+        <w:rPr>
+          <w:rFonts w:ascii="Courier New" w:eastAsia="Times New Roman" w:hAnsi="Courier New" w:cs="Courier New"/>
+          <w:sz w:val="20"/>
+          <w:szCs w:val="20"/>
+        </w:rPr>
+        <w:t xml:space="preserve"> = </w:t>
+      </w:r>
+      <w:proofErr w:type="spellStart"/>
+      <w:r>
+        <w:rPr>
+          <w:rFonts w:ascii="Courier New" w:eastAsia="Times New Roman" w:hAnsi="Courier New" w:cs="Courier New"/>
+          <w:sz w:val="20"/>
+          <w:szCs w:val="20"/>
+        </w:rPr>
+        <w:t>len</w:t>
+      </w:r>
+      <w:proofErr w:type="spellEnd"/>
+      <w:r>
+        <w:rPr>
+          <w:rFonts w:ascii="Courier New" w:eastAsia="Times New Roman" w:hAnsi="Courier New" w:cs="Courier New"/>
+          <w:sz w:val="20"/>
+          <w:szCs w:val="20"/>
+        </w:rPr>
+        <w:t>(</w:t>
+      </w:r>
+      <w:proofErr w:type="spellStart"/>
+      <w:r>
+        <w:rPr>
+          <w:rFonts w:ascii="Courier New" w:eastAsia="Times New Roman" w:hAnsi="Courier New" w:cs="Courier New"/>
+          <w:sz w:val="20"/>
+          <w:szCs w:val="20"/>
+        </w:rPr>
+        <w:t>num</w:t>
+      </w:r>
+      <w:proofErr w:type="spellEnd"/>
+      <w:r>
+        <w:rPr>
+          <w:rFonts w:ascii="Courier New" w:eastAsia="Times New Roman" w:hAnsi="Courier New" w:cs="Courier New"/>
+          <w:sz w:val="20"/>
+          <w:szCs w:val="20"/>
+        </w:rPr>
+        <w:t>[0]) - 1</w:t>
+      </w:r>
+    </w:p>
+    <w:p>
+      <w:pPr>
+        <w:spacing w:before="100" w:beforeAutospacing="1" w:after="100" w:afterAutospacing="1" w:line="240" w:lineRule="auto"/>
+        <w:rPr>
+          <w:rFonts w:ascii="Times New Roman" w:eastAsia="Times New Roman" w:hAnsi="Times New Roman" w:cs="Times New Roman"/>
+          <w:sz w:val="24"/>
+          <w:szCs w:val="24"/>
+        </w:rPr>
+      </w:pPr>
+      <w:r>
+        <w:rPr>
+          <w:rFonts w:ascii="Times New Roman" w:eastAsia="Times New Roman" w:hAnsi="Times New Roman" w:cs="Times New Roman"/>
+          <w:sz w:val="24"/>
+          <w:szCs w:val="24"/>
+        </w:rPr>
+        <w:t xml:space="preserve">For the </w:t>
+      </w:r>
+      <w:r>
+        <w:rPr>
+          <w:rFonts w:ascii="Courier New" w:eastAsia="Times New Roman" w:hAnsi="Courier New" w:cs="Courier New"/>
+          <w:sz w:val="20"/>
+          <w:szCs w:val="20"/>
+        </w:rPr>
+        <w:t>3 x 3</w:t>
+      </w:r>
+      <w:r>
+        <w:rPr>
+          <w:rFonts w:ascii="Times New Roman" w:eastAsia="Times New Roman" w:hAnsi="Times New Roman" w:cs="Times New Roman"/>
+          <w:sz w:val="24"/>
+          <w:szCs w:val="24"/>
+        </w:rPr>
+        <w:t xml:space="preserve"> example, that gives:</w:t>
+      </w:r>
+    </w:p>
+    <w:p>
+      <w:pPr>
+        <w:tabs>
+          <w:tab w:val="left" w:pos="916"/>
+          <w:tab w:val="left" w:pos="1832"/>
+          <w:tab w:val="left" w:pos="2748"/>
+          <w:tab w:val="left" w:pos="3664"/>
+          <w:tab w:val="left" w:pos="4580"/>
+          <w:tab w:val="left" w:pos="5496"/>
+          <w:tab w:val="left" w:pos="6412"/>
+          <w:tab w:val="left" w:pos="7328"/>
+          <w:tab w:val="left" w:pos="8244"/>
+          <w:tab w:val="left" w:pos="9160"/>
+          <w:tab w:val="left" w:pos="10076"/>
+          <w:tab w:val="left" w:pos="10992"/>
+          <w:tab w:val="left" w:pos="11908"/>
+          <w:tab w:val="left" w:pos="12824"/>
+          <w:tab w:val="left" w:pos="13740"/>
+          <w:tab w:val="left" w:pos="14656"/>
+        </w:tabs>
+        <w:spacing w:after="0" w:line="240" w:lineRule="auto"/>
+        <w:rPr>
+          <w:rFonts w:ascii="Courier New" w:eastAsia="Times New Roman" w:hAnsi="Courier New" w:cs="Courier New"/>
+          <w:sz w:val="20"/>
+          <w:szCs w:val="20"/>
+        </w:rPr>
+      </w:pPr>
+      <w:proofErr w:type="gramStart"/>
+      <w:r>
+        <w:rPr>
+          <w:rFonts w:ascii="Courier New" w:eastAsia="Times New Roman" w:hAnsi="Courier New" w:cs="Courier New"/>
+          <w:sz w:val="20"/>
+          <w:szCs w:val="20"/>
+        </w:rPr>
+        <w:t>top</w:t>
+      </w:r>
+      <w:proofErr w:type="gramEnd"/>
+      <w:r>
+        <w:rPr>
+          <w:rFonts w:ascii="Courier New" w:eastAsia="Times New Roman" w:hAnsi="Courier New" w:cs="Courier New"/>
+          <w:sz w:val="20"/>
+          <w:szCs w:val="20"/>
+        </w:rPr>
+        <w:t xml:space="preserve"> = 0</w:t>
+      </w:r>
+    </w:p>
+    <w:p>
+      <w:pPr>
+        <w:tabs>
+          <w:tab w:val="left" w:pos="916"/>
+          <w:tab w:val="left" w:pos="1832"/>
+          <w:tab w:val="left" w:pos="2748"/>
+          <w:tab w:val="left" w:pos="3664"/>
+          <w:tab w:val="left" w:pos="4580"/>
+          <w:tab w:val="left" w:pos="5496"/>
+          <w:tab w:val="left" w:pos="6412"/>
+          <w:tab w:val="left" w:pos="7328"/>
+          <w:tab w:val="left" w:pos="8244"/>
+          <w:tab w:val="left" w:pos="9160"/>
+          <w:tab w:val="left" w:pos="10076"/>
+          <w:tab w:val="left" w:pos="10992"/>
+          <w:tab w:val="left" w:pos="11908"/>
+          <w:tab w:val="left" w:pos="12824"/>
+          <w:tab w:val="left" w:pos="13740"/>
+          <w:tab w:val="left" w:pos="14656"/>
+        </w:tabs>
+        <w:spacing w:after="0" w:line="240" w:lineRule="auto"/>
+        <w:rPr>
+          <w:rFonts w:ascii="Courier New" w:eastAsia="Times New Roman" w:hAnsi="Courier New" w:cs="Courier New"/>
+          <w:sz w:val="20"/>
+          <w:szCs w:val="20"/>
+        </w:rPr>
+      </w:pPr>
+      <w:proofErr w:type="gramStart"/>
+      <w:r>
+        <w:rPr>
+          <w:rFonts w:ascii="Courier New" w:eastAsia="Times New Roman" w:hAnsi="Courier New" w:cs="Courier New"/>
+          <w:sz w:val="20"/>
+          <w:szCs w:val="20"/>
+        </w:rPr>
+        <w:t>bottom</w:t>
+      </w:r>
+      <w:proofErr w:type="gramEnd"/>
+      <w:r>
+        <w:rPr>
+          <w:rFonts w:ascii="Courier New" w:eastAsia="Times New Roman" w:hAnsi="Courier New" w:cs="Courier New"/>
+          <w:sz w:val="20"/>
+          <w:szCs w:val="20"/>
+        </w:rPr>
+        <w:t xml:space="preserve"> = 2</w:t>
+      </w:r>
+    </w:p>
+    <w:p>
+      <w:pPr>
+        <w:tabs>
+          <w:tab w:val="left" w:pos="916"/>
+          <w:tab w:val="left" w:pos="1832"/>
+          <w:tab w:val="left" w:pos="2748"/>
+          <w:tab w:val="left" w:pos="3664"/>
+          <w:tab w:val="left" w:pos="4580"/>
+          <w:tab w:val="left" w:pos="5496"/>
+          <w:tab w:val="left" w:pos="6412"/>
+          <w:tab w:val="left" w:pos="7328"/>
+          <w:tab w:val="left" w:pos="8244"/>
+          <w:tab w:val="left" w:pos="9160"/>
+          <w:tab w:val="left" w:pos="10076"/>
+          <w:tab w:val="left" w:pos="10992"/>
+          <w:tab w:val="left" w:pos="11908"/>
+          <w:tab w:val="left" w:pos="12824"/>
+          <w:tab w:val="left" w:pos="13740"/>
+          <w:tab w:val="left" w:pos="14656"/>
+        </w:tabs>
+        <w:spacing w:after="0" w:line="240" w:lineRule="auto"/>
+        <w:rPr>
+          <w:rFonts w:ascii="Courier New" w:eastAsia="Times New Roman" w:hAnsi="Courier New" w:cs="Courier New"/>
+          <w:sz w:val="20"/>
+          <w:szCs w:val="20"/>
+        </w:rPr>
+      </w:pPr>
+      <w:proofErr w:type="gramStart"/>
+      <w:r>
+        <w:rPr>
+          <w:rFonts w:ascii="Courier New" w:eastAsia="Times New Roman" w:hAnsi="Courier New" w:cs="Courier New"/>
+          <w:sz w:val="20"/>
+          <w:szCs w:val="20"/>
+        </w:rPr>
+        <w:t>left</w:t>
+      </w:r>
+      <w:proofErr w:type="gramEnd"/>
+      <w:r>
+        <w:rPr>
+          <w:rFonts w:ascii="Courier New" w:eastAsia="Times New Roman" w:hAnsi="Courier New" w:cs="Courier New"/>
+          <w:sz w:val="20"/>
+          <w:szCs w:val="20"/>
+        </w:rPr>
+        <w:t xml:space="preserve"> = 0</w:t>
+      </w:r>
+    </w:p>
+    <w:p>
+      <w:pPr>
+        <w:tabs>
+          <w:tab w:val="left" w:pos="916"/>
+          <w:tab w:val="left" w:pos="1832"/>
+          <w:tab w:val="left" w:pos="2748"/>
+          <w:tab w:val="left" w:pos="3664"/>
+          <w:tab w:val="left" w:pos="4580"/>
+          <w:tab w:val="left" w:pos="5496"/>
+          <w:tab w:val="left" w:pos="6412"/>
+          <w:tab w:val="left" w:pos="7328"/>
+          <w:tab w:val="left" w:pos="8244"/>
+          <w:tab w:val="left" w:pos="9160"/>
+          <w:tab w:val="left" w:pos="10076"/>
+          <w:tab w:val="left" w:pos="10992"/>
+          <w:tab w:val="left" w:pos="11908"/>
+          <w:tab w:val="left" w:pos="12824"/>
+          <w:tab w:val="left" w:pos="13740"/>
+          <w:tab w:val="left" w:pos="14656"/>
+        </w:tabs>
+        <w:spacing w:after="0" w:line="240" w:lineRule="auto"/>
+        <w:rPr>
+          <w:rFonts w:ascii="Courier New" w:eastAsia="Times New Roman" w:hAnsi="Courier New" w:cs="Courier New"/>
+          <w:sz w:val="20"/>
+          <w:szCs w:val="20"/>
+        </w:rPr>
+      </w:pPr>
+      <w:proofErr w:type="gramStart"/>
+      <w:r>
+        <w:rPr>
+          <w:rFonts w:ascii="Courier New" w:eastAsia="Times New Roman" w:hAnsi="Courier New" w:cs="Courier New"/>
+          <w:sz w:val="20"/>
+          <w:szCs w:val="20"/>
+        </w:rPr>
+        <w:t>right</w:t>
+      </w:r>
+      <w:proofErr w:type="gramEnd"/>
+      <w:r>
+        <w:rPr>
+          <w:rFonts w:ascii="Courier New" w:eastAsia="Times New Roman" w:hAnsi="Courier New" w:cs="Courier New"/>
+          <w:sz w:val="20"/>
+          <w:szCs w:val="20"/>
+        </w:rPr>
+        <w:t xml:space="preserve"> = 2</w:t>
+      </w:r>
+    </w:p>
+    <w:p>
+      <w:pPr>
+        <w:spacing w:before="100" w:beforeAutospacing="1" w:after="100" w:afterAutospacing="1" w:line="240" w:lineRule="auto"/>
+        <w:rPr>
+          <w:rFonts w:ascii="Times New Roman" w:eastAsia="Times New Roman" w:hAnsi="Times New Roman" w:cs="Times New Roman"/>
+          <w:sz w:val="24"/>
+          <w:szCs w:val="24"/>
+        </w:rPr>
+      </w:pPr>
+      <w:r>
+        <w:rPr>
+          <w:rFonts w:ascii="Times New Roman" w:eastAsia="Times New Roman" w:hAnsi="Times New Roman" w:cs="Times New Roman"/>
+          <w:sz w:val="24"/>
+          <w:szCs w:val="24"/>
+        </w:rPr>
+        <w:t>Visually:</w:t>
+      </w:r>
+    </w:p>
+    <w:p>
+      <w:pPr>
+        <w:tabs>
+          <w:tab w:val="left" w:pos="916"/>
+          <w:tab w:val="left" w:pos="1832"/>
+          <w:tab w:val="left" w:pos="2748"/>
+          <w:tab w:val="left" w:pos="3664"/>
+          <w:tab w:val="left" w:pos="4580"/>
+          <w:tab w:val="left" w:pos="5496"/>
+          <w:tab w:val="left" w:pos="6412"/>
+          <w:tab w:val="left" w:pos="7328"/>
+          <w:tab w:val="left" w:pos="8244"/>
+          <w:tab w:val="left" w:pos="9160"/>
+          <w:tab w:val="left" w:pos="10076"/>
+          <w:tab w:val="left" w:pos="10992"/>
+          <w:tab w:val="left" w:pos="11908"/>
+          <w:tab w:val="left" w:pos="12824"/>
+          <w:tab w:val="left" w:pos="13740"/>
+          <w:tab w:val="left" w:pos="14656"/>
+        </w:tabs>
+        <w:spacing w:after="0" w:line="240" w:lineRule="auto"/>
+        <w:rPr>
+          <w:rFonts w:ascii="Courier New" w:eastAsia="Times New Roman" w:hAnsi="Courier New" w:cs="Courier New"/>
+          <w:sz w:val="20"/>
+          <w:szCs w:val="20"/>
+        </w:rPr>
+      </w:pPr>
+      <w:r>
+        <w:rPr>
+          <w:rFonts w:ascii="Courier New" w:eastAsia="Times New Roman" w:hAnsi="Courier New" w:cs="Courier New"/>
+          <w:sz w:val="20"/>
+          <w:szCs w:val="20"/>
+        </w:rPr>
+        <w:t xml:space="preserve">        </w:t>
+      </w:r>
+      <w:proofErr w:type="gramStart"/>
+      <w:r>
+        <w:rPr>
+          <w:rFonts w:ascii="Courier New" w:eastAsia="Times New Roman" w:hAnsi="Courier New" w:cs="Courier New"/>
+          <w:sz w:val="20"/>
+          <w:szCs w:val="20"/>
+        </w:rPr>
+        <w:t>top</w:t>
+      </w:r>
+      <w:proofErr w:type="gramEnd"/>
+      <w:r>
+        <w:rPr>
+          <w:rFonts w:ascii="Courier New" w:eastAsia="Times New Roman" w:hAnsi="Courier New" w:cs="Courier New"/>
+          <w:sz w:val="20"/>
+          <w:szCs w:val="20"/>
+        </w:rPr>
+        <w:t xml:space="preserve"> = 0</w:t>
+      </w:r>
+    </w:p>
+    <w:p>
+      <w:pPr>
+        <w:tabs>
+          <w:tab w:val="left" w:pos="916"/>
+          <w:tab w:val="left" w:pos="1832"/>
+          <w:tab w:val="left" w:pos="2748"/>
+          <w:tab w:val="left" w:pos="3664"/>
+          <w:tab w:val="left" w:pos="4580"/>
+          <w:tab w:val="left" w:pos="5496"/>
+          <w:tab w:val="left" w:pos="6412"/>
+          <w:tab w:val="left" w:pos="7328"/>
+          <w:tab w:val="left" w:pos="8244"/>
+          <w:tab w:val="left" w:pos="9160"/>
+          <w:tab w:val="left" w:pos="10076"/>
+          <w:tab w:val="left" w:pos="10992"/>
+          <w:tab w:val="left" w:pos="11908"/>
+          <w:tab w:val="left" w:pos="12824"/>
+          <w:tab w:val="left" w:pos="13740"/>
+          <w:tab w:val="left" w:pos="14656"/>
+        </w:tabs>
+        <w:spacing w:after="0" w:line="240" w:lineRule="auto"/>
+        <w:rPr>
+          <w:rFonts w:ascii="Courier New" w:eastAsia="Times New Roman" w:hAnsi="Courier New" w:cs="Courier New"/>
+          <w:sz w:val="20"/>
+          <w:szCs w:val="20"/>
+        </w:rPr>
+      </w:pPr>
+      <w:r>
+        <w:rPr>
+          <w:rFonts w:ascii="Courier New" w:eastAsia="Times New Roman" w:hAnsi="Courier New" w:cs="Courier New"/>
+          <w:sz w:val="20"/>
+          <w:szCs w:val="20"/>
+        </w:rPr>
+        <w:t xml:space="preserve">          ↓</w:t>
+      </w:r>
+    </w:p>
+    <w:p>
+      <w:pPr>
+        <w:tabs>
+          <w:tab w:val="left" w:pos="916"/>
+          <w:tab w:val="left" w:pos="1832"/>
+          <w:tab w:val="left" w:pos="2748"/>
+          <w:tab w:val="left" w:pos="3664"/>
+          <w:tab w:val="left" w:pos="4580"/>
+          <w:tab w:val="left" w:pos="5496"/>
+          <w:tab w:val="left" w:pos="6412"/>
+          <w:tab w:val="left" w:pos="7328"/>
+          <w:tab w:val="left" w:pos="8244"/>
+          <w:tab w:val="left" w:pos="9160"/>
+          <w:tab w:val="left" w:pos="10076"/>
+          <w:tab w:val="left" w:pos="10992"/>
+          <w:tab w:val="left" w:pos="11908"/>
+          <w:tab w:val="left" w:pos="12824"/>
+          <w:tab w:val="left" w:pos="13740"/>
+          <w:tab w:val="left" w:pos="14656"/>
+        </w:tabs>
+        <w:spacing w:after="0" w:line="240" w:lineRule="auto"/>
+        <w:rPr>
+          <w:rFonts w:ascii="Courier New" w:eastAsia="Times New Roman" w:hAnsi="Courier New" w:cs="Courier New"/>
+          <w:sz w:val="20"/>
+          <w:szCs w:val="20"/>
+        </w:rPr>
+      </w:pPr>
+      <w:proofErr w:type="gramStart"/>
+      <w:r>
+        <w:rPr>
+          <w:rFonts w:ascii="Courier New" w:eastAsia="Times New Roman" w:hAnsi="Courier New" w:cs="Courier New"/>
+          <w:sz w:val="20"/>
+          <w:szCs w:val="20"/>
+        </w:rPr>
+        <w:t>left</w:t>
+      </w:r>
+      <w:proofErr w:type="gramEnd"/>
+      <w:r>
+        <w:rPr>
+          <w:rFonts w:ascii="Courier New" w:eastAsia="Times New Roman" w:hAnsi="Courier New" w:cs="Courier New"/>
+          <w:sz w:val="20"/>
+          <w:szCs w:val="20"/>
+        </w:rPr>
+        <w:t xml:space="preserve"> →  1 2 3  ← right</w:t>
+      </w:r>
+    </w:p>
+    <w:p>
+      <w:pPr>
+        <w:tabs>
+          <w:tab w:val="left" w:pos="916"/>
+          <w:tab w:val="left" w:pos="1832"/>
+          <w:tab w:val="left" w:pos="2748"/>
+          <w:tab w:val="left" w:pos="3664"/>
+          <w:tab w:val="left" w:pos="4580"/>
+          <w:tab w:val="left" w:pos="5496"/>
+          <w:tab w:val="left" w:pos="6412"/>
+          <w:tab w:val="left" w:pos="7328"/>
+          <w:tab w:val="left" w:pos="8244"/>
+          <w:tab w:val="left" w:pos="9160"/>
+          <w:tab w:val="left" w:pos="10076"/>
+          <w:tab w:val="left" w:pos="10992"/>
+          <w:tab w:val="left" w:pos="11908"/>
+          <w:tab w:val="left" w:pos="12824"/>
+          <w:tab w:val="left" w:pos="13740"/>
+          <w:tab w:val="left" w:pos="14656"/>
+        </w:tabs>
+        <w:spacing w:after="0" w:line="240" w:lineRule="auto"/>
+        <w:rPr>
+          <w:rFonts w:ascii="Courier New" w:eastAsia="Times New Roman" w:hAnsi="Courier New" w:cs="Courier New"/>
+          <w:sz w:val="20"/>
+          <w:szCs w:val="20"/>
+        </w:rPr>
+      </w:pPr>
+      <w:r>
+        <w:rPr>
+          <w:rFonts w:ascii="Courier New" w:eastAsia="Times New Roman" w:hAnsi="Courier New" w:cs="Courier New"/>
+          <w:sz w:val="20"/>
+          <w:szCs w:val="20"/>
+        </w:rPr>
+        <w:t xml:space="preserve">        4 5 6</w:t>
+      </w:r>
+    </w:p>
+    <w:p>
+      <w:pPr>
+        <w:tabs>
+          <w:tab w:val="left" w:pos="916"/>
+          <w:tab w:val="left" w:pos="1832"/>
+          <w:tab w:val="left" w:pos="2748"/>
+          <w:tab w:val="left" w:pos="3664"/>
+          <w:tab w:val="left" w:pos="4580"/>
+          <w:tab w:val="left" w:pos="5496"/>
+          <w:tab w:val="left" w:pos="6412"/>
+          <w:tab w:val="left" w:pos="7328"/>
+          <w:tab w:val="left" w:pos="8244"/>
+          <w:tab w:val="left" w:pos="9160"/>
+          <w:tab w:val="left" w:pos="10076"/>
+          <w:tab w:val="left" w:pos="10992"/>
+          <w:tab w:val="left" w:pos="11908"/>
+          <w:tab w:val="left" w:pos="12824"/>
+          <w:tab w:val="left" w:pos="13740"/>
+          <w:tab w:val="left" w:pos="14656"/>
+        </w:tabs>
+        <w:spacing w:after="0" w:line="240" w:lineRule="auto"/>
+        <w:rPr>
+          <w:rFonts w:ascii="Courier New" w:eastAsia="Times New Roman" w:hAnsi="Courier New" w:cs="Courier New"/>
+          <w:sz w:val="20"/>
+          <w:szCs w:val="20"/>
+        </w:rPr>
+      </w:pPr>
+      <w:r>
+        <w:rPr>
+          <w:rFonts w:ascii="Courier New" w:eastAsia="Times New Roman" w:hAnsi="Courier New" w:cs="Courier New"/>
+          <w:sz w:val="20"/>
+          <w:szCs w:val="20"/>
+        </w:rPr>
+        <w:t xml:space="preserve">        7 8 9</w:t>
+      </w:r>
+    </w:p>
+    <w:p>
+      <w:pPr>
+        <w:tabs>
+          <w:tab w:val="left" w:pos="916"/>
+          <w:tab w:val="left" w:pos="1832"/>
+          <w:tab w:val="left" w:pos="2748"/>
+          <w:tab w:val="left" w:pos="3664"/>
+          <w:tab w:val="left" w:pos="4580"/>
+          <w:tab w:val="left" w:pos="5496"/>
+          <w:tab w:val="left" w:pos="6412"/>
+          <w:tab w:val="left" w:pos="7328"/>
+          <w:tab w:val="left" w:pos="8244"/>
+          <w:tab w:val="left" w:pos="9160"/>
+          <w:tab w:val="left" w:pos="10076"/>
+          <w:tab w:val="left" w:pos="10992"/>
+          <w:tab w:val="left" w:pos="11908"/>
+          <w:tab w:val="left" w:pos="12824"/>
+          <w:tab w:val="left" w:pos="13740"/>
+          <w:tab w:val="left" w:pos="14656"/>
+        </w:tabs>
+        <w:spacing w:after="0" w:line="240" w:lineRule="auto"/>
+        <w:rPr>
+          <w:rFonts w:ascii="Courier New" w:eastAsia="Times New Roman" w:hAnsi="Courier New" w:cs="Courier New"/>
+          <w:sz w:val="20"/>
+          <w:szCs w:val="20"/>
+        </w:rPr>
+      </w:pPr>
+      <w:r>
+        <w:rPr>
+          <w:rFonts w:ascii="Courier New" w:eastAsia="Times New Roman" w:hAnsi="Courier New" w:cs="Courier New"/>
+          <w:sz w:val="20"/>
+          <w:szCs w:val="20"/>
+        </w:rPr>
+        <w:t xml:space="preserve">          ↑</w:t>
+      </w:r>
+    </w:p>
+    <w:p>
+      <w:pPr>
+        <w:tabs>
+          <w:tab w:val="left" w:pos="916"/>
+          <w:tab w:val="left" w:pos="1832"/>
+          <w:tab w:val="left" w:pos="2748"/>
+          <w:tab w:val="left" w:pos="3664"/>
+          <w:tab w:val="left" w:pos="4580"/>
+          <w:tab w:val="left" w:pos="5496"/>
+          <w:tab w:val="left" w:pos="6412"/>
+          <w:tab w:val="left" w:pos="7328"/>
+          <w:tab w:val="left" w:pos="8244"/>
+          <w:tab w:val="left" w:pos="9160"/>
+          <w:tab w:val="left" w:pos="10076"/>
+          <w:tab w:val="left" w:pos="10992"/>
+          <w:tab w:val="left" w:pos="11908"/>
+          <w:tab w:val="left" w:pos="12824"/>
+          <w:tab w:val="left" w:pos="13740"/>
+          <w:tab w:val="left" w:pos="14656"/>
+        </w:tabs>
+        <w:spacing w:after="0" w:line="240" w:lineRule="auto"/>
+        <w:rPr>
+          <w:rFonts w:ascii="Courier New" w:eastAsia="Times New Roman" w:hAnsi="Courier New" w:cs="Courier New"/>
+          <w:sz w:val="20"/>
+          <w:szCs w:val="20"/>
+        </w:rPr>
+      </w:pPr>
+      <w:r>
+        <w:rPr>
+          <w:rFonts w:ascii="Courier New" w:eastAsia="Times New Roman" w:hAnsi="Courier New" w:cs="Courier New"/>
+          <w:sz w:val="20"/>
+          <w:szCs w:val="20"/>
+        </w:rPr>
+        <w:t xml:space="preserve">      </w:t>
+      </w:r>
+      <w:proofErr w:type="gramStart"/>
+      <w:r>
+        <w:rPr>
+          <w:rFonts w:ascii="Courier New" w:eastAsia="Times New Roman" w:hAnsi="Courier New" w:cs="Courier New"/>
+          <w:sz w:val="20"/>
+          <w:szCs w:val="20"/>
+        </w:rPr>
+        <w:t>bottom</w:t>
+      </w:r>
+      <w:proofErr w:type="gramEnd"/>
+      <w:r>
+        <w:rPr>
+          <w:rFonts w:ascii="Courier New" w:eastAsia="Times New Roman" w:hAnsi="Courier New" w:cs="Courier New"/>
+          <w:sz w:val="20"/>
+          <w:szCs w:val="20"/>
+        </w:rPr>
+        <w:t xml:space="preserve"> = 2</w:t>
+      </w:r>
+    </w:p>
+    <w:p>
+      <w:pPr>
+        <w:spacing w:before="100" w:beforeAutospacing="1" w:after="100" w:afterAutospacing="1" w:line="240" w:lineRule="auto"/>
+        <w:rPr>
+          <w:rFonts w:ascii="Times New Roman" w:eastAsia="Times New Roman" w:hAnsi="Times New Roman" w:cs="Times New Roman"/>
+          <w:sz w:val="24"/>
+          <w:szCs w:val="24"/>
+        </w:rPr>
+      </w:pPr>
+      <w:r>
+        <w:rPr>
+          <w:rFonts w:ascii="Times New Roman" w:eastAsia="Times New Roman" w:hAnsi="Times New Roman" w:cs="Times New Roman"/>
+          <w:sz w:val="24"/>
+          <w:szCs w:val="24"/>
+        </w:rPr>
+        <w:t>Do only this first.</w:t>
+      </w:r>
+    </w:p>
+    <w:p>
+      <w:pPr>
+        <w:spacing w:before="100" w:beforeAutospacing="1" w:after="100" w:afterAutospacing="1" w:line="240" w:lineRule="auto"/>
+        <w:rPr>
+          <w:rFonts w:ascii="Times New Roman" w:eastAsia="Times New Roman" w:hAnsi="Times New Roman" w:cs="Times New Roman"/>
+          <w:sz w:val="24"/>
+          <w:szCs w:val="24"/>
+        </w:rPr>
+      </w:pPr>
+      <w:r>
+        <w:rPr>
+          <w:rFonts w:ascii="Times New Roman" w:eastAsia="Times New Roman" w:hAnsi="Times New Roman" w:cs="Times New Roman"/>
+          <w:sz w:val="24"/>
+          <w:szCs w:val="24"/>
+        </w:rPr>
+        <w:t xml:space="preserve">Your </w:t>
+      </w:r>
+      <w:r>
+        <w:rPr>
+          <w:rFonts w:ascii="Times New Roman" w:eastAsia="Times New Roman" w:hAnsi="Times New Roman" w:cs="Times New Roman"/>
+          <w:b/>
+          <w:bCs/>
+          <w:sz w:val="24"/>
+          <w:szCs w:val="24"/>
+        </w:rPr>
+        <w:t>outer layer is now correct</w:t>
+      </w:r>
+      <w:r>
+        <w:rPr>
+          <w:rFonts w:ascii="Times New Roman" w:eastAsia="Times New Roman" w:hAnsi="Times New Roman" w:cs="Times New Roman"/>
+          <w:sz w:val="24"/>
+          <w:szCs w:val="24"/>
+        </w:rPr>
+        <w:t xml:space="preserve"> for the 3×3 example. It prints:</w:t>
+      </w:r>
+    </w:p>
+    <w:p>
+      <w:pPr>
+        <w:tabs>
+          <w:tab w:val="left" w:pos="916"/>
+          <w:tab w:val="left" w:pos="1832"/>
+          <w:tab w:val="left" w:pos="2748"/>
+          <w:tab w:val="left" w:pos="3664"/>
+          <w:tab w:val="left" w:pos="4580"/>
+          <w:tab w:val="left" w:pos="5496"/>
+          <w:tab w:val="left" w:pos="6412"/>
+          <w:tab w:val="left" w:pos="7328"/>
+          <w:tab w:val="left" w:pos="8244"/>
+          <w:tab w:val="left" w:pos="9160"/>
+          <w:tab w:val="left" w:pos="10076"/>
+          <w:tab w:val="left" w:pos="10992"/>
+          <w:tab w:val="left" w:pos="11908"/>
+          <w:tab w:val="left" w:pos="12824"/>
+          <w:tab w:val="left" w:pos="13740"/>
+          <w:tab w:val="left" w:pos="14656"/>
+        </w:tabs>
+        <w:spacing w:after="0" w:line="240" w:lineRule="auto"/>
+        <w:rPr>
+          <w:rFonts w:ascii="Courier New" w:eastAsia="Times New Roman" w:hAnsi="Courier New" w:cs="Courier New"/>
+          <w:sz w:val="20"/>
+          <w:szCs w:val="20"/>
+        </w:rPr>
+      </w:pPr>
+      <w:r>
+        <w:rPr>
+          <w:rFonts w:ascii="Courier New" w:eastAsia="Times New Roman" w:hAnsi="Courier New" w:cs="Courier New"/>
+          <w:sz w:val="20"/>
+          <w:szCs w:val="20"/>
+        </w:rPr>
+        <w:t>1 2 3 6 9 8 7 4</w:t>
+      </w:r>
+    </w:p>
+    <w:p>
+      <w:pPr>
+        <w:spacing w:before="100" w:beforeAutospacing="1" w:after="100" w:afterAutospacing="1" w:line="240" w:lineRule="auto"/>
+        <w:rPr>
+          <w:rFonts w:ascii="Times New Roman" w:eastAsia="Times New Roman" w:hAnsi="Times New Roman" w:cs="Times New Roman"/>
+          <w:sz w:val="24"/>
+          <w:szCs w:val="24"/>
+        </w:rPr>
+      </w:pPr>
+      <w:r>
+        <w:rPr>
+          <w:rFonts w:ascii="Times New Roman" w:eastAsia="Times New Roman" w:hAnsi="Times New Roman" w:cs="Times New Roman"/>
+          <w:sz w:val="24"/>
+          <w:szCs w:val="24"/>
+        </w:rPr>
+        <w:t xml:space="preserve">Only </w:t>
+      </w:r>
+      <w:proofErr w:type="gramStart"/>
+      <w:r>
+        <w:rPr>
+          <w:rFonts w:ascii="Courier New" w:eastAsia="Times New Roman" w:hAnsi="Courier New" w:cs="Courier New"/>
+          <w:sz w:val="20"/>
+          <w:szCs w:val="20"/>
+        </w:rPr>
+        <w:t>5</w:t>
+      </w:r>
+      <w:proofErr w:type="gramEnd"/>
+      <w:r>
+        <w:rPr>
+          <w:rFonts w:ascii="Times New Roman" w:eastAsia="Times New Roman" w:hAnsi="Times New Roman" w:cs="Times New Roman"/>
+          <w:sz w:val="24"/>
+          <w:szCs w:val="24"/>
+        </w:rPr>
+        <w:t xml:space="preserve"> is left.</w:t>
+      </w:r>
+    </w:p>
+    <w:p>
+      <w:pPr>
+        <w:spacing w:before="100" w:beforeAutospacing="1" w:after="100" w:afterAutospacing="1" w:line="240" w:lineRule="auto"/>
+        <w:rPr>
+          <w:rFonts w:ascii="Times New Roman" w:eastAsia="Times New Roman" w:hAnsi="Times New Roman" w:cs="Times New Roman"/>
+          <w:sz w:val="24"/>
+          <w:szCs w:val="24"/>
+        </w:rPr>
+      </w:pPr>
+      <w:r>
+        <w:rPr>
+          <w:rFonts w:ascii="Times New Roman" w:eastAsia="Times New Roman" w:hAnsi="Times New Roman" w:cs="Times New Roman"/>
+          <w:sz w:val="24"/>
+          <w:szCs w:val="24"/>
+        </w:rPr>
+        <w:t>One small improvement first: instead of</w:t>
+      </w:r>
+    </w:p>
+    <w:p>
+      <w:pPr>
+        <w:tabs>
+          <w:tab w:val="left" w:pos="916"/>
+          <w:tab w:val="left" w:pos="1832"/>
+          <w:tab w:val="left" w:pos="2748"/>
+          <w:tab w:val="left" w:pos="3664"/>
+          <w:tab w:val="left" w:pos="4580"/>
+          <w:tab w:val="left" w:pos="5496"/>
+          <w:tab w:val="left" w:pos="6412"/>
+          <w:tab w:val="left" w:pos="7328"/>
+          <w:tab w:val="left" w:pos="8244"/>
+          <w:tab w:val="left" w:pos="9160"/>
+          <w:tab w:val="left" w:pos="10076"/>
+          <w:tab w:val="left" w:pos="10992"/>
+          <w:tab w:val="left" w:pos="11908"/>
+          <w:tab w:val="left" w:pos="12824"/>
+          <w:tab w:val="left" w:pos="13740"/>
+          <w:tab w:val="left" w:pos="14656"/>
+        </w:tabs>
+        <w:spacing w:after="0" w:line="240" w:lineRule="auto"/>
+        <w:rPr>
+          <w:rFonts w:ascii="Courier New" w:eastAsia="Times New Roman" w:hAnsi="Courier New" w:cs="Courier New"/>
+          <w:sz w:val="20"/>
+          <w:szCs w:val="20"/>
+        </w:rPr>
+      </w:pPr>
+      <w:proofErr w:type="gramStart"/>
+      <w:r>
+        <w:rPr>
+          <w:rFonts w:ascii="Courier New" w:eastAsia="Times New Roman" w:hAnsi="Courier New" w:cs="Courier New"/>
+          <w:sz w:val="20"/>
+          <w:szCs w:val="20"/>
+        </w:rPr>
+        <w:t>row</w:t>
+      </w:r>
+      <w:proofErr w:type="gramEnd"/>
+      <w:r>
+        <w:rPr>
+          <w:rFonts w:ascii="Courier New" w:eastAsia="Times New Roman" w:hAnsi="Courier New" w:cs="Courier New"/>
+          <w:sz w:val="20"/>
+          <w:szCs w:val="20"/>
+        </w:rPr>
+        <w:t xml:space="preserve"> = </w:t>
+      </w:r>
+      <w:proofErr w:type="spellStart"/>
+      <w:r>
+        <w:rPr>
+          <w:rFonts w:ascii="Courier New" w:eastAsia="Times New Roman" w:hAnsi="Courier New" w:cs="Courier New"/>
+          <w:sz w:val="20"/>
+          <w:szCs w:val="20"/>
+        </w:rPr>
+        <w:t>len</w:t>
+      </w:r>
+      <w:proofErr w:type="spellEnd"/>
+      <w:r>
+        <w:rPr>
+          <w:rFonts w:ascii="Courier New" w:eastAsia="Times New Roman" w:hAnsi="Courier New" w:cs="Courier New"/>
+          <w:sz w:val="20"/>
+          <w:szCs w:val="20"/>
+        </w:rPr>
+        <w:t>(</w:t>
+      </w:r>
+      <w:proofErr w:type="spellStart"/>
+      <w:r>
+        <w:rPr>
+          <w:rFonts w:ascii="Courier New" w:eastAsia="Times New Roman" w:hAnsi="Courier New" w:cs="Courier New"/>
+          <w:sz w:val="20"/>
+          <w:szCs w:val="20"/>
+        </w:rPr>
+        <w:t>num</w:t>
+      </w:r>
+      <w:proofErr w:type="spellEnd"/>
+      <w:r>
+        <w:rPr>
+          <w:rFonts w:ascii="Courier New" w:eastAsia="Times New Roman" w:hAnsi="Courier New" w:cs="Courier New"/>
+          <w:sz w:val="20"/>
+          <w:szCs w:val="20"/>
+        </w:rPr>
+        <w:t>) - 2</w:t>
+      </w:r>
+    </w:p>
+    <w:p>
+      <w:pPr>
+        <w:spacing w:before="100" w:beforeAutospacing="1" w:after="100" w:afterAutospacing="1" w:line="240" w:lineRule="auto"/>
+        <w:rPr>
+          <w:rFonts w:ascii="Times New Roman" w:eastAsia="Times New Roman" w:hAnsi="Times New Roman" w:cs="Times New Roman"/>
+          <w:sz w:val="24"/>
+          <w:szCs w:val="24"/>
+        </w:rPr>
+      </w:pPr>
+      <w:proofErr w:type="gramStart"/>
+      <w:r>
+        <w:rPr>
+          <w:rFonts w:ascii="Times New Roman" w:eastAsia="Times New Roman" w:hAnsi="Times New Roman" w:cs="Times New Roman"/>
+          <w:sz w:val="24"/>
+          <w:szCs w:val="24"/>
+        </w:rPr>
+        <w:t>use</w:t>
+      </w:r>
+      <w:proofErr w:type="gramEnd"/>
+      <w:r>
+        <w:rPr>
+          <w:rFonts w:ascii="Times New Roman" w:eastAsia="Times New Roman" w:hAnsi="Times New Roman" w:cs="Times New Roman"/>
+          <w:sz w:val="24"/>
+          <w:szCs w:val="24"/>
+        </w:rPr>
+        <w:t>:</w:t>
+      </w:r>
+    </w:p>
+    <w:p>
+      <w:pPr>
+        <w:tabs>
+          <w:tab w:val="left" w:pos="916"/>
+          <w:tab w:val="left" w:pos="1832"/>
+          <w:tab w:val="left" w:pos="2748"/>
+          <w:tab w:val="left" w:pos="3664"/>
+          <w:tab w:val="left" w:pos="4580"/>
+          <w:tab w:val="left" w:pos="5496"/>
+          <w:tab w:val="left" w:pos="6412"/>
+          <w:tab w:val="left" w:pos="7328"/>
+          <w:tab w:val="left" w:pos="8244"/>
+          <w:tab w:val="left" w:pos="9160"/>
+          <w:tab w:val="left" w:pos="10076"/>
+          <w:tab w:val="left" w:pos="10992"/>
+          <w:tab w:val="left" w:pos="11908"/>
+          <w:tab w:val="left" w:pos="12824"/>
+          <w:tab w:val="left" w:pos="13740"/>
+          <w:tab w:val="left" w:pos="14656"/>
+        </w:tabs>
+        <w:spacing w:after="0" w:line="240" w:lineRule="auto"/>
+        <w:rPr>
+          <w:rFonts w:ascii="Courier New" w:eastAsia="Times New Roman" w:hAnsi="Courier New" w:cs="Courier New"/>
+          <w:sz w:val="20"/>
+          <w:szCs w:val="20"/>
+        </w:rPr>
+      </w:pPr>
+      <w:proofErr w:type="spellStart"/>
+      <w:proofErr w:type="gramStart"/>
+      <w:r>
+        <w:rPr>
+          <w:rFonts w:ascii="Courier New" w:eastAsia="Times New Roman" w:hAnsi="Courier New" w:cs="Courier New"/>
+          <w:sz w:val="20"/>
+          <w:szCs w:val="20"/>
+        </w:rPr>
+        <w:t>row</w:t>
+      </w:r>
+      <w:proofErr w:type="spellEnd"/>
+      <w:proofErr w:type="gramEnd"/>
+      <w:r>
+        <w:rPr>
+          <w:rFonts w:ascii="Courier New" w:eastAsia="Times New Roman" w:hAnsi="Courier New" w:cs="Courier New"/>
+          <w:sz w:val="20"/>
+          <w:szCs w:val="20"/>
+        </w:rPr>
+        <w:t xml:space="preserve"> = bottom - 1</w:t>
+      </w:r>
+    </w:p>
+    <w:p>
+      <w:pPr>
+        <w:spacing w:before="100" w:beforeAutospacing="1" w:after="100" w:afterAutospacing="1" w:line="240" w:lineRule="auto"/>
+        <w:rPr>
+          <w:rFonts w:ascii="Times New Roman" w:eastAsia="Times New Roman" w:hAnsi="Times New Roman" w:cs="Times New Roman"/>
+          <w:sz w:val="24"/>
+          <w:szCs w:val="24"/>
+        </w:rPr>
+      </w:pPr>
+      <w:proofErr w:type="gramStart"/>
+      <w:r>
+        <w:rPr>
+          <w:rFonts w:ascii="Times New Roman" w:eastAsia="Times New Roman" w:hAnsi="Times New Roman" w:cs="Times New Roman"/>
+          <w:sz w:val="24"/>
+          <w:szCs w:val="24"/>
+        </w:rPr>
+        <w:t>because</w:t>
+      </w:r>
+      <w:proofErr w:type="gramEnd"/>
+      <w:r>
+        <w:rPr>
+          <w:rFonts w:ascii="Times New Roman" w:eastAsia="Times New Roman" w:hAnsi="Times New Roman" w:cs="Times New Roman"/>
+          <w:sz w:val="24"/>
+          <w:szCs w:val="24"/>
+        </w:rPr>
+        <w:t xml:space="preserve"> later </w:t>
+      </w:r>
+      <w:r>
+        <w:rPr>
+          <w:rFonts w:ascii="Courier New" w:eastAsia="Times New Roman" w:hAnsi="Courier New" w:cs="Courier New"/>
+          <w:sz w:val="20"/>
+          <w:szCs w:val="20"/>
+        </w:rPr>
+        <w:t>bottom</w:t>
+      </w:r>
+      <w:r>
+        <w:rPr>
+          <w:rFonts w:ascii="Times New Roman" w:eastAsia="Times New Roman" w:hAnsi="Times New Roman" w:cs="Times New Roman"/>
+          <w:sz w:val="24"/>
+          <w:szCs w:val="24"/>
+        </w:rPr>
+        <w:t xml:space="preserve"> will change.</w:t>
+      </w:r>
+    </w:p>
+    <w:p>
+      <w:pPr>
+        <w:spacing w:before="100" w:beforeAutospacing="1" w:after="100" w:afterAutospacing="1" w:line="240" w:lineRule="auto"/>
+        <w:rPr>
+          <w:rFonts w:ascii="Times New Roman" w:eastAsia="Times New Roman" w:hAnsi="Times New Roman" w:cs="Times New Roman"/>
+          <w:sz w:val="24"/>
+          <w:szCs w:val="24"/>
+        </w:rPr>
+      </w:pPr>
+      <w:r>
+        <w:rPr>
+          <w:rFonts w:ascii="Times New Roman" w:eastAsia="Times New Roman" w:hAnsi="Times New Roman" w:cs="Times New Roman"/>
+          <w:sz w:val="24"/>
+          <w:szCs w:val="24"/>
+        </w:rPr>
+        <w:t xml:space="preserve">Now the next step is to </w:t>
+      </w:r>
+      <w:r>
+        <w:rPr>
+          <w:rFonts w:ascii="Times New Roman" w:eastAsia="Times New Roman" w:hAnsi="Times New Roman" w:cs="Times New Roman"/>
+          <w:b/>
+          <w:bCs/>
+          <w:sz w:val="24"/>
+          <w:szCs w:val="24"/>
+        </w:rPr>
+        <w:t>shrink the four boundaries inward</w:t>
+      </w:r>
+      <w:r>
+        <w:rPr>
+          <w:rFonts w:ascii="Times New Roman" w:eastAsia="Times New Roman" w:hAnsi="Times New Roman" w:cs="Times New Roman"/>
+          <w:sz w:val="24"/>
+          <w:szCs w:val="24"/>
+        </w:rPr>
+        <w:t xml:space="preserve"> after finishing one full circle:</w:t>
+      </w:r>
+    </w:p>
+    <w:p>
+      <w:pPr>
+        <w:tabs>
+          <w:tab w:val="left" w:pos="916"/>
+          <w:tab w:val="left" w:pos="1832"/>
+          <w:tab w:val="left" w:pos="2748"/>
+          <w:tab w:val="left" w:pos="3664"/>
+          <w:tab w:val="left" w:pos="4580"/>
+          <w:tab w:val="left" w:pos="5496"/>
+          <w:tab w:val="left" w:pos="6412"/>
+          <w:tab w:val="left" w:pos="7328"/>
+          <w:tab w:val="left" w:pos="8244"/>
+          <w:tab w:val="left" w:pos="9160"/>
+          <w:tab w:val="left" w:pos="10076"/>
+          <w:tab w:val="left" w:pos="10992"/>
+          <w:tab w:val="left" w:pos="11908"/>
+          <w:tab w:val="left" w:pos="12824"/>
+          <w:tab w:val="left" w:pos="13740"/>
+          <w:tab w:val="left" w:pos="14656"/>
+        </w:tabs>
+        <w:spacing w:after="0" w:line="240" w:lineRule="auto"/>
+        <w:rPr>
+          <w:rFonts w:ascii="Courier New" w:eastAsia="Times New Roman" w:hAnsi="Courier New" w:cs="Courier New"/>
+          <w:sz w:val="20"/>
+          <w:szCs w:val="20"/>
+        </w:rPr>
+      </w:pPr>
+      <w:proofErr w:type="gramStart"/>
+      <w:r>
+        <w:rPr>
+          <w:rFonts w:ascii="Courier New" w:eastAsia="Times New Roman" w:hAnsi="Courier New" w:cs="Courier New"/>
+          <w:sz w:val="20"/>
+          <w:szCs w:val="20"/>
+        </w:rPr>
+        <w:t>top</w:t>
+      </w:r>
+      <w:proofErr w:type="gramEnd"/>
+      <w:r>
+        <w:rPr>
+          <w:rFonts w:ascii="Courier New" w:eastAsia="Times New Roman" w:hAnsi="Courier New" w:cs="Courier New"/>
+          <w:sz w:val="20"/>
+          <w:szCs w:val="20"/>
+        </w:rPr>
+        <w:t xml:space="preserve"> += 1</w:t>
+      </w:r>
+    </w:p>
+    <w:p>
+      <w:pPr>
+        <w:tabs>
+          <w:tab w:val="left" w:pos="916"/>
+          <w:tab w:val="left" w:pos="1832"/>
+          <w:tab w:val="left" w:pos="2748"/>
+          <w:tab w:val="left" w:pos="3664"/>
+          <w:tab w:val="left" w:pos="4580"/>
+          <w:tab w:val="left" w:pos="5496"/>
+          <w:tab w:val="left" w:pos="6412"/>
+          <w:tab w:val="left" w:pos="7328"/>
+          <w:tab w:val="left" w:pos="8244"/>
+          <w:tab w:val="left" w:pos="9160"/>
+          <w:tab w:val="left" w:pos="10076"/>
+          <w:tab w:val="left" w:pos="10992"/>
+          <w:tab w:val="left" w:pos="11908"/>
+          <w:tab w:val="left" w:pos="12824"/>
+          <w:tab w:val="left" w:pos="13740"/>
+          <w:tab w:val="left" w:pos="14656"/>
+        </w:tabs>
+        <w:spacing w:after="0" w:line="240" w:lineRule="auto"/>
+        <w:rPr>
+          <w:rFonts w:ascii="Courier New" w:eastAsia="Times New Roman" w:hAnsi="Courier New" w:cs="Courier New"/>
+          <w:sz w:val="20"/>
+          <w:szCs w:val="20"/>
+        </w:rPr>
+      </w:pPr>
+      <w:proofErr w:type="gramStart"/>
+      <w:r>
+        <w:rPr>
+          <w:rFonts w:ascii="Courier New" w:eastAsia="Times New Roman" w:hAnsi="Courier New" w:cs="Courier New"/>
+          <w:sz w:val="20"/>
+          <w:szCs w:val="20"/>
+        </w:rPr>
+        <w:t>bottom</w:t>
+      </w:r>
+      <w:proofErr w:type="gramEnd"/>
+      <w:r>
+        <w:rPr>
+          <w:rFonts w:ascii="Courier New" w:eastAsia="Times New Roman" w:hAnsi="Courier New" w:cs="Courier New"/>
+          <w:sz w:val="20"/>
+          <w:szCs w:val="20"/>
+        </w:rPr>
+        <w:t xml:space="preserve"> -= 1</w:t>
+      </w:r>
+    </w:p>
+    <w:p>
+      <w:pPr>
+        <w:tabs>
+          <w:tab w:val="left" w:pos="916"/>
+          <w:tab w:val="left" w:pos="1832"/>
+          <w:tab w:val="left" w:pos="2748"/>
+          <w:tab w:val="left" w:pos="3664"/>
+          <w:tab w:val="left" w:pos="4580"/>
+          <w:tab w:val="left" w:pos="5496"/>
+          <w:tab w:val="left" w:pos="6412"/>
+          <w:tab w:val="left" w:pos="7328"/>
+          <w:tab w:val="left" w:pos="8244"/>
+          <w:tab w:val="left" w:pos="9160"/>
+          <w:tab w:val="left" w:pos="10076"/>
+          <w:tab w:val="left" w:pos="10992"/>
+          <w:tab w:val="left" w:pos="11908"/>
+          <w:tab w:val="left" w:pos="12824"/>
+          <w:tab w:val="left" w:pos="13740"/>
+          <w:tab w:val="left" w:pos="14656"/>
+        </w:tabs>
+        <w:spacing w:after="0" w:line="240" w:lineRule="auto"/>
+        <w:rPr>
+          <w:rFonts w:ascii="Courier New" w:eastAsia="Times New Roman" w:hAnsi="Courier New" w:cs="Courier New"/>
+          <w:sz w:val="20"/>
+          <w:szCs w:val="20"/>
+        </w:rPr>
+      </w:pPr>
+      <w:proofErr w:type="gramStart"/>
+      <w:r>
+        <w:rPr>
+          <w:rFonts w:ascii="Courier New" w:eastAsia="Times New Roman" w:hAnsi="Courier New" w:cs="Courier New"/>
+          <w:sz w:val="20"/>
+          <w:szCs w:val="20"/>
+        </w:rPr>
+        <w:t>left</w:t>
+      </w:r>
+      <w:proofErr w:type="gramEnd"/>
+      <w:r>
+        <w:rPr>
+          <w:rFonts w:ascii="Courier New" w:eastAsia="Times New Roman" w:hAnsi="Courier New" w:cs="Courier New"/>
+          <w:sz w:val="20"/>
+          <w:szCs w:val="20"/>
+        </w:rPr>
+        <w:t xml:space="preserve"> += 1</w:t>
+      </w:r>
+    </w:p>
+    <w:p>
+      <w:pPr>
+        <w:tabs>
+          <w:tab w:val="left" w:pos="916"/>
+          <w:tab w:val="left" w:pos="1832"/>
+          <w:tab w:val="left" w:pos="2748"/>
+          <w:tab w:val="left" w:pos="3664"/>
+          <w:tab w:val="left" w:pos="4580"/>
+          <w:tab w:val="left" w:pos="5496"/>
+          <w:tab w:val="left" w:pos="6412"/>
+          <w:tab w:val="left" w:pos="7328"/>
+          <w:tab w:val="left" w:pos="8244"/>
+          <w:tab w:val="left" w:pos="9160"/>
+          <w:tab w:val="left" w:pos="10076"/>
+          <w:tab w:val="left" w:pos="10992"/>
+          <w:tab w:val="left" w:pos="11908"/>
+          <w:tab w:val="left" w:pos="12824"/>
+          <w:tab w:val="left" w:pos="13740"/>
+          <w:tab w:val="left" w:pos="14656"/>
+        </w:tabs>
+        <w:spacing w:after="0" w:line="240" w:lineRule="auto"/>
+        <w:rPr>
+          <w:rFonts w:ascii="Courier New" w:eastAsia="Times New Roman" w:hAnsi="Courier New" w:cs="Courier New"/>
+          <w:sz w:val="20"/>
+          <w:szCs w:val="20"/>
+        </w:rPr>
+      </w:pPr>
+      <w:proofErr w:type="gramStart"/>
+      <w:r>
+        <w:rPr>
+          <w:rFonts w:ascii="Courier New" w:eastAsia="Times New Roman" w:hAnsi="Courier New" w:cs="Courier New"/>
+          <w:sz w:val="20"/>
+          <w:szCs w:val="20"/>
+        </w:rPr>
+        <w:t>right</w:t>
+      </w:r>
+      <w:proofErr w:type="gramEnd"/>
+      <w:r>
+        <w:rPr>
+          <w:rFonts w:ascii="Courier New" w:eastAsia="Times New Roman" w:hAnsi="Courier New" w:cs="Courier New"/>
+          <w:sz w:val="20"/>
+          <w:szCs w:val="20"/>
+        </w:rPr>
+        <w:t xml:space="preserve"> -= 1</w:t>
+      </w:r>
+    </w:p>
+    <w:p>
+      <w:pPr>
+        <w:spacing w:before="100" w:beforeAutospacing="1" w:after="100" w:afterAutospacing="1" w:line="240" w:lineRule="auto"/>
+        <w:rPr>
+          <w:rFonts w:ascii="Times New Roman" w:eastAsia="Times New Roman" w:hAnsi="Times New Roman" w:cs="Times New Roman"/>
+          <w:sz w:val="24"/>
+          <w:szCs w:val="24"/>
+        </w:rPr>
+      </w:pPr>
+      <w:r>
+        <w:rPr>
+          <w:rFonts w:ascii="Times New Roman" w:eastAsia="Times New Roman" w:hAnsi="Times New Roman" w:cs="Times New Roman"/>
+          <w:sz w:val="24"/>
+          <w:szCs w:val="24"/>
+        </w:rPr>
+        <w:lastRenderedPageBreak/>
+        <w:t>For your 3×3 matrix, before shrinking:</w:t>
+      </w:r>
+    </w:p>
+    <w:p>
+      <w:pPr>
+        <w:tabs>
+          <w:tab w:val="left" w:pos="916"/>
+          <w:tab w:val="left" w:pos="1832"/>
+          <w:tab w:val="left" w:pos="2748"/>
+          <w:tab w:val="left" w:pos="3664"/>
+          <w:tab w:val="left" w:pos="4580"/>
+          <w:tab w:val="left" w:pos="5496"/>
+          <w:tab w:val="left" w:pos="6412"/>
+          <w:tab w:val="left" w:pos="7328"/>
+          <w:tab w:val="left" w:pos="8244"/>
+          <w:tab w:val="left" w:pos="9160"/>
+          <w:tab w:val="left" w:pos="10076"/>
+          <w:tab w:val="left" w:pos="10992"/>
+          <w:tab w:val="left" w:pos="11908"/>
+          <w:tab w:val="left" w:pos="12824"/>
+          <w:tab w:val="left" w:pos="13740"/>
+          <w:tab w:val="left" w:pos="14656"/>
+        </w:tabs>
+        <w:spacing w:after="0" w:line="240" w:lineRule="auto"/>
+        <w:rPr>
+          <w:rFonts w:ascii="Courier New" w:eastAsia="Times New Roman" w:hAnsi="Courier New" w:cs="Courier New"/>
+          <w:sz w:val="20"/>
+          <w:szCs w:val="20"/>
+        </w:rPr>
+      </w:pPr>
+      <w:proofErr w:type="gramStart"/>
+      <w:r>
+        <w:rPr>
+          <w:rFonts w:ascii="Courier New" w:eastAsia="Times New Roman" w:hAnsi="Courier New" w:cs="Courier New"/>
+          <w:sz w:val="20"/>
+          <w:szCs w:val="20"/>
+        </w:rPr>
+        <w:t>top</w:t>
+      </w:r>
+      <w:proofErr w:type="gramEnd"/>
+      <w:r>
+        <w:rPr>
+          <w:rFonts w:ascii="Courier New" w:eastAsia="Times New Roman" w:hAnsi="Courier New" w:cs="Courier New"/>
+          <w:sz w:val="20"/>
+          <w:szCs w:val="20"/>
+        </w:rPr>
+        <w:t xml:space="preserve"> = 0</w:t>
+      </w:r>
+    </w:p>
+    <w:p>
+      <w:pPr>
+        <w:tabs>
+          <w:tab w:val="left" w:pos="916"/>
+          <w:tab w:val="left" w:pos="1832"/>
+          <w:tab w:val="left" w:pos="2748"/>
+          <w:tab w:val="left" w:pos="3664"/>
+          <w:tab w:val="left" w:pos="4580"/>
+          <w:tab w:val="left" w:pos="5496"/>
+          <w:tab w:val="left" w:pos="6412"/>
+          <w:tab w:val="left" w:pos="7328"/>
+          <w:tab w:val="left" w:pos="8244"/>
+          <w:tab w:val="left" w:pos="9160"/>
+          <w:tab w:val="left" w:pos="10076"/>
+          <w:tab w:val="left" w:pos="10992"/>
+          <w:tab w:val="left" w:pos="11908"/>
+          <w:tab w:val="left" w:pos="12824"/>
+          <w:tab w:val="left" w:pos="13740"/>
+          <w:tab w:val="left" w:pos="14656"/>
+        </w:tabs>
+        <w:spacing w:after="0" w:line="240" w:lineRule="auto"/>
+        <w:rPr>
+          <w:rFonts w:ascii="Courier New" w:eastAsia="Times New Roman" w:hAnsi="Courier New" w:cs="Courier New"/>
+          <w:sz w:val="20"/>
+          <w:szCs w:val="20"/>
+        </w:rPr>
+      </w:pPr>
+      <w:proofErr w:type="gramStart"/>
+      <w:r>
+        <w:rPr>
+          <w:rFonts w:ascii="Courier New" w:eastAsia="Times New Roman" w:hAnsi="Courier New" w:cs="Courier New"/>
+          <w:sz w:val="20"/>
+          <w:szCs w:val="20"/>
+        </w:rPr>
+        <w:t>bottom</w:t>
+      </w:r>
+      <w:proofErr w:type="gramEnd"/>
+      <w:r>
+        <w:rPr>
+          <w:rFonts w:ascii="Courier New" w:eastAsia="Times New Roman" w:hAnsi="Courier New" w:cs="Courier New"/>
+          <w:sz w:val="20"/>
+          <w:szCs w:val="20"/>
+        </w:rPr>
+        <w:t xml:space="preserve"> = 2</w:t>
+      </w:r>
+    </w:p>
+    <w:p>
+      <w:pPr>
+        <w:tabs>
+          <w:tab w:val="left" w:pos="916"/>
+          <w:tab w:val="left" w:pos="1832"/>
+          <w:tab w:val="left" w:pos="2748"/>
+          <w:tab w:val="left" w:pos="3664"/>
+          <w:tab w:val="left" w:pos="4580"/>
+          <w:tab w:val="left" w:pos="5496"/>
+          <w:tab w:val="left" w:pos="6412"/>
+          <w:tab w:val="left" w:pos="7328"/>
+          <w:tab w:val="left" w:pos="8244"/>
+          <w:tab w:val="left" w:pos="9160"/>
+          <w:tab w:val="left" w:pos="10076"/>
+          <w:tab w:val="left" w:pos="10992"/>
+          <w:tab w:val="left" w:pos="11908"/>
+          <w:tab w:val="left" w:pos="12824"/>
+          <w:tab w:val="left" w:pos="13740"/>
+          <w:tab w:val="left" w:pos="14656"/>
+        </w:tabs>
+        <w:spacing w:after="0" w:line="240" w:lineRule="auto"/>
+        <w:rPr>
+          <w:rFonts w:ascii="Courier New" w:eastAsia="Times New Roman" w:hAnsi="Courier New" w:cs="Courier New"/>
+          <w:sz w:val="20"/>
+          <w:szCs w:val="20"/>
+        </w:rPr>
+      </w:pPr>
+      <w:proofErr w:type="gramStart"/>
+      <w:r>
+        <w:rPr>
+          <w:rFonts w:ascii="Courier New" w:eastAsia="Times New Roman" w:hAnsi="Courier New" w:cs="Courier New"/>
+          <w:sz w:val="20"/>
+          <w:szCs w:val="20"/>
+        </w:rPr>
+        <w:t>left</w:t>
+      </w:r>
+      <w:proofErr w:type="gramEnd"/>
+      <w:r>
+        <w:rPr>
+          <w:rFonts w:ascii="Courier New" w:eastAsia="Times New Roman" w:hAnsi="Courier New" w:cs="Courier New"/>
+          <w:sz w:val="20"/>
+          <w:szCs w:val="20"/>
+        </w:rPr>
+        <w:t xml:space="preserve"> = 0</w:t>
+      </w:r>
+    </w:p>
+    <w:p>
+      <w:pPr>
+        <w:tabs>
+          <w:tab w:val="left" w:pos="916"/>
+          <w:tab w:val="left" w:pos="1832"/>
+          <w:tab w:val="left" w:pos="2748"/>
+          <w:tab w:val="left" w:pos="3664"/>
+          <w:tab w:val="left" w:pos="4580"/>
+          <w:tab w:val="left" w:pos="5496"/>
+          <w:tab w:val="left" w:pos="6412"/>
+          <w:tab w:val="left" w:pos="7328"/>
+          <w:tab w:val="left" w:pos="8244"/>
+          <w:tab w:val="left" w:pos="9160"/>
+          <w:tab w:val="left" w:pos="10076"/>
+          <w:tab w:val="left" w:pos="10992"/>
+          <w:tab w:val="left" w:pos="11908"/>
+          <w:tab w:val="left" w:pos="12824"/>
+          <w:tab w:val="left" w:pos="13740"/>
+          <w:tab w:val="left" w:pos="14656"/>
+        </w:tabs>
+        <w:spacing w:after="0" w:line="240" w:lineRule="auto"/>
+        <w:rPr>
+          <w:rFonts w:ascii="Courier New" w:eastAsia="Times New Roman" w:hAnsi="Courier New" w:cs="Courier New"/>
+          <w:sz w:val="20"/>
+          <w:szCs w:val="20"/>
+        </w:rPr>
+      </w:pPr>
+      <w:proofErr w:type="gramStart"/>
+      <w:r>
+        <w:rPr>
+          <w:rFonts w:ascii="Courier New" w:eastAsia="Times New Roman" w:hAnsi="Courier New" w:cs="Courier New"/>
+          <w:sz w:val="20"/>
+          <w:szCs w:val="20"/>
+        </w:rPr>
+        <w:t>right</w:t>
+      </w:r>
+      <w:proofErr w:type="gramEnd"/>
+      <w:r>
+        <w:rPr>
+          <w:rFonts w:ascii="Courier New" w:eastAsia="Times New Roman" w:hAnsi="Courier New" w:cs="Courier New"/>
+          <w:sz w:val="20"/>
+          <w:szCs w:val="20"/>
+        </w:rPr>
+        <w:t xml:space="preserve"> = 2</w:t>
+      </w:r>
+    </w:p>
+    <w:p>
+      <w:pPr>
+        <w:spacing w:before="100" w:beforeAutospacing="1" w:after="100" w:afterAutospacing="1" w:line="240" w:lineRule="auto"/>
+        <w:rPr>
+          <w:rFonts w:ascii="Times New Roman" w:eastAsia="Times New Roman" w:hAnsi="Times New Roman" w:cs="Times New Roman"/>
+          <w:sz w:val="24"/>
+          <w:szCs w:val="24"/>
+        </w:rPr>
+      </w:pPr>
+      <w:r>
+        <w:rPr>
+          <w:rFonts w:ascii="Times New Roman" w:eastAsia="Times New Roman" w:hAnsi="Times New Roman" w:cs="Times New Roman"/>
+          <w:sz w:val="24"/>
+          <w:szCs w:val="24"/>
+        </w:rPr>
+        <w:t>After shrinking:</w:t>
+      </w:r>
+    </w:p>
+    <w:p>
+      <w:pPr>
+        <w:tabs>
+          <w:tab w:val="left" w:pos="916"/>
+          <w:tab w:val="left" w:pos="1832"/>
+          <w:tab w:val="left" w:pos="2748"/>
+          <w:tab w:val="left" w:pos="3664"/>
+          <w:tab w:val="left" w:pos="4580"/>
+          <w:tab w:val="left" w:pos="5496"/>
+          <w:tab w:val="left" w:pos="6412"/>
+          <w:tab w:val="left" w:pos="7328"/>
+          <w:tab w:val="left" w:pos="8244"/>
+          <w:tab w:val="left" w:pos="9160"/>
+          <w:tab w:val="left" w:pos="10076"/>
+          <w:tab w:val="left" w:pos="10992"/>
+          <w:tab w:val="left" w:pos="11908"/>
+          <w:tab w:val="left" w:pos="12824"/>
+          <w:tab w:val="left" w:pos="13740"/>
+          <w:tab w:val="left" w:pos="14656"/>
+        </w:tabs>
+        <w:spacing w:after="0" w:line="240" w:lineRule="auto"/>
+        <w:rPr>
+          <w:rFonts w:ascii="Courier New" w:eastAsia="Times New Roman" w:hAnsi="Courier New" w:cs="Courier New"/>
+          <w:sz w:val="20"/>
+          <w:szCs w:val="20"/>
+        </w:rPr>
+      </w:pPr>
+      <w:proofErr w:type="gramStart"/>
+      <w:r>
+        <w:rPr>
+          <w:rFonts w:ascii="Courier New" w:eastAsia="Times New Roman" w:hAnsi="Courier New" w:cs="Courier New"/>
+          <w:sz w:val="20"/>
+          <w:szCs w:val="20"/>
+        </w:rPr>
+        <w:t>top</w:t>
+      </w:r>
+      <w:proofErr w:type="gramEnd"/>
+      <w:r>
+        <w:rPr>
+          <w:rFonts w:ascii="Courier New" w:eastAsia="Times New Roman" w:hAnsi="Courier New" w:cs="Courier New"/>
+          <w:sz w:val="20"/>
+          <w:szCs w:val="20"/>
+        </w:rPr>
+        <w:t xml:space="preserve"> = 1</w:t>
+      </w:r>
+    </w:p>
+    <w:p>
+      <w:pPr>
+        <w:tabs>
+          <w:tab w:val="left" w:pos="916"/>
+          <w:tab w:val="left" w:pos="1832"/>
+          <w:tab w:val="left" w:pos="2748"/>
+          <w:tab w:val="left" w:pos="3664"/>
+          <w:tab w:val="left" w:pos="4580"/>
+          <w:tab w:val="left" w:pos="5496"/>
+          <w:tab w:val="left" w:pos="6412"/>
+          <w:tab w:val="left" w:pos="7328"/>
+          <w:tab w:val="left" w:pos="8244"/>
+          <w:tab w:val="left" w:pos="9160"/>
+          <w:tab w:val="left" w:pos="10076"/>
+          <w:tab w:val="left" w:pos="10992"/>
+          <w:tab w:val="left" w:pos="11908"/>
+          <w:tab w:val="left" w:pos="12824"/>
+          <w:tab w:val="left" w:pos="13740"/>
+          <w:tab w:val="left" w:pos="14656"/>
+        </w:tabs>
+        <w:spacing w:after="0" w:line="240" w:lineRule="auto"/>
+        <w:rPr>
+          <w:rFonts w:ascii="Courier New" w:eastAsia="Times New Roman" w:hAnsi="Courier New" w:cs="Courier New"/>
+          <w:sz w:val="20"/>
+          <w:szCs w:val="20"/>
+        </w:rPr>
+      </w:pPr>
+      <w:proofErr w:type="gramStart"/>
+      <w:r>
+        <w:rPr>
+          <w:rFonts w:ascii="Courier New" w:eastAsia="Times New Roman" w:hAnsi="Courier New" w:cs="Courier New"/>
+          <w:sz w:val="20"/>
+          <w:szCs w:val="20"/>
+        </w:rPr>
+        <w:t>bottom</w:t>
+      </w:r>
+      <w:proofErr w:type="gramEnd"/>
+      <w:r>
+        <w:rPr>
+          <w:rFonts w:ascii="Courier New" w:eastAsia="Times New Roman" w:hAnsi="Courier New" w:cs="Courier New"/>
+          <w:sz w:val="20"/>
+          <w:szCs w:val="20"/>
+        </w:rPr>
+        <w:t xml:space="preserve"> = 1</w:t>
+      </w:r>
+    </w:p>
+    <w:p>
+      <w:pPr>
+        <w:tabs>
+          <w:tab w:val="left" w:pos="916"/>
+          <w:tab w:val="left" w:pos="1832"/>
+          <w:tab w:val="left" w:pos="2748"/>
+          <w:tab w:val="left" w:pos="3664"/>
+          <w:tab w:val="left" w:pos="4580"/>
+          <w:tab w:val="left" w:pos="5496"/>
+          <w:tab w:val="left" w:pos="6412"/>
+          <w:tab w:val="left" w:pos="7328"/>
+          <w:tab w:val="left" w:pos="8244"/>
+          <w:tab w:val="left" w:pos="9160"/>
+          <w:tab w:val="left" w:pos="10076"/>
+          <w:tab w:val="left" w:pos="10992"/>
+          <w:tab w:val="left" w:pos="11908"/>
+          <w:tab w:val="left" w:pos="12824"/>
+          <w:tab w:val="left" w:pos="13740"/>
+          <w:tab w:val="left" w:pos="14656"/>
+        </w:tabs>
+        <w:spacing w:after="0" w:line="240" w:lineRule="auto"/>
+        <w:rPr>
+          <w:rFonts w:ascii="Courier New" w:eastAsia="Times New Roman" w:hAnsi="Courier New" w:cs="Courier New"/>
+          <w:sz w:val="20"/>
+          <w:szCs w:val="20"/>
+        </w:rPr>
+      </w:pPr>
+      <w:proofErr w:type="gramStart"/>
+      <w:r>
+        <w:rPr>
+          <w:rFonts w:ascii="Courier New" w:eastAsia="Times New Roman" w:hAnsi="Courier New" w:cs="Courier New"/>
+          <w:sz w:val="20"/>
+          <w:szCs w:val="20"/>
+        </w:rPr>
+        <w:t>left</w:t>
+      </w:r>
+      <w:proofErr w:type="gramEnd"/>
+      <w:r>
+        <w:rPr>
+          <w:rFonts w:ascii="Courier New" w:eastAsia="Times New Roman" w:hAnsi="Courier New" w:cs="Courier New"/>
+          <w:sz w:val="20"/>
+          <w:szCs w:val="20"/>
+        </w:rPr>
+        <w:t xml:space="preserve"> = 1</w:t>
+      </w:r>
+    </w:p>
+    <w:p>
+      <w:pPr>
+        <w:tabs>
+          <w:tab w:val="left" w:pos="916"/>
+          <w:tab w:val="left" w:pos="1832"/>
+          <w:tab w:val="left" w:pos="2748"/>
+          <w:tab w:val="left" w:pos="3664"/>
+          <w:tab w:val="left" w:pos="4580"/>
+          <w:tab w:val="left" w:pos="5496"/>
+          <w:tab w:val="left" w:pos="6412"/>
+          <w:tab w:val="left" w:pos="7328"/>
+          <w:tab w:val="left" w:pos="8244"/>
+          <w:tab w:val="left" w:pos="9160"/>
+          <w:tab w:val="left" w:pos="10076"/>
+          <w:tab w:val="left" w:pos="10992"/>
+          <w:tab w:val="left" w:pos="11908"/>
+          <w:tab w:val="left" w:pos="12824"/>
+          <w:tab w:val="left" w:pos="13740"/>
+          <w:tab w:val="left" w:pos="14656"/>
+        </w:tabs>
+        <w:spacing w:after="0" w:line="240" w:lineRule="auto"/>
+        <w:rPr>
+          <w:rFonts w:ascii="Courier New" w:eastAsia="Times New Roman" w:hAnsi="Courier New" w:cs="Courier New"/>
+          <w:sz w:val="20"/>
+          <w:szCs w:val="20"/>
+        </w:rPr>
+      </w:pPr>
+      <w:proofErr w:type="gramStart"/>
+      <w:r>
+        <w:rPr>
+          <w:rFonts w:ascii="Courier New" w:eastAsia="Times New Roman" w:hAnsi="Courier New" w:cs="Courier New"/>
+          <w:sz w:val="20"/>
+          <w:szCs w:val="20"/>
+        </w:rPr>
+        <w:t>right</w:t>
+      </w:r>
+      <w:proofErr w:type="gramEnd"/>
+      <w:r>
+        <w:rPr>
+          <w:rFonts w:ascii="Courier New" w:eastAsia="Times New Roman" w:hAnsi="Courier New" w:cs="Courier New"/>
+          <w:sz w:val="20"/>
+          <w:szCs w:val="20"/>
+        </w:rPr>
+        <w:t xml:space="preserve"> = 1</w:t>
+      </w:r>
+    </w:p>
+    <w:p>
+      <w:pPr>
+        <w:spacing w:before="100" w:beforeAutospacing="1" w:after="100" w:afterAutospacing="1" w:line="240" w:lineRule="auto"/>
+        <w:rPr>
+          <w:rFonts w:ascii="Times New Roman" w:eastAsia="Times New Roman" w:hAnsi="Times New Roman" w:cs="Times New Roman"/>
+          <w:sz w:val="24"/>
+          <w:szCs w:val="24"/>
+        </w:rPr>
+      </w:pPr>
+      <w:r>
+        <w:rPr>
+          <w:rFonts w:ascii="Times New Roman" w:eastAsia="Times New Roman" w:hAnsi="Times New Roman" w:cs="Times New Roman"/>
+          <w:sz w:val="24"/>
+          <w:szCs w:val="24"/>
+        </w:rPr>
+        <w:t>That now describes only:</w:t>
+      </w:r>
+    </w:p>
+    <w:p>
+      <w:pPr>
+        <w:tabs>
+          <w:tab w:val="left" w:pos="916"/>
+          <w:tab w:val="left" w:pos="1832"/>
+          <w:tab w:val="left" w:pos="2748"/>
+          <w:tab w:val="left" w:pos="3664"/>
+          <w:tab w:val="left" w:pos="4580"/>
+          <w:tab w:val="left" w:pos="5496"/>
+          <w:tab w:val="left" w:pos="6412"/>
+          <w:tab w:val="left" w:pos="7328"/>
+          <w:tab w:val="left" w:pos="8244"/>
+          <w:tab w:val="left" w:pos="9160"/>
+          <w:tab w:val="left" w:pos="10076"/>
+          <w:tab w:val="left" w:pos="10992"/>
+          <w:tab w:val="left" w:pos="11908"/>
+          <w:tab w:val="left" w:pos="12824"/>
+          <w:tab w:val="left" w:pos="13740"/>
+          <w:tab w:val="left" w:pos="14656"/>
+        </w:tabs>
+        <w:spacing w:after="0" w:line="240" w:lineRule="auto"/>
+        <w:rPr>
+          <w:rFonts w:ascii="Courier New" w:eastAsia="Times New Roman" w:hAnsi="Courier New" w:cs="Courier New"/>
+          <w:sz w:val="20"/>
+          <w:szCs w:val="20"/>
+        </w:rPr>
+      </w:pPr>
+      <w:r>
+        <w:rPr>
+          <w:rFonts w:ascii="Courier New" w:eastAsia="Times New Roman" w:hAnsi="Courier New" w:cs="Courier New"/>
+          <w:sz w:val="20"/>
+          <w:szCs w:val="20"/>
+        </w:rPr>
+        <w:t>5</w:t>
+      </w:r>
+    </w:p>
+    <w:p>
+      <w:pPr>
+        <w:spacing w:before="100" w:beforeAutospacing="1" w:after="100" w:afterAutospacing="1" w:line="240" w:lineRule="auto"/>
+        <w:rPr>
+          <w:rFonts w:ascii="Times New Roman" w:eastAsia="Times New Roman" w:hAnsi="Times New Roman" w:cs="Times New Roman"/>
+          <w:sz w:val="24"/>
+          <w:szCs w:val="24"/>
+        </w:rPr>
+      </w:pPr>
+      <w:r>
+        <w:rPr>
+          <w:rFonts w:ascii="Times New Roman" w:eastAsia="Times New Roman" w:hAnsi="Times New Roman" w:cs="Times New Roman"/>
+          <w:sz w:val="24"/>
+          <w:szCs w:val="24"/>
+        </w:rPr>
+        <w:t>Visually:</w:t>
+      </w:r>
+    </w:p>
+    <w:p>
+      <w:pPr>
+        <w:tabs>
+          <w:tab w:val="left" w:pos="916"/>
+          <w:tab w:val="left" w:pos="1832"/>
+          <w:tab w:val="left" w:pos="2748"/>
+          <w:tab w:val="left" w:pos="3664"/>
+          <w:tab w:val="left" w:pos="4580"/>
+          <w:tab w:val="left" w:pos="5496"/>
+          <w:tab w:val="left" w:pos="6412"/>
+          <w:tab w:val="left" w:pos="7328"/>
+          <w:tab w:val="left" w:pos="8244"/>
+          <w:tab w:val="left" w:pos="9160"/>
+          <w:tab w:val="left" w:pos="10076"/>
+          <w:tab w:val="left" w:pos="10992"/>
+          <w:tab w:val="left" w:pos="11908"/>
+          <w:tab w:val="left" w:pos="12824"/>
+          <w:tab w:val="left" w:pos="13740"/>
+          <w:tab w:val="left" w:pos="14656"/>
+        </w:tabs>
+        <w:spacing w:after="0" w:line="240" w:lineRule="auto"/>
+        <w:rPr>
+          <w:rFonts w:ascii="Courier New" w:eastAsia="Times New Roman" w:hAnsi="Courier New" w:cs="Courier New"/>
+          <w:sz w:val="20"/>
+          <w:szCs w:val="20"/>
+        </w:rPr>
+      </w:pPr>
+      <w:r>
+        <w:rPr>
+          <w:rFonts w:ascii="Courier New" w:eastAsia="Times New Roman" w:hAnsi="Courier New" w:cs="Courier New"/>
+          <w:sz w:val="20"/>
+          <w:szCs w:val="20"/>
+        </w:rPr>
+        <w:t>1 2 3</w:t>
+      </w:r>
+    </w:p>
+    <w:p>
+      <w:pPr>
+        <w:tabs>
+          <w:tab w:val="left" w:pos="916"/>
+          <w:tab w:val="left" w:pos="1832"/>
+          <w:tab w:val="left" w:pos="2748"/>
+          <w:tab w:val="left" w:pos="3664"/>
+          <w:tab w:val="left" w:pos="4580"/>
+          <w:tab w:val="left" w:pos="5496"/>
+          <w:tab w:val="left" w:pos="6412"/>
+          <w:tab w:val="left" w:pos="7328"/>
+          <w:tab w:val="left" w:pos="8244"/>
+          <w:tab w:val="left" w:pos="9160"/>
+          <w:tab w:val="left" w:pos="10076"/>
+          <w:tab w:val="left" w:pos="10992"/>
+          <w:tab w:val="left" w:pos="11908"/>
+          <w:tab w:val="left" w:pos="12824"/>
+          <w:tab w:val="left" w:pos="13740"/>
+          <w:tab w:val="left" w:pos="14656"/>
+        </w:tabs>
+        <w:spacing w:after="0" w:line="240" w:lineRule="auto"/>
+        <w:rPr>
+          <w:rFonts w:ascii="Courier New" w:eastAsia="Times New Roman" w:hAnsi="Courier New" w:cs="Courier New"/>
+          <w:sz w:val="20"/>
+          <w:szCs w:val="20"/>
+        </w:rPr>
+      </w:pPr>
+      <w:r>
+        <w:rPr>
+          <w:rFonts w:ascii="Courier New" w:eastAsia="Times New Roman" w:hAnsi="Courier New" w:cs="Courier New"/>
+          <w:sz w:val="20"/>
+          <w:szCs w:val="20"/>
+        </w:rPr>
+        <w:t>4 5 6</w:t>
+      </w:r>
+    </w:p>
+    <w:p>
+      <w:pPr>
+        <w:tabs>
+          <w:tab w:val="left" w:pos="916"/>
+          <w:tab w:val="left" w:pos="1832"/>
+          <w:tab w:val="left" w:pos="2748"/>
+          <w:tab w:val="left" w:pos="3664"/>
+          <w:tab w:val="left" w:pos="4580"/>
+          <w:tab w:val="left" w:pos="5496"/>
+          <w:tab w:val="left" w:pos="6412"/>
+          <w:tab w:val="left" w:pos="7328"/>
+          <w:tab w:val="left" w:pos="8244"/>
+          <w:tab w:val="left" w:pos="9160"/>
+          <w:tab w:val="left" w:pos="10076"/>
+          <w:tab w:val="left" w:pos="10992"/>
+          <w:tab w:val="left" w:pos="11908"/>
+          <w:tab w:val="left" w:pos="12824"/>
+          <w:tab w:val="left" w:pos="13740"/>
+          <w:tab w:val="left" w:pos="14656"/>
+        </w:tabs>
+        <w:spacing w:after="0" w:line="240" w:lineRule="auto"/>
+        <w:rPr>
+          <w:rFonts w:ascii="Courier New" w:eastAsia="Times New Roman" w:hAnsi="Courier New" w:cs="Courier New"/>
+          <w:sz w:val="20"/>
+          <w:szCs w:val="20"/>
+        </w:rPr>
+      </w:pPr>
+      <w:r>
+        <w:rPr>
+          <w:rFonts w:ascii="Courier New" w:eastAsia="Times New Roman" w:hAnsi="Courier New" w:cs="Courier New"/>
+          <w:sz w:val="20"/>
+          <w:szCs w:val="20"/>
+        </w:rPr>
+        <w:t>7 8 9</w:t>
+      </w:r>
+    </w:p>
+    <w:p>
+      <w:pPr>
+        <w:spacing w:before="100" w:beforeAutospacing="1" w:after="100" w:afterAutospacing="1" w:line="240" w:lineRule="auto"/>
+        <w:rPr>
+          <w:rFonts w:ascii="Times New Roman" w:eastAsia="Times New Roman" w:hAnsi="Times New Roman" w:cs="Times New Roman"/>
+          <w:sz w:val="24"/>
+          <w:szCs w:val="24"/>
+        </w:rPr>
+      </w:pPr>
+      <w:proofErr w:type="gramStart"/>
+      <w:r>
+        <w:rPr>
+          <w:rFonts w:ascii="Times New Roman" w:eastAsia="Times New Roman" w:hAnsi="Times New Roman" w:cs="Times New Roman"/>
+          <w:sz w:val="24"/>
+          <w:szCs w:val="24"/>
+        </w:rPr>
+        <w:t>becomes</w:t>
+      </w:r>
+      <w:proofErr w:type="gramEnd"/>
+      <w:r>
+        <w:rPr>
+          <w:rFonts w:ascii="Times New Roman" w:eastAsia="Times New Roman" w:hAnsi="Times New Roman" w:cs="Times New Roman"/>
+          <w:sz w:val="24"/>
+          <w:szCs w:val="24"/>
+        </w:rPr>
+        <w:t>:</w:t>
+      </w:r>
+    </w:p>
+    <w:p>
+      <w:pPr>
+        <w:tabs>
+          <w:tab w:val="left" w:pos="916"/>
+          <w:tab w:val="left" w:pos="1832"/>
+          <w:tab w:val="left" w:pos="2748"/>
+          <w:tab w:val="left" w:pos="3664"/>
+          <w:tab w:val="left" w:pos="4580"/>
+          <w:tab w:val="left" w:pos="5496"/>
+          <w:tab w:val="left" w:pos="6412"/>
+          <w:tab w:val="left" w:pos="7328"/>
+          <w:tab w:val="left" w:pos="8244"/>
+          <w:tab w:val="left" w:pos="9160"/>
+          <w:tab w:val="left" w:pos="10076"/>
+          <w:tab w:val="left" w:pos="10992"/>
+          <w:tab w:val="left" w:pos="11908"/>
+          <w:tab w:val="left" w:pos="12824"/>
+          <w:tab w:val="left" w:pos="13740"/>
+          <w:tab w:val="left" w:pos="14656"/>
+        </w:tabs>
+        <w:spacing w:after="0" w:line="240" w:lineRule="auto"/>
+        <w:rPr>
+          <w:rFonts w:ascii="Courier New" w:eastAsia="Times New Roman" w:hAnsi="Courier New" w:cs="Courier New"/>
+          <w:sz w:val="20"/>
+          <w:szCs w:val="20"/>
+        </w:rPr>
+      </w:pPr>
+      <w:r>
+        <w:rPr>
+          <w:rFonts w:ascii="Courier New" w:eastAsia="Times New Roman" w:hAnsi="Courier New" w:cs="Courier New"/>
+          <w:sz w:val="20"/>
+          <w:szCs w:val="20"/>
+        </w:rPr>
+        <w:t xml:space="preserve">x </w:t>
+      </w:r>
+      <w:proofErr w:type="spellStart"/>
+      <w:r>
+        <w:rPr>
+          <w:rFonts w:ascii="Courier New" w:eastAsia="Times New Roman" w:hAnsi="Courier New" w:cs="Courier New"/>
+          <w:sz w:val="20"/>
+          <w:szCs w:val="20"/>
+        </w:rPr>
+        <w:t>x</w:t>
+      </w:r>
+      <w:proofErr w:type="spellEnd"/>
+      <w:r>
+        <w:rPr>
+          <w:rFonts w:ascii="Courier New" w:eastAsia="Times New Roman" w:hAnsi="Courier New" w:cs="Courier New"/>
+          <w:sz w:val="20"/>
+          <w:szCs w:val="20"/>
+        </w:rPr>
+        <w:t xml:space="preserve"> </w:t>
+      </w:r>
+      <w:proofErr w:type="spellStart"/>
+      <w:r>
+        <w:rPr>
+          <w:rFonts w:ascii="Courier New" w:eastAsia="Times New Roman" w:hAnsi="Courier New" w:cs="Courier New"/>
+          <w:sz w:val="20"/>
+          <w:szCs w:val="20"/>
+        </w:rPr>
+        <w:t>x</w:t>
+      </w:r>
+      <w:proofErr w:type="spellEnd"/>
+    </w:p>
+    <w:p>
+      <w:pPr>
+        <w:tabs>
+          <w:tab w:val="left" w:pos="916"/>
+          <w:tab w:val="left" w:pos="1832"/>
+          <w:tab w:val="left" w:pos="2748"/>
+          <w:tab w:val="left" w:pos="3664"/>
+          <w:tab w:val="left" w:pos="4580"/>
+          <w:tab w:val="left" w:pos="5496"/>
+          <w:tab w:val="left" w:pos="6412"/>
+          <w:tab w:val="left" w:pos="7328"/>
+          <w:tab w:val="left" w:pos="8244"/>
+          <w:tab w:val="left" w:pos="9160"/>
+          <w:tab w:val="left" w:pos="10076"/>
+          <w:tab w:val="left" w:pos="10992"/>
+          <w:tab w:val="left" w:pos="11908"/>
+          <w:tab w:val="left" w:pos="12824"/>
+          <w:tab w:val="left" w:pos="13740"/>
+          <w:tab w:val="left" w:pos="14656"/>
+        </w:tabs>
+        <w:spacing w:after="0" w:line="240" w:lineRule="auto"/>
+        <w:rPr>
+          <w:rFonts w:ascii="Courier New" w:eastAsia="Times New Roman" w:hAnsi="Courier New" w:cs="Courier New"/>
+          <w:sz w:val="20"/>
+          <w:szCs w:val="20"/>
+        </w:rPr>
+      </w:pPr>
+      <w:proofErr w:type="gramStart"/>
+      <w:r>
+        <w:rPr>
+          <w:rFonts w:ascii="Courier New" w:eastAsia="Times New Roman" w:hAnsi="Courier New" w:cs="Courier New"/>
+          <w:sz w:val="20"/>
+          <w:szCs w:val="20"/>
+        </w:rPr>
+        <w:t>x</w:t>
+      </w:r>
+      <w:proofErr w:type="gramEnd"/>
+      <w:r>
+        <w:rPr>
+          <w:rFonts w:ascii="Courier New" w:eastAsia="Times New Roman" w:hAnsi="Courier New" w:cs="Courier New"/>
+          <w:sz w:val="20"/>
+          <w:szCs w:val="20"/>
+        </w:rPr>
+        <w:t xml:space="preserve"> 5 x</w:t>
+      </w:r>
+    </w:p>
+    <w:p>
+      <w:pPr>
+        <w:tabs>
+          <w:tab w:val="left" w:pos="916"/>
+          <w:tab w:val="left" w:pos="1832"/>
+          <w:tab w:val="left" w:pos="2748"/>
+          <w:tab w:val="left" w:pos="3664"/>
+          <w:tab w:val="left" w:pos="4580"/>
+          <w:tab w:val="left" w:pos="5496"/>
+          <w:tab w:val="left" w:pos="6412"/>
+          <w:tab w:val="left" w:pos="7328"/>
+          <w:tab w:val="left" w:pos="8244"/>
+          <w:tab w:val="left" w:pos="9160"/>
+          <w:tab w:val="left" w:pos="10076"/>
+          <w:tab w:val="left" w:pos="10992"/>
+          <w:tab w:val="left" w:pos="11908"/>
+          <w:tab w:val="left" w:pos="12824"/>
+          <w:tab w:val="left" w:pos="13740"/>
+          <w:tab w:val="left" w:pos="14656"/>
+        </w:tabs>
+        <w:spacing w:after="0" w:line="240" w:lineRule="auto"/>
+        <w:rPr>
+          <w:rFonts w:ascii="Courier New" w:eastAsia="Times New Roman" w:hAnsi="Courier New" w:cs="Courier New"/>
+          <w:sz w:val="20"/>
+          <w:szCs w:val="20"/>
+        </w:rPr>
+      </w:pPr>
+      <w:r>
+        <w:rPr>
+          <w:rFonts w:ascii="Courier New" w:eastAsia="Times New Roman" w:hAnsi="Courier New" w:cs="Courier New"/>
+          <w:sz w:val="20"/>
+          <w:szCs w:val="20"/>
+        </w:rPr>
+        <w:t xml:space="preserve">x </w:t>
+      </w:r>
+      <w:proofErr w:type="spellStart"/>
+      <w:r>
+        <w:rPr>
+          <w:rFonts w:ascii="Courier New" w:eastAsia="Times New Roman" w:hAnsi="Courier New" w:cs="Courier New"/>
+          <w:sz w:val="20"/>
+          <w:szCs w:val="20"/>
+        </w:rPr>
+        <w:t>x</w:t>
+      </w:r>
+      <w:proofErr w:type="spellEnd"/>
+      <w:r>
+        <w:rPr>
+          <w:rFonts w:ascii="Courier New" w:eastAsia="Times New Roman" w:hAnsi="Courier New" w:cs="Courier New"/>
+          <w:sz w:val="20"/>
+          <w:szCs w:val="20"/>
+        </w:rPr>
+        <w:t xml:space="preserve"> </w:t>
+      </w:r>
+      <w:proofErr w:type="spellStart"/>
+      <w:r>
+        <w:rPr>
+          <w:rFonts w:ascii="Courier New" w:eastAsia="Times New Roman" w:hAnsi="Courier New" w:cs="Courier New"/>
+          <w:sz w:val="20"/>
+          <w:szCs w:val="20"/>
+        </w:rPr>
+        <w:t>x</w:t>
+      </w:r>
+      <w:proofErr w:type="spellEnd"/>
+    </w:p>
+    <w:p>
+      <w:pPr>
+        <w:spacing w:before="100" w:beforeAutospacing="1" w:after="100" w:afterAutospacing="1" w:line="240" w:lineRule="auto"/>
+        <w:rPr>
+          <w:rFonts w:ascii="Times New Roman" w:eastAsia="Times New Roman" w:hAnsi="Times New Roman" w:cs="Times New Roman"/>
+          <w:sz w:val="24"/>
+          <w:szCs w:val="24"/>
+        </w:rPr>
+      </w:pPr>
+      <w:r>
+        <w:rPr>
+          <w:rFonts w:ascii="Times New Roman" w:eastAsia="Times New Roman" w:hAnsi="Times New Roman" w:cs="Times New Roman"/>
+          <w:sz w:val="24"/>
+          <w:szCs w:val="24"/>
+        </w:rPr>
+        <w:t xml:space="preserve">So add these four lines </w:t>
+      </w:r>
+      <w:r>
+        <w:rPr>
+          <w:rFonts w:ascii="Times New Roman" w:eastAsia="Times New Roman" w:hAnsi="Times New Roman" w:cs="Times New Roman"/>
+          <w:b/>
+          <w:bCs/>
+          <w:sz w:val="24"/>
+          <w:szCs w:val="24"/>
+        </w:rPr>
+        <w:t>after your UP loop</w:t>
+      </w:r>
+      <w:r>
+        <w:rPr>
+          <w:rFonts w:ascii="Times New Roman" w:eastAsia="Times New Roman" w:hAnsi="Times New Roman" w:cs="Times New Roman"/>
+          <w:sz w:val="24"/>
+          <w:szCs w:val="24"/>
+        </w:rPr>
+        <w:t>:</w:t>
+      </w:r>
+    </w:p>
+    <w:p>
+      <w:pPr>
+        <w:tabs>
+          <w:tab w:val="left" w:pos="916"/>
+          <w:tab w:val="left" w:pos="1832"/>
+          <w:tab w:val="left" w:pos="2748"/>
+          <w:tab w:val="left" w:pos="3664"/>
+          <w:tab w:val="left" w:pos="4580"/>
+          <w:tab w:val="left" w:pos="5496"/>
+          <w:tab w:val="left" w:pos="6412"/>
+          <w:tab w:val="left" w:pos="7328"/>
+          <w:tab w:val="left" w:pos="8244"/>
+          <w:tab w:val="left" w:pos="9160"/>
+          <w:tab w:val="left" w:pos="10076"/>
+          <w:tab w:val="left" w:pos="10992"/>
+          <w:tab w:val="left" w:pos="11908"/>
+          <w:tab w:val="left" w:pos="12824"/>
+          <w:tab w:val="left" w:pos="13740"/>
+          <w:tab w:val="left" w:pos="14656"/>
+        </w:tabs>
+        <w:spacing w:after="0" w:line="240" w:lineRule="auto"/>
+        <w:rPr>
+          <w:rFonts w:ascii="Courier New" w:eastAsia="Times New Roman" w:hAnsi="Courier New" w:cs="Courier New"/>
+          <w:sz w:val="20"/>
+          <w:szCs w:val="20"/>
+        </w:rPr>
+      </w:pPr>
+      <w:proofErr w:type="gramStart"/>
+      <w:r>
+        <w:rPr>
+          <w:rFonts w:ascii="Courier New" w:eastAsia="Times New Roman" w:hAnsi="Courier New" w:cs="Courier New"/>
+          <w:sz w:val="20"/>
+          <w:szCs w:val="20"/>
+        </w:rPr>
+        <w:t>top</w:t>
+      </w:r>
+      <w:proofErr w:type="gramEnd"/>
+      <w:r>
+        <w:rPr>
+          <w:rFonts w:ascii="Courier New" w:eastAsia="Times New Roman" w:hAnsi="Courier New" w:cs="Courier New"/>
+          <w:sz w:val="20"/>
+          <w:szCs w:val="20"/>
+        </w:rPr>
+        <w:t xml:space="preserve"> += 1</w:t>
+      </w:r>
+    </w:p>
+    <w:p>
+      <w:pPr>
+        <w:tabs>
+          <w:tab w:val="left" w:pos="916"/>
+          <w:tab w:val="left" w:pos="1832"/>
+          <w:tab w:val="left" w:pos="2748"/>
+          <w:tab w:val="left" w:pos="3664"/>
+          <w:tab w:val="left" w:pos="4580"/>
+          <w:tab w:val="left" w:pos="5496"/>
+          <w:tab w:val="left" w:pos="6412"/>
+          <w:tab w:val="left" w:pos="7328"/>
+          <w:tab w:val="left" w:pos="8244"/>
+          <w:tab w:val="left" w:pos="9160"/>
+          <w:tab w:val="left" w:pos="10076"/>
+          <w:tab w:val="left" w:pos="10992"/>
+          <w:tab w:val="left" w:pos="11908"/>
+          <w:tab w:val="left" w:pos="12824"/>
+          <w:tab w:val="left" w:pos="13740"/>
+          <w:tab w:val="left" w:pos="14656"/>
+        </w:tabs>
+        <w:spacing w:after="0" w:line="240" w:lineRule="auto"/>
+        <w:rPr>
+          <w:rFonts w:ascii="Courier New" w:eastAsia="Times New Roman" w:hAnsi="Courier New" w:cs="Courier New"/>
+          <w:sz w:val="20"/>
+          <w:szCs w:val="20"/>
+        </w:rPr>
+      </w:pPr>
+      <w:proofErr w:type="gramStart"/>
+      <w:r>
+        <w:rPr>
+          <w:rFonts w:ascii="Courier New" w:eastAsia="Times New Roman" w:hAnsi="Courier New" w:cs="Courier New"/>
+          <w:sz w:val="20"/>
+          <w:szCs w:val="20"/>
+        </w:rPr>
+        <w:t>bottom</w:t>
+      </w:r>
+      <w:proofErr w:type="gramEnd"/>
+      <w:r>
+        <w:rPr>
+          <w:rFonts w:ascii="Courier New" w:eastAsia="Times New Roman" w:hAnsi="Courier New" w:cs="Courier New"/>
+          <w:sz w:val="20"/>
+          <w:szCs w:val="20"/>
+        </w:rPr>
+        <w:t xml:space="preserve"> -= 1</w:t>
+      </w:r>
+    </w:p>
+    <w:p>
+      <w:pPr>
+        <w:tabs>
+          <w:tab w:val="left" w:pos="916"/>
+          <w:tab w:val="left" w:pos="1832"/>
+          <w:tab w:val="left" w:pos="2748"/>
+          <w:tab w:val="left" w:pos="3664"/>
+          <w:tab w:val="left" w:pos="4580"/>
+          <w:tab w:val="left" w:pos="5496"/>
+          <w:tab w:val="left" w:pos="6412"/>
+          <w:tab w:val="left" w:pos="7328"/>
+          <w:tab w:val="left" w:pos="8244"/>
+          <w:tab w:val="left" w:pos="9160"/>
+          <w:tab w:val="left" w:pos="10076"/>
+          <w:tab w:val="left" w:pos="10992"/>
+          <w:tab w:val="left" w:pos="11908"/>
+          <w:tab w:val="left" w:pos="12824"/>
+          <w:tab w:val="left" w:pos="13740"/>
+          <w:tab w:val="left" w:pos="14656"/>
+        </w:tabs>
+        <w:spacing w:after="0" w:line="240" w:lineRule="auto"/>
+        <w:rPr>
+          <w:rFonts w:ascii="Courier New" w:eastAsia="Times New Roman" w:hAnsi="Courier New" w:cs="Courier New"/>
+          <w:sz w:val="20"/>
+          <w:szCs w:val="20"/>
+        </w:rPr>
+      </w:pPr>
+      <w:proofErr w:type="gramStart"/>
+      <w:r>
+        <w:rPr>
+          <w:rFonts w:ascii="Courier New" w:eastAsia="Times New Roman" w:hAnsi="Courier New" w:cs="Courier New"/>
+          <w:sz w:val="20"/>
+          <w:szCs w:val="20"/>
+        </w:rPr>
+        <w:t>left</w:t>
+      </w:r>
+      <w:proofErr w:type="gramEnd"/>
+      <w:r>
+        <w:rPr>
+          <w:rFonts w:ascii="Courier New" w:eastAsia="Times New Roman" w:hAnsi="Courier New" w:cs="Courier New"/>
+          <w:sz w:val="20"/>
+          <w:szCs w:val="20"/>
+        </w:rPr>
+        <w:t xml:space="preserve"> += 1</w:t>
+      </w:r>
+    </w:p>
+    <w:p>
+      <w:pPr>
+        <w:tabs>
+          <w:tab w:val="left" w:pos="916"/>
+          <w:tab w:val="left" w:pos="1832"/>
+          <w:tab w:val="left" w:pos="2748"/>
+          <w:tab w:val="left" w:pos="3664"/>
+          <w:tab w:val="left" w:pos="4580"/>
+          <w:tab w:val="left" w:pos="5496"/>
+          <w:tab w:val="left" w:pos="6412"/>
+          <w:tab w:val="left" w:pos="7328"/>
+          <w:tab w:val="left" w:pos="8244"/>
+          <w:tab w:val="left" w:pos="9160"/>
+          <w:tab w:val="left" w:pos="10076"/>
+          <w:tab w:val="left" w:pos="10992"/>
+          <w:tab w:val="left" w:pos="11908"/>
+          <w:tab w:val="left" w:pos="12824"/>
+          <w:tab w:val="left" w:pos="13740"/>
+          <w:tab w:val="left" w:pos="14656"/>
+        </w:tabs>
+        <w:spacing w:after="0" w:line="240" w:lineRule="auto"/>
+        <w:rPr>
+          <w:rFonts w:ascii="Courier New" w:eastAsia="Times New Roman" w:hAnsi="Courier New" w:cs="Courier New"/>
+          <w:sz w:val="20"/>
+          <w:szCs w:val="20"/>
+        </w:rPr>
+      </w:pPr>
+      <w:proofErr w:type="gramStart"/>
+      <w:r>
+        <w:rPr>
+          <w:rFonts w:ascii="Courier New" w:eastAsia="Times New Roman" w:hAnsi="Courier New" w:cs="Courier New"/>
+          <w:sz w:val="20"/>
+          <w:szCs w:val="20"/>
+        </w:rPr>
+        <w:t>right</w:t>
+      </w:r>
+      <w:proofErr w:type="gramEnd"/>
+      <w:r>
+        <w:rPr>
+          <w:rFonts w:ascii="Courier New" w:eastAsia="Times New Roman" w:hAnsi="Courier New" w:cs="Courier New"/>
+          <w:sz w:val="20"/>
+          <w:szCs w:val="20"/>
+        </w:rPr>
+        <w:t xml:space="preserve"> -= 1</w:t>
+      </w:r>
+    </w:p>
+    <w:p>
+      <w:pPr>
+        <w:spacing w:before="100" w:beforeAutospacing="1" w:after="100" w:afterAutospacing="1" w:line="240" w:lineRule="auto"/>
+        <w:rPr>
+          <w:rFonts w:ascii="Times New Roman" w:eastAsia="Times New Roman" w:hAnsi="Times New Roman" w:cs="Times New Roman"/>
+          <w:sz w:val="24"/>
+          <w:szCs w:val="24"/>
+        </w:rPr>
+      </w:pPr>
+      <w:proofErr w:type="gramStart"/>
+      <w:r>
+        <w:rPr>
+          <w:rFonts w:ascii="Times New Roman" w:eastAsia="Times New Roman" w:hAnsi="Times New Roman" w:cs="Times New Roman"/>
+          <w:sz w:val="24"/>
+          <w:szCs w:val="24"/>
+        </w:rPr>
+        <w:t>Don't</w:t>
+      </w:r>
+      <w:proofErr w:type="gramEnd"/>
+      <w:r>
+        <w:rPr>
+          <w:rFonts w:ascii="Times New Roman" w:eastAsia="Times New Roman" w:hAnsi="Times New Roman" w:cs="Times New Roman"/>
+          <w:sz w:val="24"/>
+          <w:szCs w:val="24"/>
+        </w:rPr>
+        <w:t xml:space="preserve"> do anything else yet.</w:t>
+      </w:r>
+    </w:p>
+    <w:p>
+      <w:pPr>
+        <w:spacing w:before="100" w:beforeAutospacing="1" w:after="100" w:afterAutospacing="1" w:line="240" w:lineRule="auto"/>
+        <w:rPr>
+          <w:rFonts w:ascii="Times New Roman" w:eastAsia="Times New Roman" w:hAnsi="Times New Roman" w:cs="Times New Roman"/>
+          <w:sz w:val="24"/>
+          <w:szCs w:val="24"/>
+        </w:rPr>
+      </w:pPr>
+      <w:r>
+        <w:rPr>
+          <w:rFonts w:ascii="Times New Roman" w:eastAsia="Times New Roman" w:hAnsi="Times New Roman" w:cs="Times New Roman"/>
+          <w:sz w:val="24"/>
+          <w:szCs w:val="24"/>
+        </w:rPr>
+        <w:t>Then print these variables temporarily:</w:t>
+      </w:r>
+    </w:p>
+    <w:p>
+      <w:pPr>
+        <w:tabs>
+          <w:tab w:val="left" w:pos="916"/>
+          <w:tab w:val="left" w:pos="1832"/>
+          <w:tab w:val="left" w:pos="2748"/>
+          <w:tab w:val="left" w:pos="3664"/>
+          <w:tab w:val="left" w:pos="4580"/>
+          <w:tab w:val="left" w:pos="5496"/>
+          <w:tab w:val="left" w:pos="6412"/>
+          <w:tab w:val="left" w:pos="7328"/>
+          <w:tab w:val="left" w:pos="8244"/>
+          <w:tab w:val="left" w:pos="9160"/>
+          <w:tab w:val="left" w:pos="10076"/>
+          <w:tab w:val="left" w:pos="10992"/>
+          <w:tab w:val="left" w:pos="11908"/>
+          <w:tab w:val="left" w:pos="12824"/>
+          <w:tab w:val="left" w:pos="13740"/>
+          <w:tab w:val="left" w:pos="14656"/>
+        </w:tabs>
+        <w:spacing w:after="0" w:line="240" w:lineRule="auto"/>
+        <w:rPr>
+          <w:rFonts w:ascii="Courier New" w:eastAsia="Times New Roman" w:hAnsi="Courier New" w:cs="Courier New"/>
+          <w:sz w:val="20"/>
+          <w:szCs w:val="20"/>
+        </w:rPr>
+      </w:pPr>
+      <w:proofErr w:type="gramStart"/>
+      <w:r>
+        <w:rPr>
+          <w:rFonts w:ascii="Courier New" w:eastAsia="Times New Roman" w:hAnsi="Courier New" w:cs="Courier New"/>
+          <w:sz w:val="20"/>
+          <w:szCs w:val="20"/>
+        </w:rPr>
+        <w:t>print(</w:t>
+      </w:r>
+      <w:proofErr w:type="gramEnd"/>
+      <w:r>
+        <w:rPr>
+          <w:rFonts w:ascii="Courier New" w:eastAsia="Times New Roman" w:hAnsi="Courier New" w:cs="Courier New"/>
+          <w:sz w:val="20"/>
+          <w:szCs w:val="20"/>
+        </w:rPr>
+        <w:t>top, bottom, left, right)</w:t>
+      </w:r>
+    </w:p>
+    <w:p>
+      <w:pPr>
+        <w:spacing w:before="100" w:beforeAutospacing="1" w:after="100" w:afterAutospacing="1" w:line="240" w:lineRule="auto"/>
+        <w:rPr>
+          <w:rFonts w:ascii="Times New Roman" w:eastAsia="Times New Roman" w:hAnsi="Times New Roman" w:cs="Times New Roman"/>
+          <w:sz w:val="24"/>
+          <w:szCs w:val="24"/>
+        </w:rPr>
+      </w:pPr>
+      <w:r>
+        <w:rPr>
+          <w:rFonts w:ascii="Times New Roman" w:eastAsia="Times New Roman" w:hAnsi="Times New Roman" w:cs="Times New Roman"/>
+          <w:sz w:val="24"/>
+          <w:szCs w:val="24"/>
+        </w:rPr>
+        <w:t>You should get:</w:t>
+      </w:r>
+    </w:p>
+    <w:p>
+      <w:pPr>
+        <w:tabs>
+          <w:tab w:val="left" w:pos="916"/>
+          <w:tab w:val="left" w:pos="1832"/>
+          <w:tab w:val="left" w:pos="2748"/>
+          <w:tab w:val="left" w:pos="3664"/>
+          <w:tab w:val="left" w:pos="4580"/>
+          <w:tab w:val="left" w:pos="5496"/>
+          <w:tab w:val="left" w:pos="6412"/>
+          <w:tab w:val="left" w:pos="7328"/>
+          <w:tab w:val="left" w:pos="8244"/>
+          <w:tab w:val="left" w:pos="9160"/>
+          <w:tab w:val="left" w:pos="10076"/>
+          <w:tab w:val="left" w:pos="10992"/>
+          <w:tab w:val="left" w:pos="11908"/>
+          <w:tab w:val="left" w:pos="12824"/>
+          <w:tab w:val="left" w:pos="13740"/>
+          <w:tab w:val="left" w:pos="14656"/>
+        </w:tabs>
+        <w:spacing w:after="0" w:line="240" w:lineRule="auto"/>
+        <w:rPr>
+          <w:rFonts w:ascii="Courier New" w:eastAsia="Times New Roman" w:hAnsi="Courier New" w:cs="Courier New"/>
+          <w:sz w:val="20"/>
+          <w:szCs w:val="20"/>
+        </w:rPr>
+      </w:pPr>
+      <w:r>
+        <w:rPr>
+          <w:rFonts w:ascii="Courier New" w:eastAsia="Times New Roman" w:hAnsi="Courier New" w:cs="Courier New"/>
+          <w:sz w:val="20"/>
+          <w:szCs w:val="20"/>
+        </w:rPr>
+        <w:t>1 1 1 1</w:t>
+      </w:r>
+    </w:p>
+    <w:p>
       <w:bookmarkStart w:id="0" w:name="_GoBack"/>
       <w:bookmarkEnd w:id="0"/>
     </w:p>
-    <w:p/>
     <w:sectPr>
       <w:pgSz w:w="12240" w:h="15840"/>
       <w:pgMar w:top="1417" w:right="1417" w:bottom="1417" w:left="1417" w:header="708" w:footer="708" w:gutter="0"/>
@@ -5685,6 +9925,34 @@
       <w:szCs w:val="32"/>
     </w:rPr>
   </w:style>
+  <w:style w:type="paragraph" w:customStyle="1" w:styleId="pdq2pgselectionanchorcontainer">
+    <w:name w:val="pdq2pg_selectionanchorcontainer"/>
+    <w:basedOn w:val="Normal"/>
+    <w:rsid w:val="00A314FE"/>
+    <w:pPr>
+      <w:spacing w:before="100" w:beforeAutospacing="1" w:after="100" w:afterAutospacing="1" w:line="240" w:lineRule="auto"/>
+    </w:pPr>
+    <w:rPr>
+      <w:rFonts w:ascii="Times New Roman" w:eastAsia="Times New Roman" w:hAnsi="Times New Roman" w:cs="Times New Roman"/>
+      <w:sz w:val="24"/>
+      <w:szCs w:val="24"/>
+    </w:rPr>
+  </w:style>
+  <w:style w:type="character" w:customStyle="1" w:styleId="11">
+    <w:name w:val="ͼ11"/>
+    <w:basedOn w:val="DefaultParagraphFont"/>
+    <w:rsid w:val="00B13F47"/>
+  </w:style>
+  <w:style w:type="character" w:customStyle="1" w:styleId="v">
+    <w:name w:val="ͼv"/>
+    <w:basedOn w:val="DefaultParagraphFont"/>
+    <w:rsid w:val="00B13F47"/>
+  </w:style>
+  <w:style w:type="character" w:customStyle="1" w:styleId="y">
+    <w:name w:val="ͼy"/>
+    <w:basedOn w:val="DefaultParagraphFont"/>
+    <w:rsid w:val="00B13F47"/>
+  </w:style>
 </w:styles>
 </file>
 

</xml_diff>

<commit_message>
Add max non-negative subarray solution
This change adds JavaScript and Python implementations for the Max Non Negative SubArray problem and updates the related array study materials. It also removes the temporary Word lock file generated during editing.
</commit_message>
<xml_diff>
--- a/ARRAY/Hint For doing array question deep question.docx
+++ b/ARRAY/Hint For doing array question deep question.docx
@@ -3916,6 +3916,49 @@
     </w:p>
     <w:p>
       <w:r>
+        <w:t xml:space="preserve">We </w:t>
+      </w:r>
+      <w:proofErr w:type="gramStart"/>
+      <w:r>
+        <w:t xml:space="preserve">assume </w:t>
+      </w:r>
+      <w:r>
+        <w:t xml:space="preserve"> every</w:t>
+      </w:r>
+      <w:proofErr w:type="gramEnd"/>
+      <w:r>
+        <w:t xml:space="preserve"> row has the same number of columns.</w:t>
+      </w:r>
+    </w:p>
+    <w:p>
+      <w:pPr>
+        <w:rPr>
+          <w:color w:val="FF0000"/>
+        </w:rPr>
+      </w:pPr>
+      <w:r>
+        <w:rPr>
+          <w:color w:val="FF0000"/>
+        </w:rPr>
+        <w:t xml:space="preserve">The important rule </w:t>
+      </w:r>
+      <w:proofErr w:type="gramStart"/>
+      <w:r>
+        <w:rPr>
+          <w:color w:val="FF0000"/>
+        </w:rPr>
+        <w:t>is:</w:t>
+      </w:r>
+      <w:proofErr w:type="gramEnd"/>
+      <w:r>
+        <w:rPr>
+          <w:color w:val="FF0000"/>
+        </w:rPr>
+        <w:t xml:space="preserve"> every row should have the same number of columns.</w:t>
+      </w:r>
+    </w:p>
+    <w:p>
+      <w:r>
         <w:t xml:space="preserve">The </w:t>
       </w:r>
       <w:r>
@@ -4766,6 +4809,7 @@
           <w:sz w:val="24"/>
           <w:szCs w:val="24"/>
         </w:rPr>
+        <w:lastRenderedPageBreak/>
         <w:t>First</w:t>
       </w:r>
       <w:proofErr w:type="gramEnd"/>
@@ -4812,7 +4856,6 @@
           <w:sz w:val="20"/>
           <w:szCs w:val="20"/>
         </w:rPr>
-        <w:lastRenderedPageBreak/>
         <w:t>1</w:t>
       </w:r>
       <w:proofErr w:type="gramEnd"/>
@@ -6893,6 +6936,7 @@
           <w:sz w:val="20"/>
           <w:szCs w:val="20"/>
         </w:rPr>
+        <w:lastRenderedPageBreak/>
         <w:t>left</w:t>
       </w:r>
       <w:proofErr w:type="gramEnd"/>
@@ -6966,7 +7010,6 @@
           <w:sz w:val="24"/>
           <w:szCs w:val="24"/>
         </w:rPr>
-        <w:lastRenderedPageBreak/>
         <w:t>For your 3×3 matrix, before shrinking:</w:t>
       </w:r>
     </w:p>
@@ -8102,6 +8145,141 @@
           <w:szCs w:val="20"/>
         </w:rPr>
         <w:t>1 1 1 1</w:t>
+      </w:r>
+    </w:p>
+    <w:p/>
+    <w:p>
+      <w:pPr>
+        <w:pStyle w:val="Heading1"/>
+        <w:shd w:val="clear" w:color="auto" w:fill="FFFFFF"/>
+        <w:spacing w:before="0"/>
+        <w:rPr>
+          <w:rFonts w:ascii="Segoe UI" w:hAnsi="Segoe UI" w:cs="Segoe UI"/>
+          <w:color w:val="1A3D3C"/>
+          <w:spacing w:val="2"/>
+        </w:rPr>
+      </w:pPr>
+      <w:r>
+        <w:lastRenderedPageBreak/>
+        <w:t xml:space="preserve">Question 3 </w:t>
+      </w:r>
+      <w:r>
+        <w:rPr>
+          <w:rFonts w:ascii="Segoe UI" w:hAnsi="Segoe UI" w:cs="Segoe UI"/>
+          <w:color w:val="1A3D3C"/>
+          <w:spacing w:val="2"/>
+        </w:rPr>
+        <w:t xml:space="preserve">Max Non Negative </w:t>
+      </w:r>
+      <w:proofErr w:type="spellStart"/>
+      <w:r>
+        <w:rPr>
+          <w:rFonts w:ascii="Segoe UI" w:hAnsi="Segoe UI" w:cs="Segoe UI"/>
+          <w:color w:val="1A3D3C"/>
+          <w:spacing w:val="2"/>
+        </w:rPr>
+        <w:t>SubArray</w:t>
+      </w:r>
+      <w:proofErr w:type="spellEnd"/>
+    </w:p>
+    <w:p>
+      <w:pPr>
+        <w:spacing w:before="100" w:beforeAutospacing="1" w:after="100" w:afterAutospacing="1" w:line="240" w:lineRule="auto"/>
+        <w:rPr>
+          <w:rFonts w:ascii="Times New Roman" w:eastAsia="Times New Roman" w:hAnsi="Times New Roman" w:cs="Times New Roman"/>
+          <w:sz w:val="24"/>
+          <w:szCs w:val="24"/>
+        </w:rPr>
+      </w:pPr>
+      <w:r>
+        <w:rPr>
+          <w:rFonts w:ascii="Times New Roman" w:eastAsia="Times New Roman" w:hAnsi="Times New Roman" w:cs="Times New Roman"/>
+          <w:sz w:val="24"/>
+          <w:szCs w:val="24"/>
+        </w:rPr>
+        <w:t xml:space="preserve">This problem is asking you to find a </w:t>
+      </w:r>
+      <w:r>
+        <w:rPr>
+          <w:rFonts w:ascii="Times New Roman" w:eastAsia="Times New Roman" w:hAnsi="Times New Roman" w:cs="Times New Roman"/>
+          <w:b/>
+          <w:bCs/>
+          <w:sz w:val="24"/>
+          <w:szCs w:val="24"/>
+        </w:rPr>
+        <w:t>contiguous group of non-negative numbers</w:t>
+      </w:r>
+      <w:r>
+        <w:rPr>
+          <w:rFonts w:ascii="Times New Roman" w:eastAsia="Times New Roman" w:hAnsi="Times New Roman" w:cs="Times New Roman"/>
+          <w:sz w:val="24"/>
+          <w:szCs w:val="24"/>
+        </w:rPr>
+        <w:t xml:space="preserve"> whose sum is as large as possible.</w:t>
+      </w:r>
+    </w:p>
+    <w:p>
+      <w:pPr>
+        <w:spacing w:before="100" w:beforeAutospacing="1" w:after="100" w:afterAutospacing="1" w:line="240" w:lineRule="auto"/>
+        <w:rPr>
+          <w:rFonts w:ascii="Times New Roman" w:eastAsia="Times New Roman" w:hAnsi="Times New Roman" w:cs="Times New Roman"/>
+          <w:sz w:val="24"/>
+          <w:szCs w:val="24"/>
+        </w:rPr>
+      </w:pPr>
+      <w:r>
+        <w:rPr>
+          <w:rFonts w:ascii="Times New Roman" w:eastAsia="Times New Roman" w:hAnsi="Times New Roman" w:cs="Times New Roman"/>
+          <w:sz w:val="24"/>
+          <w:szCs w:val="24"/>
+        </w:rPr>
+        <w:t>The important phrase is:</w:t>
+      </w:r>
+    </w:p>
+    <w:p>
+      <w:pPr>
+        <w:spacing w:beforeAutospacing="1" w:after="100" w:afterAutospacing="1" w:line="240" w:lineRule="auto"/>
+        <w:rPr>
+          <w:rFonts w:ascii="Times New Roman" w:eastAsia="Times New Roman" w:hAnsi="Times New Roman" w:cs="Times New Roman"/>
+          <w:sz w:val="24"/>
+          <w:szCs w:val="24"/>
+        </w:rPr>
+      </w:pPr>
+      <w:proofErr w:type="gramStart"/>
+      <w:r>
+        <w:rPr>
+          <w:rFonts w:ascii="Times New Roman" w:eastAsia="Times New Roman" w:hAnsi="Times New Roman" w:cs="Times New Roman"/>
+          <w:sz w:val="24"/>
+          <w:szCs w:val="24"/>
+        </w:rPr>
+        <w:t>non-negative</w:t>
+      </w:r>
+      <w:proofErr w:type="gramEnd"/>
+      <w:r>
+        <w:rPr>
+          <w:rFonts w:ascii="Times New Roman" w:eastAsia="Times New Roman" w:hAnsi="Times New Roman" w:cs="Times New Roman"/>
+          <w:sz w:val="24"/>
+          <w:szCs w:val="24"/>
+        </w:rPr>
+        <w:t xml:space="preserve"> numbers</w:t>
+      </w:r>
+    </w:p>
+    <w:p>
+      <w:pPr>
+        <w:spacing w:before="100" w:beforeAutospacing="1" w:after="100" w:afterAutospacing="1" w:line="240" w:lineRule="auto"/>
+        <w:rPr>
+          <w:rFonts w:ascii="Times New Roman" w:eastAsia="Times New Roman" w:hAnsi="Times New Roman" w:cs="Times New Roman"/>
+          <w:sz w:val="24"/>
+          <w:szCs w:val="24"/>
+        </w:rPr>
+      </w:pPr>
+      <w:r>
+        <w:rPr>
+          <w:rFonts w:ascii="Times New Roman" w:eastAsia="Times New Roman" w:hAnsi="Times New Roman" w:cs="Times New Roman"/>
+          <w:sz w:val="24"/>
+          <w:szCs w:val="24"/>
+        </w:rPr>
+        <w:t>That means the subarray cannot contain negative values.</w:t>
       </w:r>
     </w:p>
     <w:p>

</xml_diff>